<commit_message>
added rupesh + mars names
</commit_message>
<xml_diff>
--- a/Resturant_Report.docx
+++ b/Resturant_Report.docx
@@ -16,43 +16,7 @@
           <w:sz w:val="18"/>
           <w:szCs w:val="18"/>
         </w:rPr>
-        <w:t>M-CSC005U</w:t>
-      </w:r>
-      <w:proofErr w:type="gramStart"/>
-      <w:r>
-        <w:rPr>
-          <w:color w:val="000000" w:themeColor="text1"/>
-          <w:sz w:val="18"/>
-          <w:szCs w:val="18"/>
-        </w:rPr>
-        <w:t>1  ·</w:t>
-      </w:r>
-      <w:proofErr w:type="gramEnd"/>
-      <w:r>
-        <w:rPr>
-          <w:color w:val="000000" w:themeColor="text1"/>
-          <w:sz w:val="18"/>
-          <w:szCs w:val="18"/>
-        </w:rPr>
-        <w:t xml:space="preserve">  Computational Mathematics and Data </w:t>
-      </w:r>
-      <w:proofErr w:type="gramStart"/>
-      <w:r>
-        <w:rPr>
-          <w:color w:val="000000" w:themeColor="text1"/>
-          <w:sz w:val="18"/>
-          <w:szCs w:val="18"/>
-        </w:rPr>
-        <w:t>Analytics  ·</w:t>
-      </w:r>
-      <w:proofErr w:type="gramEnd"/>
-      <w:r>
-        <w:rPr>
-          <w:color w:val="000000" w:themeColor="text1"/>
-          <w:sz w:val="18"/>
-          <w:szCs w:val="18"/>
-        </w:rPr>
-        <w:t xml:space="preserve">  Level 4</w:t>
+        <w:t>M-CSC005U1  ·  Computational Mathematics and Data Analytics  ·  Level 4</w:t>
       </w:r>
     </w:p>
     <w:p>
@@ -112,43 +76,7 @@
           <w:iCs/>
           <w:color w:val="000000" w:themeColor="text1"/>
         </w:rPr>
-        <w:t>Group Project (</w:t>
-      </w:r>
-      <w:proofErr w:type="gramStart"/>
-      <w:r>
-        <w:rPr>
-          <w:i/>
-          <w:iCs/>
-          <w:color w:val="000000" w:themeColor="text1"/>
-        </w:rPr>
-        <w:t>Coursework)  —</w:t>
-      </w:r>
-      <w:proofErr w:type="gramEnd"/>
-      <w:r>
-        <w:rPr>
-          <w:i/>
-          <w:iCs/>
-          <w:color w:val="000000" w:themeColor="text1"/>
-        </w:rPr>
-        <w:t xml:space="preserve">  Assessment </w:t>
-      </w:r>
-      <w:proofErr w:type="gramStart"/>
-      <w:r>
-        <w:rPr>
-          <w:i/>
-          <w:iCs/>
-          <w:color w:val="000000" w:themeColor="text1"/>
-        </w:rPr>
-        <w:t>1  (</w:t>
-      </w:r>
-      <w:proofErr w:type="gramEnd"/>
-      <w:r>
-        <w:rPr>
-          <w:i/>
-          <w:iCs/>
-          <w:color w:val="000000" w:themeColor="text1"/>
-        </w:rPr>
-        <w:t>60% of module)</w:t>
+        <w:t>Group Project (Coursework)  —  Assessment 1  (60% of module)</w:t>
       </w:r>
     </w:p>
     <w:p>
@@ -195,33 +123,7 @@
           <w:sz w:val="36"/>
           <w:szCs w:val="36"/>
         </w:rPr>
-        <w:t>[</w:t>
-      </w:r>
-      <w:proofErr w:type="spellStart"/>
-      <w:r>
-        <w:rPr>
-          <w:b/>
-          <w:bCs/>
-          <w:i/>
-          <w:iCs/>
-          <w:color w:val="000000" w:themeColor="text1"/>
-          <w:sz w:val="36"/>
-          <w:szCs w:val="36"/>
-        </w:rPr>
-        <w:t>Reastaurant</w:t>
-      </w:r>
-      <w:proofErr w:type="spellEnd"/>
-      <w:r>
-        <w:rPr>
-          <w:b/>
-          <w:bCs/>
-          <w:i/>
-          <w:iCs/>
-          <w:color w:val="000000" w:themeColor="text1"/>
-          <w:sz w:val="36"/>
-          <w:szCs w:val="36"/>
-        </w:rPr>
-        <w:t xml:space="preserve"> name] Database Design</w:t>
+        <w:t>[Reastaurant name] Database Design</w:t>
       </w:r>
     </w:p>
     <w:p>
@@ -330,18 +232,79 @@
           <w:p>
             <w:pPr>
               <w:rPr>
-                <w:color w:val="000000" w:themeColor="text1"/>
-              </w:rPr>
-            </w:pPr>
-            <w:r>
-              <w:rPr>
                 <w:i/>
                 <w:iCs/>
                 <w:color w:val="000000" w:themeColor="text1"/>
                 <w:sz w:val="22"/>
                 <w:szCs w:val="22"/>
               </w:rPr>
-              <w:t xml:space="preserve">2. [Full Name — Student ID] 3. [Full Name — Student ID] </w:t>
+            </w:pPr>
+            <w:r>
+              <w:rPr>
+                <w:i/>
+                <w:iCs/>
+                <w:color w:val="000000" w:themeColor="text1"/>
+                <w:sz w:val="22"/>
+                <w:szCs w:val="22"/>
+              </w:rPr>
+              <w:t>2. [</w:t>
+            </w:r>
+            <w:r>
+              <w:rPr>
+                <w:i/>
+                <w:iCs/>
+                <w:color w:val="000000" w:themeColor="text1"/>
+                <w:sz w:val="22"/>
+                <w:szCs w:val="22"/>
+              </w:rPr>
+              <w:t>Giwa Marvellous - 25016834</w:t>
+            </w:r>
+            <w:r>
+              <w:rPr>
+                <w:i/>
+                <w:iCs/>
+                <w:color w:val="000000" w:themeColor="text1"/>
+                <w:sz w:val="22"/>
+                <w:szCs w:val="22"/>
+              </w:rPr>
+              <w:t xml:space="preserve">] </w:t>
+            </w:r>
+          </w:p>
+          <w:p>
+            <w:pPr>
+              <w:rPr>
+                <w:color w:val="000000" w:themeColor="text1"/>
+              </w:rPr>
+            </w:pPr>
+            <w:r>
+              <w:rPr>
+                <w:i/>
+                <w:iCs/>
+                <w:color w:val="000000" w:themeColor="text1"/>
+                <w:sz w:val="22"/>
+                <w:szCs w:val="22"/>
+              </w:rPr>
+              <w:t>3. [</w:t>
+            </w:r>
+            <w:r>
+              <w:rPr>
+                <w:i/>
+                <w:iCs/>
+                <w:color w:val="000000" w:themeColor="text1"/>
+                <w:sz w:val="22"/>
+                <w:szCs w:val="22"/>
+              </w:rPr>
+              <w:t>Rupesh kumar Sah - 25016818</w:t>
+            </w:r>
+            <w:r>
+              <w:rPr>
+                <w:i/>
+                <w:iCs/>
+                <w:color w:val="000000" w:themeColor="text1"/>
+                <w:sz w:val="22"/>
+                <w:szCs w:val="22"/>
+              </w:rPr>
+              <w:t xml:space="preserve">] </w:t>
             </w:r>
           </w:p>
         </w:tc>
@@ -988,13 +951,6 @@
         </w:rPr>
         <w:t>ll sources are properly acknowledged.</w:t>
       </w:r>
-    </w:p>
-    <w:p>
-      <w:pPr>
-        <w:rPr>
-          <w:color w:val="000000" w:themeColor="text1"/>
-        </w:rPr>
-      </w:pPr>
       <w:r>
         <w:rPr>
           <w:color w:val="000000" w:themeColor="text1"/>
@@ -3787,35 +3743,7 @@
         <w:rPr>
           <w:color w:val="000000" w:themeColor="text1"/>
         </w:rPr>
-        <w:t xml:space="preserve">An organized collection of objects that can be represented in set-builder form or roster form. In set theory, the operations of the sets are carried when two or more sets combine to form a single set under some of the given conditions. The basic operations on sets </w:t>
-      </w:r>
-      <w:proofErr w:type="gramStart"/>
-      <w:r>
-        <w:rPr>
-          <w:color w:val="000000" w:themeColor="text1"/>
-        </w:rPr>
-        <w:t>are:</w:t>
-      </w:r>
-      <w:proofErr w:type="gramEnd"/>
-      <w:r>
-        <w:rPr>
-          <w:color w:val="000000" w:themeColor="text1"/>
-        </w:rPr>
-        <w:t xml:space="preserve"> Union of sets, Intersection of sets, A complement of a set, Cartesian product of sets and Set difference. (</w:t>
-      </w:r>
-      <w:proofErr w:type="spellStart"/>
-      <w:r>
-        <w:rPr>
-          <w:color w:val="000000" w:themeColor="text1"/>
-        </w:rPr>
-        <w:t>byjus</w:t>
-      </w:r>
-      <w:proofErr w:type="spellEnd"/>
-      <w:r>
-        <w:rPr>
-          <w:color w:val="000000" w:themeColor="text1"/>
-        </w:rPr>
-        <w:t>, 2019)</w:t>
+        <w:t>An organized collection of objects that can be represented in set-builder form or roster form. In set theory, the operations of the sets are carried when two or more sets combine to form a single set under some of the given conditions. The basic operations on sets are: Union of sets, Intersection of sets, A complement of a set, Cartesian product of sets and Set difference. (byjus, 2019)</w:t>
       </w:r>
     </w:p>
     <w:p>
@@ -3848,21 +3776,7 @@
           <w:color w:val="000000" w:themeColor="text1"/>
         </w:rPr>
         <w:lastRenderedPageBreak/>
-        <w:t xml:space="preserve">Sets relate to </w:t>
-      </w:r>
-      <w:proofErr w:type="spellStart"/>
-      <w:r>
-        <w:rPr>
-          <w:color w:val="000000" w:themeColor="text1"/>
-        </w:rPr>
-        <w:t>sql</w:t>
-      </w:r>
-      <w:proofErr w:type="spellEnd"/>
-      <w:r>
-        <w:rPr>
-          <w:color w:val="000000" w:themeColor="text1"/>
-        </w:rPr>
-        <w:t xml:space="preserve"> when making queries to show specific data where tables are combined (JOIN ON) which is the Union of sets for example and when provided with a certain a parameter to filter more than we get into Intersection of sets (WHERE, GROUP BY…etc)</w:t>
+        <w:t>Sets relate to sql when making queries to show specific data where tables are combined (JOIN ON) which is the Union of sets for example and when provided with a certain a parameter to filter more than we get into Intersection of sets (WHERE, GROUP BY…etc)</w:t>
       </w:r>
     </w:p>
     <w:p>
@@ -4000,29 +3914,7 @@
         <w:rPr>
           <w:color w:val="000000" w:themeColor="text1"/>
         </w:rPr>
-        <w:t xml:space="preserve">As we perform operations on sets to make queries, we basically applying relational algebra, and apart from the operations used before, SELECT was also used to print </w:t>
-      </w:r>
-      <w:proofErr w:type="spellStart"/>
-      <w:proofErr w:type="gramStart"/>
-      <w:r>
-        <w:rPr>
-          <w:color w:val="000000" w:themeColor="text1"/>
-        </w:rPr>
-        <w:t>our</w:t>
-      </w:r>
-      <w:proofErr w:type="spellEnd"/>
-      <w:r>
-        <w:rPr>
-          <w:color w:val="000000" w:themeColor="text1"/>
-        </w:rPr>
-        <w:t xml:space="preserve"> the</w:t>
-      </w:r>
-      <w:proofErr w:type="gramEnd"/>
-      <w:r>
-        <w:rPr>
-          <w:color w:val="000000" w:themeColor="text1"/>
-        </w:rPr>
-        <w:t xml:space="preserve"> results for example and sorting operations (like DESC)</w:t>
+        <w:t>As we perform operations on sets to make queries, we basically applying relational algebra, and apart from the operations used before, SELECT was also used to print our the results for example and sorting operations (like DESC)</w:t>
       </w:r>
     </w:p>
     <w:p>
@@ -4082,21 +3974,7 @@
         <w:rPr>
           <w:color w:val="000000" w:themeColor="text1"/>
         </w:rPr>
-        <w:t>Predicate logic, also called first-order logic, is an enrichment of propositional logic to include predicates, individuals and quantifiers, and is widely accepted as the standard language of mathematics. Axiomatic predicate logic was established by Gottlob Frege in the late 19th century, who formalized the notion of quantified variable. (</w:t>
-      </w:r>
-      <w:proofErr w:type="spellStart"/>
-      <w:r>
-        <w:rPr>
-          <w:color w:val="000000" w:themeColor="text1"/>
-        </w:rPr>
-        <w:t>worldscientific</w:t>
-      </w:r>
-      <w:proofErr w:type="spellEnd"/>
-      <w:r>
-        <w:rPr>
-          <w:color w:val="000000" w:themeColor="text1"/>
-        </w:rPr>
-        <w:t>, 2022)</w:t>
+        <w:t>Predicate logic, also called first-order logic, is an enrichment of propositional logic to include predicates, individuals and quantifiers, and is widely accepted as the standard language of mathematics. Axiomatic predicate logic was established by Gottlob Frege in the late 19th century, who formalized the notion of quantified variable. (worldscientific, 2022)</w:t>
       </w:r>
     </w:p>
     <w:p>
@@ -4187,21 +4065,7 @@
           <w:color w:val="000000" w:themeColor="text1"/>
         </w:rPr>
         <w:br/>
-        <w:t xml:space="preserve">Another example is the functional dependencies (normalization) for example </w:t>
-      </w:r>
-      <w:proofErr w:type="spellStart"/>
-      <w:r>
-        <w:rPr>
-          <w:color w:val="000000" w:themeColor="text1"/>
-        </w:rPr>
-        <w:t>dish_id</w:t>
-      </w:r>
-      <w:proofErr w:type="spellEnd"/>
-      <w:r>
-        <w:rPr>
-          <w:color w:val="000000" w:themeColor="text1"/>
-        </w:rPr>
-        <w:t xml:space="preserve">  </w:t>
+        <w:t xml:space="preserve">Another example is the functional dependencies (normalization) for example dish_id  </w:t>
       </w:r>
       <w:r>
         <w:rPr>
@@ -4213,49 +4077,7 @@
         <w:rPr>
           <w:color w:val="000000" w:themeColor="text1"/>
         </w:rPr>
-        <w:t xml:space="preserve"> </w:t>
-      </w:r>
-      <w:proofErr w:type="spellStart"/>
-      <w:r>
-        <w:rPr>
-          <w:color w:val="000000" w:themeColor="text1"/>
-        </w:rPr>
-        <w:t>dishName</w:t>
-      </w:r>
-      <w:proofErr w:type="spellEnd"/>
-      <w:r>
-        <w:rPr>
-          <w:color w:val="000000" w:themeColor="text1"/>
-        </w:rPr>
-        <w:t xml:space="preserve">, which means that the </w:t>
-      </w:r>
-      <w:proofErr w:type="spellStart"/>
-      <w:r>
-        <w:rPr>
-          <w:color w:val="000000" w:themeColor="text1"/>
-        </w:rPr>
-        <w:t>dish_id</w:t>
-      </w:r>
-      <w:proofErr w:type="spellEnd"/>
-      <w:r>
-        <w:rPr>
-          <w:color w:val="000000" w:themeColor="text1"/>
-        </w:rPr>
-        <w:t xml:space="preserve"> determines the </w:t>
-      </w:r>
-      <w:proofErr w:type="spellStart"/>
-      <w:r>
-        <w:rPr>
-          <w:color w:val="000000" w:themeColor="text1"/>
-        </w:rPr>
-        <w:t>dishName</w:t>
-      </w:r>
-      <w:proofErr w:type="spellEnd"/>
-      <w:r>
-        <w:rPr>
-          <w:color w:val="000000" w:themeColor="text1"/>
-        </w:rPr>
-        <w:t>.</w:t>
+        <w:t xml:space="preserve"> dishName, which means that the dish_id determines the dishName.</w:t>
       </w:r>
     </w:p>
     <w:p>
@@ -4277,21 +4099,7 @@
         <w:rPr>
           <w:color w:val="000000" w:themeColor="text1"/>
         </w:rPr>
-        <w:t>To construct this model, graph theory was also implemented to decide the relationship between the tables (</w:t>
-      </w:r>
-      <w:proofErr w:type="spellStart"/>
-      <w:r>
-        <w:rPr>
-          <w:color w:val="000000" w:themeColor="text1"/>
-        </w:rPr>
-        <w:t>entites</w:t>
-      </w:r>
-      <w:proofErr w:type="spellEnd"/>
-      <w:r>
-        <w:rPr>
-          <w:color w:val="000000" w:themeColor="text1"/>
-        </w:rPr>
-        <w:t>) through the primary keys and foreign keys.</w:t>
+        <w:t>To construct this model, graph theory was also implemented to decide the relationship between the tables (entites) through the primary keys and foreign keys.</w:t>
       </w:r>
     </w:p>
     <w:p>
@@ -4394,19 +4202,11 @@
         </w:rPr>
         <w:t xml:space="preserve">. </w:t>
       </w:r>
-      <w:proofErr w:type="spellStart"/>
-      <w:r>
-        <w:rPr>
-          <w:color w:val="000000" w:themeColor="text1"/>
-        </w:rPr>
-        <w:t>Github</w:t>
-      </w:r>
-      <w:proofErr w:type="spellEnd"/>
-      <w:r>
-        <w:rPr>
-          <w:color w:val="000000" w:themeColor="text1"/>
-        </w:rPr>
-        <w:t xml:space="preserve"> to track the work.</w:t>
+      <w:r>
+        <w:rPr>
+          <w:color w:val="000000" w:themeColor="text1"/>
+        </w:rPr>
+        <w:t>Github to track the work.</w:t>
       </w:r>
     </w:p>
     <w:p>
@@ -4637,7 +4437,6 @@
         </w:rPr>
         <w:t xml:space="preserve">, </w:t>
       </w:r>
-      <w:proofErr w:type="spellStart"/>
       <w:r>
         <w:rPr>
           <w:color w:val="000000" w:themeColor="text1"/>
@@ -4652,29 +4451,12 @@
         </w:rPr>
         <w:t>num</w:t>
       </w:r>
-      <w:proofErr w:type="spellEnd"/>
       <w:r>
         <w:rPr>
           <w:color w:val="000000" w:themeColor="text1"/>
           <w:lang w:val="en-US"/>
         </w:rPr>
-        <w:t xml:space="preserve"> (</w:t>
-      </w:r>
-      <w:proofErr w:type="spellStart"/>
-      <w:r>
-        <w:rPr>
-          <w:color w:val="000000" w:themeColor="text1"/>
-          <w:lang w:val="en-US"/>
-        </w:rPr>
-        <w:t>bigint</w:t>
-      </w:r>
-      <w:proofErr w:type="spellEnd"/>
-      <w:r>
-        <w:rPr>
-          <w:color w:val="000000" w:themeColor="text1"/>
-          <w:lang w:val="en-US"/>
-        </w:rPr>
-        <w:t>)</w:t>
+        <w:t xml:space="preserve"> (bigint)</w:t>
       </w:r>
       <w:r>
         <w:rPr>
@@ -4753,7 +4535,6 @@
           <w:lang w:val="en-US"/>
         </w:rPr>
       </w:pPr>
-      <w:proofErr w:type="spellStart"/>
       <w:r>
         <w:rPr>
           <w:color w:val="000000" w:themeColor="text1"/>
@@ -4766,110 +4547,77 @@
           <w:color w:val="000000" w:themeColor="text1"/>
           <w:lang w:val="en-US"/>
         </w:rPr>
-        <w:t>ID</w:t>
-      </w:r>
-      <w:proofErr w:type="spellEnd"/>
+        <w:t>ID (int, primary key)</w:t>
+      </w:r>
       <w:r>
         <w:rPr>
           <w:color w:val="000000" w:themeColor="text1"/>
           <w:lang w:val="en-US"/>
         </w:rPr>
-        <w:t xml:space="preserve"> (int, primary key)</w:t>
+        <w:t>, dish</w:t>
       </w:r>
       <w:r>
         <w:rPr>
           <w:color w:val="000000" w:themeColor="text1"/>
           <w:lang w:val="en-US"/>
         </w:rPr>
-        <w:t xml:space="preserve">, </w:t>
-      </w:r>
-      <w:proofErr w:type="spellStart"/>
+        <w:t>N</w:t>
+      </w:r>
       <w:r>
         <w:rPr>
           <w:color w:val="000000" w:themeColor="text1"/>
           <w:lang w:val="en-US"/>
         </w:rPr>
-        <w:t>dish</w:t>
+        <w:t>ame</w:t>
       </w:r>
       <w:r>
         <w:rPr>
           <w:color w:val="000000" w:themeColor="text1"/>
           <w:lang w:val="en-US"/>
         </w:rPr>
-        <w:t>N</w:t>
+        <w:t xml:space="preserve"> (varchar)</w:t>
       </w:r>
       <w:r>
         <w:rPr>
           <w:color w:val="000000" w:themeColor="text1"/>
           <w:lang w:val="en-US"/>
         </w:rPr>
-        <w:t>ame</w:t>
-      </w:r>
-      <w:proofErr w:type="spellEnd"/>
+        <w:t>, description</w:t>
+      </w:r>
       <w:r>
         <w:rPr>
           <w:color w:val="000000" w:themeColor="text1"/>
           <w:lang w:val="en-US"/>
         </w:rPr>
-        <w:t xml:space="preserve"> (varchar)</w:t>
+        <w:t xml:space="preserve"> (text)</w:t>
       </w:r>
       <w:r>
         <w:rPr>
           <w:color w:val="000000" w:themeColor="text1"/>
           <w:lang w:val="en-US"/>
         </w:rPr>
-        <w:t>, description</w:t>
+        <w:t>, price</w:t>
       </w:r>
       <w:r>
         <w:rPr>
           <w:color w:val="000000" w:themeColor="text1"/>
           <w:lang w:val="en-US"/>
         </w:rPr>
-        <w:t xml:space="preserve"> (text)</w:t>
+        <w:t xml:space="preserve"> (float)</w:t>
       </w:r>
       <w:r>
         <w:rPr>
           <w:color w:val="000000" w:themeColor="text1"/>
           <w:lang w:val="en-US"/>
         </w:rPr>
-        <w:t>, price</w:t>
+        <w:t xml:space="preserve"> and category</w:t>
       </w:r>
       <w:r>
         <w:rPr>
           <w:color w:val="000000" w:themeColor="text1"/>
           <w:lang w:val="en-US"/>
         </w:rPr>
-        <w:t xml:space="preserve"> (float)</w:t>
-      </w:r>
-      <w:r>
-        <w:rPr>
-          <w:color w:val="000000" w:themeColor="text1"/>
-          <w:lang w:val="en-US"/>
-        </w:rPr>
-        <w:t xml:space="preserve"> and category</w:t>
-      </w:r>
-      <w:r>
-        <w:rPr>
-          <w:color w:val="000000" w:themeColor="text1"/>
-          <w:lang w:val="en-US"/>
-        </w:rPr>
-        <w:t xml:space="preserve"> (</w:t>
-      </w:r>
-      <w:proofErr w:type="spellStart"/>
-      <w:r>
-        <w:rPr>
-          <w:color w:val="000000" w:themeColor="text1"/>
-          <w:lang w:val="en-US"/>
-        </w:rPr>
-        <w:t>enum</w:t>
-      </w:r>
-      <w:proofErr w:type="spellEnd"/>
-      <w:r>
-        <w:rPr>
-          <w:color w:val="000000" w:themeColor="text1"/>
-          <w:lang w:val="en-US"/>
-        </w:rPr>
-        <w:t>)</w:t>
+        <w:t xml:space="preserve"> (enum)</w:t>
       </w:r>
       <w:r>
         <w:rPr>
@@ -4934,7 +4682,6 @@
           <w:lang w:val="en-US"/>
         </w:rPr>
       </w:pPr>
-      <w:proofErr w:type="spellStart"/>
       <w:r>
         <w:rPr>
           <w:color w:val="000000" w:themeColor="text1"/>
@@ -4947,89 +4694,104 @@
           <w:color w:val="000000" w:themeColor="text1"/>
           <w:lang w:val="en-US"/>
         </w:rPr>
-        <w:t>ID</w:t>
-      </w:r>
-      <w:proofErr w:type="spellEnd"/>
+        <w:t>ID (int, primary key)</w:t>
+      </w:r>
       <w:r>
         <w:rPr>
           <w:color w:val="000000" w:themeColor="text1"/>
           <w:lang w:val="en-US"/>
         </w:rPr>
-        <w:t xml:space="preserve"> (int, primary key)</w:t>
+        <w:t>, user_</w:t>
       </w:r>
       <w:r>
         <w:rPr>
           <w:color w:val="000000" w:themeColor="text1"/>
           <w:lang w:val="en-US"/>
         </w:rPr>
-        <w:t xml:space="preserve">, </w:t>
-      </w:r>
-      <w:proofErr w:type="spellStart"/>
+        <w:t>ID (int, foreign key)</w:t>
+      </w:r>
       <w:r>
         <w:rPr>
           <w:color w:val="000000" w:themeColor="text1"/>
           <w:lang w:val="en-US"/>
         </w:rPr>
-        <w:t>user_</w:t>
+        <w:t>, order_date</w:t>
       </w:r>
       <w:r>
         <w:rPr>
           <w:color w:val="000000" w:themeColor="text1"/>
           <w:lang w:val="en-US"/>
         </w:rPr>
-        <w:t>ID</w:t>
-      </w:r>
-      <w:proofErr w:type="spellEnd"/>
+        <w:t xml:space="preserve"> (date)</w:t>
+      </w:r>
       <w:r>
         <w:rPr>
           <w:color w:val="000000" w:themeColor="text1"/>
           <w:lang w:val="en-US"/>
         </w:rPr>
-        <w:t xml:space="preserve"> (int, foreign key)</w:t>
+        <w:t>, delivery</w:t>
       </w:r>
       <w:r>
         <w:rPr>
           <w:color w:val="000000" w:themeColor="text1"/>
           <w:lang w:val="en-US"/>
         </w:rPr>
-        <w:t xml:space="preserve">, </w:t>
-      </w:r>
-      <w:proofErr w:type="spellStart"/>
+        <w:t>_</w:t>
+      </w:r>
       <w:r>
         <w:rPr>
           <w:color w:val="000000" w:themeColor="text1"/>
           <w:lang w:val="en-US"/>
         </w:rPr>
-        <w:t>order_date</w:t>
-      </w:r>
-      <w:proofErr w:type="spellEnd"/>
+        <w:t>option</w:t>
+      </w:r>
       <w:r>
         <w:rPr>
           <w:color w:val="000000" w:themeColor="text1"/>
           <w:lang w:val="en-US"/>
         </w:rPr>
-        <w:t xml:space="preserve"> (date)</w:t>
+        <w:t xml:space="preserve"> (enum)</w:t>
       </w:r>
       <w:r>
         <w:rPr>
           <w:color w:val="000000" w:themeColor="text1"/>
           <w:lang w:val="en-US"/>
         </w:rPr>
-        <w:t xml:space="preserve">, </w:t>
-      </w:r>
-      <w:proofErr w:type="spellStart"/>
+        <w:t>, delivery</w:t>
+      </w:r>
       <w:r>
         <w:rPr>
           <w:color w:val="000000" w:themeColor="text1"/>
           <w:lang w:val="en-US"/>
         </w:rPr>
-        <w:t>delivery</w:t>
+        <w:t>_</w:t>
       </w:r>
       <w:r>
         <w:rPr>
           <w:color w:val="000000" w:themeColor="text1"/>
           <w:lang w:val="en-US"/>
         </w:rPr>
+        <w:t>address</w:t>
+      </w:r>
+      <w:r>
+        <w:rPr>
+          <w:color w:val="000000" w:themeColor="text1"/>
+          <w:lang w:val="en-US"/>
+        </w:rPr>
+        <w:t xml:space="preserve"> (varchar)</w:t>
+      </w:r>
+      <w:r>
+        <w:rPr>
+          <w:color w:val="000000" w:themeColor="text1"/>
+          <w:lang w:val="en-US"/>
+        </w:rPr>
+        <w:t xml:space="preserve"> and order</w:t>
+      </w:r>
+      <w:r>
+        <w:rPr>
+          <w:color w:val="000000" w:themeColor="text1"/>
+          <w:lang w:val="en-US"/>
+        </w:rPr>
         <w:t>_</w:t>
       </w:r>
       <w:r>
@@ -5037,121 +4799,14 @@
           <w:color w:val="000000" w:themeColor="text1"/>
           <w:lang w:val="en-US"/>
         </w:rPr>
-        <w:t>option</w:t>
-      </w:r>
-      <w:proofErr w:type="spellEnd"/>
+        <w:t>status</w:t>
+      </w:r>
       <w:r>
         <w:rPr>
           <w:color w:val="000000" w:themeColor="text1"/>
           <w:lang w:val="en-US"/>
         </w:rPr>
-        <w:t xml:space="preserve"> (</w:t>
-      </w:r>
-      <w:proofErr w:type="spellStart"/>
-      <w:r>
-        <w:rPr>
-          <w:color w:val="000000" w:themeColor="text1"/>
-          <w:lang w:val="en-US"/>
-        </w:rPr>
-        <w:t>enum</w:t>
-      </w:r>
-      <w:proofErr w:type="spellEnd"/>
-      <w:r>
-        <w:rPr>
-          <w:color w:val="000000" w:themeColor="text1"/>
-          <w:lang w:val="en-US"/>
-        </w:rPr>
-        <w:t>)</w:t>
-      </w:r>
-      <w:r>
-        <w:rPr>
-          <w:color w:val="000000" w:themeColor="text1"/>
-          <w:lang w:val="en-US"/>
-        </w:rPr>
-        <w:t xml:space="preserve">, </w:t>
-      </w:r>
-      <w:proofErr w:type="spellStart"/>
-      <w:r>
-        <w:rPr>
-          <w:color w:val="000000" w:themeColor="text1"/>
-          <w:lang w:val="en-US"/>
-        </w:rPr>
-        <w:t>delivery</w:t>
-      </w:r>
-      <w:r>
-        <w:rPr>
-          <w:color w:val="000000" w:themeColor="text1"/>
-          <w:lang w:val="en-US"/>
-        </w:rPr>
-        <w:t>_</w:t>
-      </w:r>
-      <w:r>
-        <w:rPr>
-          <w:color w:val="000000" w:themeColor="text1"/>
-          <w:lang w:val="en-US"/>
-        </w:rPr>
-        <w:t>address</w:t>
-      </w:r>
-      <w:proofErr w:type="spellEnd"/>
-      <w:r>
-        <w:rPr>
-          <w:color w:val="000000" w:themeColor="text1"/>
-          <w:lang w:val="en-US"/>
-        </w:rPr>
-        <w:t xml:space="preserve"> (varchar)</w:t>
-      </w:r>
-      <w:r>
-        <w:rPr>
-          <w:color w:val="000000" w:themeColor="text1"/>
-          <w:lang w:val="en-US"/>
-        </w:rPr>
-        <w:t xml:space="preserve"> and </w:t>
-      </w:r>
-      <w:proofErr w:type="spellStart"/>
-      <w:r>
-        <w:rPr>
-          <w:color w:val="000000" w:themeColor="text1"/>
-          <w:lang w:val="en-US"/>
-        </w:rPr>
-        <w:t>order</w:t>
-      </w:r>
-      <w:r>
-        <w:rPr>
-          <w:color w:val="000000" w:themeColor="text1"/>
-          <w:lang w:val="en-US"/>
-        </w:rPr>
-        <w:t>_</w:t>
-      </w:r>
-      <w:r>
-        <w:rPr>
-          <w:color w:val="000000" w:themeColor="text1"/>
-          <w:lang w:val="en-US"/>
-        </w:rPr>
-        <w:t>status</w:t>
-      </w:r>
-      <w:proofErr w:type="spellEnd"/>
-      <w:r>
-        <w:rPr>
-          <w:color w:val="000000" w:themeColor="text1"/>
-          <w:lang w:val="en-US"/>
-        </w:rPr>
-        <w:t xml:space="preserve"> (</w:t>
-      </w:r>
-      <w:proofErr w:type="spellStart"/>
-      <w:r>
-        <w:rPr>
-          <w:color w:val="000000" w:themeColor="text1"/>
-          <w:lang w:val="en-US"/>
-        </w:rPr>
-        <w:t>enum</w:t>
-      </w:r>
-      <w:proofErr w:type="spellEnd"/>
-      <w:r>
-        <w:rPr>
-          <w:color w:val="000000" w:themeColor="text1"/>
-          <w:lang w:val="en-US"/>
-        </w:rPr>
-        <w:t>)</w:t>
+        <w:t xml:space="preserve"> (enum)</w:t>
       </w:r>
       <w:r>
         <w:rPr>
@@ -5216,92 +4871,26 @@
           <w:lang w:val="en-US"/>
         </w:rPr>
       </w:pPr>
-      <w:proofErr w:type="spellStart"/>
       <w:r>
         <w:rPr>
           <w:color w:val="000000" w:themeColor="text1"/>
           <w:lang w:val="en-US"/>
         </w:rPr>
-        <w:t>orderDetails_</w:t>
-      </w:r>
-      <w:proofErr w:type="gramStart"/>
+        <w:t xml:space="preserve">orderDetails_ID(int, primary key), dish_ID (int, foreign key), </w:t>
+      </w:r>
       <w:r>
         <w:rPr>
           <w:color w:val="000000" w:themeColor="text1"/>
           <w:lang w:val="en-US"/>
         </w:rPr>
-        <w:t>ID</w:t>
-      </w:r>
-      <w:proofErr w:type="spellEnd"/>
+        <w:t>o</w:t>
+      </w:r>
       <w:r>
         <w:rPr>
           <w:color w:val="000000" w:themeColor="text1"/>
           <w:lang w:val="en-US"/>
         </w:rPr>
-        <w:t>(</w:t>
-      </w:r>
-      <w:proofErr w:type="gramEnd"/>
-      <w:r>
-        <w:rPr>
-          <w:color w:val="000000" w:themeColor="text1"/>
-          <w:lang w:val="en-US"/>
-        </w:rPr>
-        <w:t xml:space="preserve">int, primary key), </w:t>
-      </w:r>
-      <w:proofErr w:type="spellStart"/>
-      <w:r>
-        <w:rPr>
-          <w:color w:val="000000" w:themeColor="text1"/>
-          <w:lang w:val="en-US"/>
-        </w:rPr>
-        <w:t>dish_ID</w:t>
-      </w:r>
-      <w:proofErr w:type="spellEnd"/>
-      <w:r>
-        <w:rPr>
-          <w:color w:val="000000" w:themeColor="text1"/>
-          <w:lang w:val="en-US"/>
-        </w:rPr>
-        <w:t xml:space="preserve"> (int, foreign key), </w:t>
-      </w:r>
-      <w:proofErr w:type="spellStart"/>
-      <w:r>
-        <w:rPr>
-          <w:color w:val="000000" w:themeColor="text1"/>
-          <w:lang w:val="en-US"/>
-        </w:rPr>
-        <w:t>o</w:t>
-      </w:r>
-      <w:r>
-        <w:rPr>
-          <w:color w:val="000000" w:themeColor="text1"/>
-          <w:lang w:val="en-US"/>
-        </w:rPr>
-        <w:t>rder_ID</w:t>
-      </w:r>
-      <w:proofErr w:type="spellEnd"/>
-      <w:r>
-        <w:rPr>
-          <w:color w:val="000000" w:themeColor="text1"/>
-          <w:lang w:val="en-US"/>
-        </w:rPr>
-        <w:t xml:space="preserve"> (int, foreign key), </w:t>
-      </w:r>
-      <w:proofErr w:type="spellStart"/>
-      <w:r>
-        <w:rPr>
-          <w:color w:val="000000" w:themeColor="text1"/>
-          <w:lang w:val="en-US"/>
-        </w:rPr>
-        <w:t>payment_one</w:t>
-      </w:r>
-      <w:proofErr w:type="spellEnd"/>
-      <w:r>
-        <w:rPr>
-          <w:color w:val="000000" w:themeColor="text1"/>
-          <w:lang w:val="en-US"/>
-        </w:rPr>
-        <w:t xml:space="preserve"> (float), quantity (int), and subtotal (float).</w:t>
+        <w:t>rder_ID (int, foreign key), payment_one (float), quantity (int), and subtotal (float).</w:t>
       </w:r>
     </w:p>
     <w:p>
@@ -5359,7 +4948,6 @@
           <w:lang w:val="en-US"/>
         </w:rPr>
       </w:pPr>
-      <w:proofErr w:type="spellStart"/>
       <w:r>
         <w:rPr>
           <w:color w:val="000000" w:themeColor="text1"/>
@@ -5367,7 +4955,6 @@
         </w:rPr>
         <w:t>payment_id</w:t>
       </w:r>
-      <w:proofErr w:type="spellEnd"/>
       <w:r>
         <w:rPr>
           <w:color w:val="000000" w:themeColor="text1"/>
@@ -5380,187 +4967,112 @@
           <w:color w:val="000000" w:themeColor="text1"/>
           <w:lang w:val="en-US"/>
         </w:rPr>
-        <w:t xml:space="preserve">, </w:t>
-      </w:r>
-      <w:proofErr w:type="spellStart"/>
+        <w:t>, user_</w:t>
+      </w:r>
       <w:r>
         <w:rPr>
           <w:color w:val="000000" w:themeColor="text1"/>
           <w:lang w:val="en-US"/>
         </w:rPr>
-        <w:t>user_</w:t>
+        <w:t>ID (int, foreign key)</w:t>
       </w:r>
       <w:r>
         <w:rPr>
           <w:color w:val="000000" w:themeColor="text1"/>
           <w:lang w:val="en-US"/>
         </w:rPr>
-        <w:t>ID</w:t>
-      </w:r>
-      <w:proofErr w:type="spellEnd"/>
+        <w:t>, order_</w:t>
+      </w:r>
       <w:r>
         <w:rPr>
           <w:color w:val="000000" w:themeColor="text1"/>
           <w:lang w:val="en-US"/>
         </w:rPr>
-        <w:t xml:space="preserve"> (int, foreign key)</w:t>
+        <w:t>ID (int, foreign key)</w:t>
       </w:r>
       <w:r>
         <w:rPr>
           <w:color w:val="000000" w:themeColor="text1"/>
           <w:lang w:val="en-US"/>
         </w:rPr>
-        <w:t xml:space="preserve">, </w:t>
-      </w:r>
-      <w:proofErr w:type="spellStart"/>
+        <w:t>, payment_amount</w:t>
+      </w:r>
       <w:r>
         <w:rPr>
           <w:color w:val="000000" w:themeColor="text1"/>
           <w:lang w:val="en-US"/>
         </w:rPr>
-        <w:t>order_</w:t>
+        <w:t xml:space="preserve"> (</w:t>
       </w:r>
       <w:r>
         <w:rPr>
           <w:color w:val="000000" w:themeColor="text1"/>
           <w:lang w:val="en-US"/>
         </w:rPr>
-        <w:t>ID</w:t>
-      </w:r>
-      <w:proofErr w:type="spellEnd"/>
+        <w:t>float</w:t>
+      </w:r>
       <w:r>
         <w:rPr>
           <w:color w:val="000000" w:themeColor="text1"/>
           <w:lang w:val="en-US"/>
         </w:rPr>
-        <w:t xml:space="preserve"> (int, foreign key)</w:t>
+        <w:t>)</w:t>
       </w:r>
       <w:r>
         <w:rPr>
           <w:color w:val="000000" w:themeColor="text1"/>
           <w:lang w:val="en-US"/>
         </w:rPr>
-        <w:t xml:space="preserve">, </w:t>
-      </w:r>
-      <w:proofErr w:type="spellStart"/>
+        <w:t>, payment_</w:t>
+      </w:r>
       <w:r>
         <w:rPr>
           <w:color w:val="000000" w:themeColor="text1"/>
           <w:lang w:val="en-US"/>
         </w:rPr>
-        <w:t>payment_amount</w:t>
-      </w:r>
-      <w:proofErr w:type="spellEnd"/>
+        <w:t>D</w:t>
+      </w:r>
       <w:r>
         <w:rPr>
           <w:color w:val="000000" w:themeColor="text1"/>
           <w:lang w:val="en-US"/>
         </w:rPr>
-        <w:t xml:space="preserve"> (</w:t>
+        <w:t>ate</w:t>
       </w:r>
       <w:r>
         <w:rPr>
           <w:color w:val="000000" w:themeColor="text1"/>
           <w:lang w:val="en-US"/>
         </w:rPr>
-        <w:t>float</w:t>
+        <w:t xml:space="preserve"> (timestamp)</w:t>
       </w:r>
       <w:r>
         <w:rPr>
           <w:color w:val="000000" w:themeColor="text1"/>
           <w:lang w:val="en-US"/>
         </w:rPr>
-        <w:t>)</w:t>
+        <w:t>, and payment_</w:t>
       </w:r>
       <w:r>
         <w:rPr>
           <w:color w:val="000000" w:themeColor="text1"/>
           <w:lang w:val="en-US"/>
         </w:rPr>
-        <w:t xml:space="preserve">, </w:t>
-      </w:r>
-      <w:proofErr w:type="spellStart"/>
+        <w:t>M</w:t>
+      </w:r>
       <w:r>
         <w:rPr>
           <w:color w:val="000000" w:themeColor="text1"/>
           <w:lang w:val="en-US"/>
         </w:rPr>
-        <w:t>payment_</w:t>
+        <w:t>ethod</w:t>
       </w:r>
       <w:r>
         <w:rPr>
           <w:color w:val="000000" w:themeColor="text1"/>
           <w:lang w:val="en-US"/>
         </w:rPr>
-        <w:t>D</w:t>
-      </w:r>
-      <w:r>
-        <w:rPr>
-          <w:color w:val="000000" w:themeColor="text1"/>
-          <w:lang w:val="en-US"/>
-        </w:rPr>
-        <w:t>ate</w:t>
-      </w:r>
-      <w:proofErr w:type="spellEnd"/>
-      <w:r>
-        <w:rPr>
-          <w:color w:val="000000" w:themeColor="text1"/>
-          <w:lang w:val="en-US"/>
-        </w:rPr>
-        <w:t xml:space="preserve"> (timestamp)</w:t>
-      </w:r>
-      <w:r>
-        <w:rPr>
-          <w:color w:val="000000" w:themeColor="text1"/>
-          <w:lang w:val="en-US"/>
-        </w:rPr>
-        <w:t xml:space="preserve">, and </w:t>
-      </w:r>
-      <w:proofErr w:type="spellStart"/>
-      <w:r>
-        <w:rPr>
-          <w:color w:val="000000" w:themeColor="text1"/>
-          <w:lang w:val="en-US"/>
-        </w:rPr>
-        <w:t>payment_</w:t>
-      </w:r>
-      <w:r>
-        <w:rPr>
-          <w:color w:val="000000" w:themeColor="text1"/>
-          <w:lang w:val="en-US"/>
-        </w:rPr>
-        <w:t>M</w:t>
-      </w:r>
-      <w:r>
-        <w:rPr>
-          <w:color w:val="000000" w:themeColor="text1"/>
-          <w:lang w:val="en-US"/>
-        </w:rPr>
-        <w:t>ethod</w:t>
-      </w:r>
-      <w:proofErr w:type="spellEnd"/>
-      <w:r>
-        <w:rPr>
-          <w:color w:val="000000" w:themeColor="text1"/>
-          <w:lang w:val="en-US"/>
-        </w:rPr>
-        <w:t xml:space="preserve"> (</w:t>
-      </w:r>
-      <w:proofErr w:type="spellStart"/>
-      <w:r>
-        <w:rPr>
-          <w:color w:val="000000" w:themeColor="text1"/>
-          <w:lang w:val="en-US"/>
-        </w:rPr>
-        <w:t>enum</w:t>
-      </w:r>
-      <w:proofErr w:type="spellEnd"/>
-      <w:r>
-        <w:rPr>
-          <w:color w:val="000000" w:themeColor="text1"/>
-          <w:lang w:val="en-US"/>
-        </w:rPr>
-        <w:t>)</w:t>
+        <w:t xml:space="preserve"> (enum)</w:t>
       </w:r>
     </w:p>
     <w:p>
@@ -7310,21 +6822,7 @@
         <w:rPr>
           <w:color w:val="000000" w:themeColor="text1"/>
         </w:rPr>
-        <w:t xml:space="preserve">relationships </w:t>
-      </w:r>
-      <w:proofErr w:type="gramStart"/>
-      <w:r>
-        <w:rPr>
-          <w:color w:val="000000" w:themeColor="text1"/>
-        </w:rPr>
-        <w:t>and also</w:t>
-      </w:r>
-      <w:proofErr w:type="gramEnd"/>
-      <w:r>
-        <w:rPr>
-          <w:color w:val="000000" w:themeColor="text1"/>
-        </w:rPr>
-        <w:t xml:space="preserve"> to </w:t>
+        <w:t xml:space="preserve">relationships and also to </w:t>
       </w:r>
       <w:r>
         <w:rPr>
@@ -7570,19 +7068,11 @@
           <w:color w:val="000000" w:themeColor="text1"/>
         </w:rPr>
       </w:pPr>
-      <w:proofErr w:type="spellStart"/>
-      <w:r>
-        <w:rPr>
-          <w:color w:val="000000" w:themeColor="text1"/>
-        </w:rPr>
-        <w:t>worldscientific</w:t>
-      </w:r>
-      <w:proofErr w:type="spellEnd"/>
-      <w:r>
-        <w:rPr>
-          <w:color w:val="000000" w:themeColor="text1"/>
-        </w:rPr>
-        <w:t xml:space="preserve"> (2022) ‘Predicate Logic’, </w:t>
+      <w:r>
+        <w:rPr>
+          <w:color w:val="000000" w:themeColor="text1"/>
+        </w:rPr>
+        <w:t xml:space="preserve">worldscientific (2022) ‘Predicate Logic’, </w:t>
       </w:r>
       <w:r>
         <w:rPr>
@@ -7682,19 +7172,11 @@
           <w:color w:val="000000" w:themeColor="text1"/>
         </w:rPr>
       </w:pPr>
-      <w:proofErr w:type="spellStart"/>
-      <w:r>
-        <w:rPr>
-          <w:color w:val="000000" w:themeColor="text1"/>
-        </w:rPr>
-        <w:t>byjus</w:t>
-      </w:r>
-      <w:proofErr w:type="spellEnd"/>
-      <w:r>
-        <w:rPr>
-          <w:color w:val="000000" w:themeColor="text1"/>
-        </w:rPr>
-        <w:t xml:space="preserve"> (2019) </w:t>
+      <w:r>
+        <w:rPr>
+          <w:color w:val="000000" w:themeColor="text1"/>
+        </w:rPr>
+        <w:t xml:space="preserve">byjus (2019) </w:t>
       </w:r>
       <w:r>
         <w:rPr>
@@ -7780,20 +7262,12 @@
         </w:rPr>
       </w:pPr>
       <w:bookmarkStart w:id="37" w:name="_Toc230531914"/>
-      <w:proofErr w:type="gramStart"/>
       <w:r>
         <w:rPr>
           <w:color w:val="000000" w:themeColor="text1"/>
         </w:rPr>
         <w:lastRenderedPageBreak/>
-        <w:t>Appendix  —</w:t>
-      </w:r>
-      <w:proofErr w:type="gramEnd"/>
-      <w:r>
-        <w:rPr>
-          <w:color w:val="000000" w:themeColor="text1"/>
-        </w:rPr>
-        <w:t xml:space="preserve"> Individual Reflective Statement</w:t>
+        <w:t>Appendix  — Individual Reflective Statement</w:t>
       </w:r>
       <w:bookmarkEnd w:id="37"/>
     </w:p>
@@ -7850,25 +7324,7 @@
           <w:iCs/>
           <w:color w:val="000000" w:themeColor="text1"/>
         </w:rPr>
-        <w:t xml:space="preserve">[Write your 500-word individual reflection here. Use first person ('I', 'my contribution', 'I found'). Be specific — vague statements score poorly. Describe what you </w:t>
-      </w:r>
-      <w:proofErr w:type="gramStart"/>
-      <w:r>
-        <w:rPr>
-          <w:i/>
-          <w:iCs/>
-          <w:color w:val="000000" w:themeColor="text1"/>
-        </w:rPr>
-        <w:t>actually did</w:t>
-      </w:r>
-      <w:proofErr w:type="gramEnd"/>
-      <w:r>
-        <w:rPr>
-          <w:i/>
-          <w:iCs/>
-          <w:color w:val="000000" w:themeColor="text1"/>
-        </w:rPr>
-        <w:t>, what challenged you, and what you learned.]</w:t>
+        <w:t>[Write your 500-word individual reflection here. Use first person ('I', 'my contribution', 'I found'). Be specific — vague statements score poorly. Describe what you actually did, what challenged you, and what you learned.]</w:t>
       </w:r>
     </w:p>
     <w:p>
@@ -7896,21 +7352,7 @@
         <w:rPr>
           <w:color w:val="000000" w:themeColor="text1"/>
         </w:rPr>
-        <w:t>The most significant challenge I encountered was [specific challenge — e.g. 'understanding and implementing the Ordinary Least Squares regression algorithm from first principles, without relying on high-level library abstractions']. I overcame this by [approach — e.g. 'reviewing the module lecture notes on linear algebra, working through the derivation step by step, and cross-checking my implementation against scikit-</w:t>
-      </w:r>
-      <w:proofErr w:type="spellStart"/>
-      <w:r>
-        <w:rPr>
-          <w:color w:val="000000" w:themeColor="text1"/>
-        </w:rPr>
-        <w:t>learn's</w:t>
-      </w:r>
-      <w:proofErr w:type="spellEnd"/>
-      <w:r>
-        <w:rPr>
-          <w:color w:val="000000" w:themeColor="text1"/>
-        </w:rPr>
-        <w:t xml:space="preserve"> output'].</w:t>
+        <w:t>The most significant challenge I encountered was [specific challenge — e.g. 'understanding and implementing the Ordinary Least Squares regression algorithm from first principles, without relying on high-level library abstractions']. I overcame this by [approach — e.g. 'reviewing the module lecture notes on linear algebra, working through the derivation step by step, and cross-checking my implementation against scikit-learn's output'].</w:t>
       </w:r>
     </w:p>
     <w:p>
@@ -8245,25 +7687,7 @@
         <w:sz w:val="18"/>
         <w:szCs w:val="18"/>
       </w:rPr>
-      <w:t>M-CSC005U</w:t>
-    </w:r>
-    <w:proofErr w:type="gramStart"/>
-    <w:r>
-      <w:rPr>
-        <w:color w:val="888888"/>
-        <w:sz w:val="18"/>
-        <w:szCs w:val="18"/>
-      </w:rPr>
-      <w:t>1  —</w:t>
-    </w:r>
-    <w:proofErr w:type="gramEnd"/>
-    <w:r>
-      <w:rPr>
-        <w:color w:val="888888"/>
-        <w:sz w:val="18"/>
-        <w:szCs w:val="18"/>
-      </w:rPr>
-      <w:t xml:space="preserve">  Mathematical and Data Analytics Group Project</w:t>
+      <w:t>M-CSC005U1  —  Mathematical and Data Analytics Group Project</w:t>
     </w:r>
   </w:p>
 </w:hdr>
@@ -8283,25 +7707,7 @@
         <w:sz w:val="18"/>
         <w:szCs w:val="18"/>
       </w:rPr>
-      <w:t>M-CSC005U</w:t>
-    </w:r>
-    <w:proofErr w:type="gramStart"/>
-    <w:r>
-      <w:rPr>
-        <w:color w:val="888888"/>
-        <w:sz w:val="18"/>
-        <w:szCs w:val="18"/>
-      </w:rPr>
-      <w:t>1  —</w:t>
-    </w:r>
-    <w:proofErr w:type="gramEnd"/>
-    <w:r>
-      <w:rPr>
-        <w:color w:val="888888"/>
-        <w:sz w:val="18"/>
-        <w:szCs w:val="18"/>
-      </w:rPr>
-      <w:t xml:space="preserve">  Mathematical and Data Analytics Group Project</w:t>
+      <w:t>M-CSC005U1  —  Mathematical and Data Analytics Group Project</w:t>
     </w:r>
   </w:p>
 </w:hdr>
@@ -10283,6 +9689,10 @@
 </file>
 
 <file path=customXml/item1.xml><?xml version="1.0" encoding="utf-8"?>
+<b:Sources xmlns:b="http://schemas.openxmlformats.org/officeDocument/2006/bibliography" xmlns="http://schemas.openxmlformats.org/officeDocument/2006/bibliography" SelectedStyle="\APASixthEditionOfficeOnline.xsl" StyleName="APA" Version="6"/>
+</file>
+
+<file path=customXml/item2.xml><?xml version="1.0" encoding="utf-8"?>
 <s:customData xmlns="http://www.wps.cn/officeDocument/2013/wpsCustomData" xmlns:s="http://www.wps.cn/officeDocument/2013/wpsCustomData">
   <customSectProps>
     <customSectPr/>
@@ -10294,22 +9704,18 @@
 </s:customData>
 </file>
 
-<file path=customXml/item2.xml><?xml version="1.0" encoding="utf-8"?>
-<b:Sources xmlns:b="http://schemas.openxmlformats.org/officeDocument/2006/bibliography" xmlns="http://schemas.openxmlformats.org/officeDocument/2006/bibliography" SelectedStyle="\APASixthEditionOfficeOnline.xsl" StyleName="APA" Version="6"/>
+<file path=customXml/itemProps1.xml><?xml version="1.0" encoding="utf-8"?>
+<ds:datastoreItem xmlns:ds="http://schemas.openxmlformats.org/officeDocument/2006/customXml" ds:itemID="{11CE9064-0015-4BAE-B6CA-558D0B4F112B}">
+  <ds:schemaRefs>
+    <ds:schemaRef ds:uri="http://schemas.openxmlformats.org/officeDocument/2006/bibliography"/>
+  </ds:schemaRefs>
+</ds:datastoreItem>
 </file>
 
-<file path=customXml/itemProps1.xml><?xml version="1.0" encoding="utf-8"?>
+<file path=customXml/itemProps2.xml><?xml version="1.0" encoding="utf-8"?>
 <ds:datastoreItem xmlns:ds="http://schemas.openxmlformats.org/officeDocument/2006/customXml" ds:itemID="{B1977F7D-205B-4081-913C-38D41E755F92}">
   <ds:schemaRefs>
     <ds:schemaRef ds:uri="http://www.wps.cn/officeDocument/2013/wpsCustomData"/>
   </ds:schemaRefs>
 </ds:datastoreItem>
-</file>
-
-<file path=customXml/itemProps2.xml><?xml version="1.0" encoding="utf-8"?>
-<ds:datastoreItem xmlns:ds="http://schemas.openxmlformats.org/officeDocument/2006/customXml" ds:itemID="{11CE9064-0015-4BAE-B6CA-558D0B4F112B}">
-  <ds:schemaRefs>
-    <ds:schemaRef ds:uri="http://schemas.openxmlformats.org/officeDocument/2006/bibliography"/>
-  </ds:schemaRefs>
-</ds:datastoreItem>
 </file>
</xml_diff>

<commit_message>
restore and save resturant report
</commit_message>
<xml_diff>
--- a/Resturant_Report.docx
+++ b/Resturant_Report.docx
@@ -123,7 +123,33 @@
           <w:sz w:val="36"/>
           <w:szCs w:val="36"/>
         </w:rPr>
-        <w:t>[Reastaurant name] Database Design</w:t>
+        <w:t>[</w:t>
+      </w:r>
+      <w:proofErr w:type="spellStart"/>
+      <w:r>
+        <w:rPr>
+          <w:b/>
+          <w:bCs/>
+          <w:i/>
+          <w:iCs/>
+          <w:color w:val="000000" w:themeColor="text1"/>
+          <w:sz w:val="36"/>
+          <w:szCs w:val="36"/>
+        </w:rPr>
+        <w:t>Reastaurant</w:t>
+      </w:r>
+      <w:proofErr w:type="spellEnd"/>
+      <w:r>
+        <w:rPr>
+          <w:b/>
+          <w:bCs/>
+          <w:i/>
+          <w:iCs/>
+          <w:color w:val="000000" w:themeColor="text1"/>
+          <w:sz w:val="36"/>
+          <w:szCs w:val="36"/>
+        </w:rPr>
+        <w:t xml:space="preserve"> name] Database Design</w:t>
       </w:r>
     </w:p>
     <w:p>
@@ -226,11 +252,10 @@
                 <w:sz w:val="22"/>
                 <w:szCs w:val="22"/>
               </w:rPr>
-              <w:t>1. [Abdennouri Mouatez Billah — 25016832]</w:t>
-            </w:r>
-          </w:p>
-          <w:p>
-            <w:pPr>
+              <w:t>1. [</w:t>
+            </w:r>
+            <w:proofErr w:type="spellStart"/>
+            <w:r>
               <w:rPr>
                 <w:i/>
                 <w:iCs/>
@@ -238,7 +263,9 @@
                 <w:sz w:val="22"/>
                 <w:szCs w:val="22"/>
               </w:rPr>
-            </w:pPr>
+              <w:t>Abdennouri</w:t>
+            </w:r>
+            <w:proofErr w:type="spellEnd"/>
             <w:r>
               <w:rPr>
                 <w:i/>
@@ -247,8 +274,9 @@
                 <w:sz w:val="22"/>
                 <w:szCs w:val="22"/>
               </w:rPr>
-              <w:t>2. [</w:t>
-            </w:r>
+              <w:t xml:space="preserve"> </w:t>
+            </w:r>
+            <w:proofErr w:type="spellStart"/>
             <w:r>
               <w:rPr>
                 <w:i/>
@@ -257,8 +285,9 @@
                 <w:sz w:val="22"/>
                 <w:szCs w:val="22"/>
               </w:rPr>
-              <w:t>Giwa Marvellous - 25016834</w:t>
-            </w:r>
+              <w:t>Mouatez</w:t>
+            </w:r>
+            <w:proofErr w:type="spellEnd"/>
             <w:r>
               <w:rPr>
                 <w:i/>
@@ -267,16 +296,11 @@
                 <w:sz w:val="22"/>
                 <w:szCs w:val="22"/>
               </w:rPr>
-              <w:t xml:space="preserve">] </w:t>
+              <w:t xml:space="preserve"> Billah — 25016832]</w:t>
             </w:r>
           </w:p>
           <w:p>
             <w:pPr>
-              <w:rPr>
-                <w:color w:val="000000" w:themeColor="text1"/>
-              </w:rPr>
-            </w:pPr>
-            <w:r>
               <w:rPr>
                 <w:i/>
                 <w:iCs/>
@@ -284,8 +308,7 @@
                 <w:sz w:val="22"/>
                 <w:szCs w:val="22"/>
               </w:rPr>
-              <w:t>3. [</w:t>
-            </w:r>
+            </w:pPr>
             <w:r>
               <w:rPr>
                 <w:i/>
@@ -294,7 +317,76 @@
                 <w:sz w:val="22"/>
                 <w:szCs w:val="22"/>
               </w:rPr>
-              <w:t>Rupesh kumar Sah - 25016818</w:t>
+              <w:t>2. [</w:t>
+            </w:r>
+            <w:r>
+              <w:rPr>
+                <w:i/>
+                <w:iCs/>
+                <w:color w:val="000000" w:themeColor="text1"/>
+                <w:sz w:val="22"/>
+                <w:szCs w:val="22"/>
+              </w:rPr>
+              <w:t>Giwa Marvellous - 25016834</w:t>
+            </w:r>
+            <w:r>
+              <w:rPr>
+                <w:i/>
+                <w:iCs/>
+                <w:color w:val="000000" w:themeColor="text1"/>
+                <w:sz w:val="22"/>
+                <w:szCs w:val="22"/>
+              </w:rPr>
+              <w:t xml:space="preserve">] </w:t>
+            </w:r>
+          </w:p>
+          <w:p>
+            <w:pPr>
+              <w:rPr>
+                <w:color w:val="000000" w:themeColor="text1"/>
+              </w:rPr>
+            </w:pPr>
+            <w:r>
+              <w:rPr>
+                <w:i/>
+                <w:iCs/>
+                <w:color w:val="000000" w:themeColor="text1"/>
+                <w:sz w:val="22"/>
+                <w:szCs w:val="22"/>
+              </w:rPr>
+              <w:t>3. [</w:t>
+            </w:r>
+            <w:r>
+              <w:rPr>
+                <w:i/>
+                <w:iCs/>
+                <w:color w:val="000000" w:themeColor="text1"/>
+                <w:sz w:val="22"/>
+                <w:szCs w:val="22"/>
+              </w:rPr>
+              <w:t xml:space="preserve">Rupesh </w:t>
+            </w:r>
+            <w:proofErr w:type="spellStart"/>
+            <w:r>
+              <w:rPr>
+                <w:i/>
+                <w:iCs/>
+                <w:color w:val="000000" w:themeColor="text1"/>
+                <w:sz w:val="22"/>
+                <w:szCs w:val="22"/>
+              </w:rPr>
+              <w:t>kumar</w:t>
+            </w:r>
+            <w:proofErr w:type="spellEnd"/>
+            <w:r>
+              <w:rPr>
+                <w:i/>
+                <w:iCs/>
+                <w:color w:val="000000" w:themeColor="text1"/>
+                <w:sz w:val="22"/>
+                <w:szCs w:val="22"/>
+              </w:rPr>
+              <w:t xml:space="preserve"> Sah - 25016818</w:t>
             </w:r>
             <w:r>
               <w:rPr>
@@ -3743,7 +3835,21 @@
         <w:rPr>
           <w:color w:val="000000" w:themeColor="text1"/>
         </w:rPr>
-        <w:t>An organized collection of objects that can be represented in set-builder form or roster form. In set theory, the operations of the sets are carried when two or more sets combine to form a single set under some of the given conditions. The basic operations on sets are: Union of sets, Intersection of sets, A complement of a set, Cartesian product of sets and Set difference. (byjus, 2019)</w:t>
+        <w:t>An organized collection of objects that can be represented in set-builder form or roster form. In set theory, the operations of the sets are carried when two or more sets combine to form a single set under some of the given conditions. The basic operations on sets are: Union of sets, Intersection of sets, A complement of a set, Cartesian product of sets and Set difference. (</w:t>
+      </w:r>
+      <w:proofErr w:type="spellStart"/>
+      <w:r>
+        <w:rPr>
+          <w:color w:val="000000" w:themeColor="text1"/>
+        </w:rPr>
+        <w:t>byjus</w:t>
+      </w:r>
+      <w:proofErr w:type="spellEnd"/>
+      <w:r>
+        <w:rPr>
+          <w:color w:val="000000" w:themeColor="text1"/>
+        </w:rPr>
+        <w:t>, 2019)</w:t>
       </w:r>
     </w:p>
     <w:p>
@@ -3776,7 +3882,21 @@
           <w:color w:val="000000" w:themeColor="text1"/>
         </w:rPr>
         <w:lastRenderedPageBreak/>
-        <w:t>Sets relate to sql when making queries to show specific data where tables are combined (JOIN ON) which is the Union of sets for example and when provided with a certain a parameter to filter more than we get into Intersection of sets (WHERE, GROUP BY…etc)</w:t>
+        <w:t xml:space="preserve">Sets relate to </w:t>
+      </w:r>
+      <w:proofErr w:type="spellStart"/>
+      <w:r>
+        <w:rPr>
+          <w:color w:val="000000" w:themeColor="text1"/>
+        </w:rPr>
+        <w:t>sql</w:t>
+      </w:r>
+      <w:proofErr w:type="spellEnd"/>
+      <w:r>
+        <w:rPr>
+          <w:color w:val="000000" w:themeColor="text1"/>
+        </w:rPr>
+        <w:t xml:space="preserve"> when making queries to show specific data where tables are combined (JOIN ON) which is the Union of sets for example and when provided with a certain a parameter to filter more than we get into Intersection of sets (WHERE, GROUP BY…etc)</w:t>
       </w:r>
     </w:p>
     <w:p>
@@ -3914,7 +4034,21 @@
         <w:rPr>
           <w:color w:val="000000" w:themeColor="text1"/>
         </w:rPr>
-        <w:t>As we perform operations on sets to make queries, we basically applying relational algebra, and apart from the operations used before, SELECT was also used to print our the results for example and sorting operations (like DESC)</w:t>
+        <w:t xml:space="preserve">As we perform operations on sets to make queries, we basically applying relational algebra, and apart from the operations used before, SELECT was also used to print </w:t>
+      </w:r>
+      <w:proofErr w:type="spellStart"/>
+      <w:r>
+        <w:rPr>
+          <w:color w:val="000000" w:themeColor="text1"/>
+        </w:rPr>
+        <w:t>our</w:t>
+      </w:r>
+      <w:proofErr w:type="spellEnd"/>
+      <w:r>
+        <w:rPr>
+          <w:color w:val="000000" w:themeColor="text1"/>
+        </w:rPr>
+        <w:t xml:space="preserve"> the results for example and sorting operations (like DESC)</w:t>
       </w:r>
     </w:p>
     <w:p>
@@ -3974,7 +4108,21 @@
         <w:rPr>
           <w:color w:val="000000" w:themeColor="text1"/>
         </w:rPr>
-        <w:t>Predicate logic, also called first-order logic, is an enrichment of propositional logic to include predicates, individuals and quantifiers, and is widely accepted as the standard language of mathematics. Axiomatic predicate logic was established by Gottlob Frege in the late 19th century, who formalized the notion of quantified variable. (worldscientific, 2022)</w:t>
+        <w:t>Predicate logic, also called first-order logic, is an enrichment of propositional logic to include predicates, individuals and quantifiers, and is widely accepted as the standard language of mathematics. Axiomatic predicate logic was established by Gottlob Frege in the late 19th century, who formalized the notion of quantified variable. (</w:t>
+      </w:r>
+      <w:proofErr w:type="spellStart"/>
+      <w:r>
+        <w:rPr>
+          <w:color w:val="000000" w:themeColor="text1"/>
+        </w:rPr>
+        <w:t>worldscientific</w:t>
+      </w:r>
+      <w:proofErr w:type="spellEnd"/>
+      <w:r>
+        <w:rPr>
+          <w:color w:val="000000" w:themeColor="text1"/>
+        </w:rPr>
+        <w:t>, 2022)</w:t>
       </w:r>
     </w:p>
     <w:p>
@@ -4065,7 +4213,21 @@
           <w:color w:val="000000" w:themeColor="text1"/>
         </w:rPr>
         <w:br/>
-        <w:t xml:space="preserve">Another example is the functional dependencies (normalization) for example dish_id  </w:t>
+        <w:t xml:space="preserve">Another example is the functional dependencies (normalization) for example </w:t>
+      </w:r>
+      <w:proofErr w:type="spellStart"/>
+      <w:r>
+        <w:rPr>
+          <w:color w:val="000000" w:themeColor="text1"/>
+        </w:rPr>
+        <w:t>dish_id</w:t>
+      </w:r>
+      <w:proofErr w:type="spellEnd"/>
+      <w:r>
+        <w:rPr>
+          <w:color w:val="000000" w:themeColor="text1"/>
+        </w:rPr>
+        <w:t xml:space="preserve">  </w:t>
       </w:r>
       <w:r>
         <w:rPr>
@@ -4077,7 +4239,49 @@
         <w:rPr>
           <w:color w:val="000000" w:themeColor="text1"/>
         </w:rPr>
-        <w:t xml:space="preserve"> dishName, which means that the dish_id determines the dishName.</w:t>
+        <w:t xml:space="preserve"> </w:t>
+      </w:r>
+      <w:proofErr w:type="spellStart"/>
+      <w:r>
+        <w:rPr>
+          <w:color w:val="000000" w:themeColor="text1"/>
+        </w:rPr>
+        <w:t>dishName</w:t>
+      </w:r>
+      <w:proofErr w:type="spellEnd"/>
+      <w:r>
+        <w:rPr>
+          <w:color w:val="000000" w:themeColor="text1"/>
+        </w:rPr>
+        <w:t xml:space="preserve">, which means that the </w:t>
+      </w:r>
+      <w:proofErr w:type="spellStart"/>
+      <w:r>
+        <w:rPr>
+          <w:color w:val="000000" w:themeColor="text1"/>
+        </w:rPr>
+        <w:t>dish_id</w:t>
+      </w:r>
+      <w:proofErr w:type="spellEnd"/>
+      <w:r>
+        <w:rPr>
+          <w:color w:val="000000" w:themeColor="text1"/>
+        </w:rPr>
+        <w:t xml:space="preserve"> determines the </w:t>
+      </w:r>
+      <w:proofErr w:type="spellStart"/>
+      <w:r>
+        <w:rPr>
+          <w:color w:val="000000" w:themeColor="text1"/>
+        </w:rPr>
+        <w:t>dishName</w:t>
+      </w:r>
+      <w:proofErr w:type="spellEnd"/>
+      <w:r>
+        <w:rPr>
+          <w:color w:val="000000" w:themeColor="text1"/>
+        </w:rPr>
+        <w:t>.</w:t>
       </w:r>
     </w:p>
     <w:p>
@@ -4099,7 +4303,21 @@
         <w:rPr>
           <w:color w:val="000000" w:themeColor="text1"/>
         </w:rPr>
-        <w:t>To construct this model, graph theory was also implemented to decide the relationship between the tables (entites) through the primary keys and foreign keys.</w:t>
+        <w:t>To construct this model, graph theory was also implemented to decide the relationship between the tables (</w:t>
+      </w:r>
+      <w:proofErr w:type="spellStart"/>
+      <w:r>
+        <w:rPr>
+          <w:color w:val="000000" w:themeColor="text1"/>
+        </w:rPr>
+        <w:t>entites</w:t>
+      </w:r>
+      <w:proofErr w:type="spellEnd"/>
+      <w:r>
+        <w:rPr>
+          <w:color w:val="000000" w:themeColor="text1"/>
+        </w:rPr>
+        <w:t>) through the primary keys and foreign keys.</w:t>
       </w:r>
     </w:p>
     <w:p>
@@ -4202,11 +4420,19 @@
         </w:rPr>
         <w:t xml:space="preserve">. </w:t>
       </w:r>
-      <w:r>
-        <w:rPr>
-          <w:color w:val="000000" w:themeColor="text1"/>
-        </w:rPr>
-        <w:t>Github to track the work.</w:t>
+      <w:proofErr w:type="spellStart"/>
+      <w:r>
+        <w:rPr>
+          <w:color w:val="000000" w:themeColor="text1"/>
+        </w:rPr>
+        <w:t>Github</w:t>
+      </w:r>
+      <w:proofErr w:type="spellEnd"/>
+      <w:r>
+        <w:rPr>
+          <w:color w:val="000000" w:themeColor="text1"/>
+        </w:rPr>
+        <w:t xml:space="preserve"> to track the work.</w:t>
       </w:r>
     </w:p>
     <w:p>
@@ -4437,6 +4663,7 @@
         </w:rPr>
         <w:t xml:space="preserve">, </w:t>
       </w:r>
+      <w:proofErr w:type="spellStart"/>
       <w:r>
         <w:rPr>
           <w:color w:val="000000" w:themeColor="text1"/>
@@ -4451,12 +4678,29 @@
         </w:rPr>
         <w:t>num</w:t>
       </w:r>
-      <w:r>
-        <w:rPr>
-          <w:color w:val="000000" w:themeColor="text1"/>
-          <w:lang w:val="en-US"/>
-        </w:rPr>
-        <w:t xml:space="preserve"> (bigint)</w:t>
+      <w:proofErr w:type="spellEnd"/>
+      <w:r>
+        <w:rPr>
+          <w:color w:val="000000" w:themeColor="text1"/>
+          <w:lang w:val="en-US"/>
+        </w:rPr>
+        <w:t xml:space="preserve"> (</w:t>
+      </w:r>
+      <w:proofErr w:type="spellStart"/>
+      <w:r>
+        <w:rPr>
+          <w:color w:val="000000" w:themeColor="text1"/>
+          <w:lang w:val="en-US"/>
+        </w:rPr>
+        <w:t>bigint</w:t>
+      </w:r>
+      <w:proofErr w:type="spellEnd"/>
+      <w:r>
+        <w:rPr>
+          <w:color w:val="000000" w:themeColor="text1"/>
+          <w:lang w:val="en-US"/>
+        </w:rPr>
+        <w:t>)</w:t>
       </w:r>
       <w:r>
         <w:rPr>
@@ -4535,6 +4779,7 @@
           <w:lang w:val="en-US"/>
         </w:rPr>
       </w:pPr>
+      <w:proofErr w:type="spellStart"/>
       <w:r>
         <w:rPr>
           <w:color w:val="000000" w:themeColor="text1"/>
@@ -4547,14 +4792,30 @@
           <w:color w:val="000000" w:themeColor="text1"/>
           <w:lang w:val="en-US"/>
         </w:rPr>
-        <w:t>ID (int, primary key)</w:t>
-      </w:r>
-      <w:r>
-        <w:rPr>
-          <w:color w:val="000000" w:themeColor="text1"/>
-          <w:lang w:val="en-US"/>
-        </w:rPr>
-        <w:t>, dish</w:t>
+        <w:t>ID</w:t>
+      </w:r>
+      <w:proofErr w:type="spellEnd"/>
+      <w:r>
+        <w:rPr>
+          <w:color w:val="000000" w:themeColor="text1"/>
+          <w:lang w:val="en-US"/>
+        </w:rPr>
+        <w:t xml:space="preserve"> (int, primary key)</w:t>
+      </w:r>
+      <w:r>
+        <w:rPr>
+          <w:color w:val="000000" w:themeColor="text1"/>
+          <w:lang w:val="en-US"/>
+        </w:rPr>
+        <w:t xml:space="preserve">, </w:t>
+      </w:r>
+      <w:proofErr w:type="spellStart"/>
+      <w:r>
+        <w:rPr>
+          <w:color w:val="000000" w:themeColor="text1"/>
+          <w:lang w:val="en-US"/>
+        </w:rPr>
+        <w:t>dish</w:t>
       </w:r>
       <w:r>
         <w:rPr>
@@ -4570,6 +4831,7 @@
         </w:rPr>
         <w:t>ame</w:t>
       </w:r>
+      <w:proofErr w:type="spellEnd"/>
       <w:r>
         <w:rPr>
           <w:color w:val="000000" w:themeColor="text1"/>
@@ -4617,7 +4879,23 @@
           <w:color w:val="000000" w:themeColor="text1"/>
           <w:lang w:val="en-US"/>
         </w:rPr>
-        <w:t xml:space="preserve"> (enum)</w:t>
+        <w:t xml:space="preserve"> (</w:t>
+      </w:r>
+      <w:proofErr w:type="spellStart"/>
+      <w:r>
+        <w:rPr>
+          <w:color w:val="000000" w:themeColor="text1"/>
+          <w:lang w:val="en-US"/>
+        </w:rPr>
+        <w:t>enum</w:t>
+      </w:r>
+      <w:proofErr w:type="spellEnd"/>
+      <w:r>
+        <w:rPr>
+          <w:color w:val="000000" w:themeColor="text1"/>
+          <w:lang w:val="en-US"/>
+        </w:rPr>
+        <w:t>)</w:t>
       </w:r>
       <w:r>
         <w:rPr>
@@ -4682,6 +4960,7 @@
           <w:lang w:val="en-US"/>
         </w:rPr>
       </w:pPr>
+      <w:proofErr w:type="spellStart"/>
       <w:r>
         <w:rPr>
           <w:color w:val="000000" w:themeColor="text1"/>
@@ -4694,29 +4973,62 @@
           <w:color w:val="000000" w:themeColor="text1"/>
           <w:lang w:val="en-US"/>
         </w:rPr>
-        <w:t>ID (int, primary key)</w:t>
-      </w:r>
-      <w:r>
-        <w:rPr>
-          <w:color w:val="000000" w:themeColor="text1"/>
-          <w:lang w:val="en-US"/>
-        </w:rPr>
-        <w:t>, user_</w:t>
-      </w:r>
-      <w:r>
-        <w:rPr>
-          <w:color w:val="000000" w:themeColor="text1"/>
-          <w:lang w:val="en-US"/>
-        </w:rPr>
-        <w:t>ID (int, foreign key)</w:t>
-      </w:r>
-      <w:r>
-        <w:rPr>
-          <w:color w:val="000000" w:themeColor="text1"/>
-          <w:lang w:val="en-US"/>
-        </w:rPr>
-        <w:t>, order_date</w:t>
-      </w:r>
+        <w:t>ID</w:t>
+      </w:r>
+      <w:proofErr w:type="spellEnd"/>
+      <w:r>
+        <w:rPr>
+          <w:color w:val="000000" w:themeColor="text1"/>
+          <w:lang w:val="en-US"/>
+        </w:rPr>
+        <w:t xml:space="preserve"> (int, primary key)</w:t>
+      </w:r>
+      <w:r>
+        <w:rPr>
+          <w:color w:val="000000" w:themeColor="text1"/>
+          <w:lang w:val="en-US"/>
+        </w:rPr>
+        <w:t xml:space="preserve">, </w:t>
+      </w:r>
+      <w:proofErr w:type="spellStart"/>
+      <w:r>
+        <w:rPr>
+          <w:color w:val="000000" w:themeColor="text1"/>
+          <w:lang w:val="en-US"/>
+        </w:rPr>
+        <w:t>user_</w:t>
+      </w:r>
+      <w:r>
+        <w:rPr>
+          <w:color w:val="000000" w:themeColor="text1"/>
+          <w:lang w:val="en-US"/>
+        </w:rPr>
+        <w:t>ID</w:t>
+      </w:r>
+      <w:proofErr w:type="spellEnd"/>
+      <w:r>
+        <w:rPr>
+          <w:color w:val="000000" w:themeColor="text1"/>
+          <w:lang w:val="en-US"/>
+        </w:rPr>
+        <w:t xml:space="preserve"> (int, foreign key)</w:t>
+      </w:r>
+      <w:r>
+        <w:rPr>
+          <w:color w:val="000000" w:themeColor="text1"/>
+          <w:lang w:val="en-US"/>
+        </w:rPr>
+        <w:t xml:space="preserve">, </w:t>
+      </w:r>
+      <w:proofErr w:type="spellStart"/>
+      <w:r>
+        <w:rPr>
+          <w:color w:val="000000" w:themeColor="text1"/>
+          <w:lang w:val="en-US"/>
+        </w:rPr>
+        <w:t>order_date</w:t>
+      </w:r>
+      <w:proofErr w:type="spellEnd"/>
       <w:r>
         <w:rPr>
           <w:color w:val="000000" w:themeColor="text1"/>
@@ -4729,7 +5041,15 @@
           <w:color w:val="000000" w:themeColor="text1"/>
           <w:lang w:val="en-US"/>
         </w:rPr>
-        <w:t>, delivery</w:t>
+        <w:t xml:space="preserve">, </w:t>
+      </w:r>
+      <w:proofErr w:type="spellStart"/>
+      <w:r>
+        <w:rPr>
+          <w:color w:val="000000" w:themeColor="text1"/>
+          <w:lang w:val="en-US"/>
+        </w:rPr>
+        <w:t>delivery</w:t>
       </w:r>
       <w:r>
         <w:rPr>
@@ -4745,19 +5065,44 @@
         </w:rPr>
         <w:t>option</w:t>
       </w:r>
-      <w:r>
-        <w:rPr>
-          <w:color w:val="000000" w:themeColor="text1"/>
-          <w:lang w:val="en-US"/>
-        </w:rPr>
-        <w:t xml:space="preserve"> (enum)</w:t>
-      </w:r>
-      <w:r>
-        <w:rPr>
-          <w:color w:val="000000" w:themeColor="text1"/>
-          <w:lang w:val="en-US"/>
-        </w:rPr>
-        <w:t>, delivery</w:t>
+      <w:proofErr w:type="spellEnd"/>
+      <w:r>
+        <w:rPr>
+          <w:color w:val="000000" w:themeColor="text1"/>
+          <w:lang w:val="en-US"/>
+        </w:rPr>
+        <w:t xml:space="preserve"> (</w:t>
+      </w:r>
+      <w:proofErr w:type="spellStart"/>
+      <w:r>
+        <w:rPr>
+          <w:color w:val="000000" w:themeColor="text1"/>
+          <w:lang w:val="en-US"/>
+        </w:rPr>
+        <w:t>enum</w:t>
+      </w:r>
+      <w:proofErr w:type="spellEnd"/>
+      <w:r>
+        <w:rPr>
+          <w:color w:val="000000" w:themeColor="text1"/>
+          <w:lang w:val="en-US"/>
+        </w:rPr>
+        <w:t>)</w:t>
+      </w:r>
+      <w:r>
+        <w:rPr>
+          <w:color w:val="000000" w:themeColor="text1"/>
+          <w:lang w:val="en-US"/>
+        </w:rPr>
+        <w:t xml:space="preserve">, </w:t>
+      </w:r>
+      <w:proofErr w:type="spellStart"/>
+      <w:r>
+        <w:rPr>
+          <w:color w:val="000000" w:themeColor="text1"/>
+          <w:lang w:val="en-US"/>
+        </w:rPr>
+        <w:t>delivery</w:t>
       </w:r>
       <w:r>
         <w:rPr>
@@ -4773,6 +5118,7 @@
         </w:rPr>
         <w:t>address</w:t>
       </w:r>
+      <w:proofErr w:type="spellEnd"/>
       <w:r>
         <w:rPr>
           <w:color w:val="000000" w:themeColor="text1"/>
@@ -4785,7 +5131,15 @@
           <w:color w:val="000000" w:themeColor="text1"/>
           <w:lang w:val="en-US"/>
         </w:rPr>
-        <w:t xml:space="preserve"> and order</w:t>
+        <w:t xml:space="preserve"> and </w:t>
+      </w:r>
+      <w:proofErr w:type="spellStart"/>
+      <w:r>
+        <w:rPr>
+          <w:color w:val="000000" w:themeColor="text1"/>
+          <w:lang w:val="en-US"/>
+        </w:rPr>
+        <w:t>order</w:t>
       </w:r>
       <w:r>
         <w:rPr>
@@ -4801,12 +5155,29 @@
         </w:rPr>
         <w:t>status</w:t>
       </w:r>
-      <w:r>
-        <w:rPr>
-          <w:color w:val="000000" w:themeColor="text1"/>
-          <w:lang w:val="en-US"/>
-        </w:rPr>
-        <w:t xml:space="preserve"> (enum)</w:t>
+      <w:proofErr w:type="spellEnd"/>
+      <w:r>
+        <w:rPr>
+          <w:color w:val="000000" w:themeColor="text1"/>
+          <w:lang w:val="en-US"/>
+        </w:rPr>
+        <w:t xml:space="preserve"> (</w:t>
+      </w:r>
+      <w:proofErr w:type="spellStart"/>
+      <w:r>
+        <w:rPr>
+          <w:color w:val="000000" w:themeColor="text1"/>
+          <w:lang w:val="en-US"/>
+        </w:rPr>
+        <w:t>enum</w:t>
+      </w:r>
+      <w:proofErr w:type="spellEnd"/>
+      <w:r>
+        <w:rPr>
+          <w:color w:val="000000" w:themeColor="text1"/>
+          <w:lang w:val="en-US"/>
+        </w:rPr>
+        <w:t>)</w:t>
       </w:r>
       <w:r>
         <w:rPr>
@@ -4871,13 +5242,39 @@
           <w:lang w:val="en-US"/>
         </w:rPr>
       </w:pPr>
-      <w:r>
-        <w:rPr>
-          <w:color w:val="000000" w:themeColor="text1"/>
-          <w:lang w:val="en-US"/>
-        </w:rPr>
-        <w:t xml:space="preserve">orderDetails_ID(int, primary key), dish_ID (int, foreign key), </w:t>
-      </w:r>
+      <w:proofErr w:type="spellStart"/>
+      <w:r>
+        <w:rPr>
+          <w:color w:val="000000" w:themeColor="text1"/>
+          <w:lang w:val="en-US"/>
+        </w:rPr>
+        <w:t>orderDetails_ID</w:t>
+      </w:r>
+      <w:proofErr w:type="spellEnd"/>
+      <w:r>
+        <w:rPr>
+          <w:color w:val="000000" w:themeColor="text1"/>
+          <w:lang w:val="en-US"/>
+        </w:rPr>
+        <w:t xml:space="preserve">(int, primary key), </w:t>
+      </w:r>
+      <w:proofErr w:type="spellStart"/>
+      <w:r>
+        <w:rPr>
+          <w:color w:val="000000" w:themeColor="text1"/>
+          <w:lang w:val="en-US"/>
+        </w:rPr>
+        <w:t>dish_ID</w:t>
+      </w:r>
+      <w:proofErr w:type="spellEnd"/>
+      <w:r>
+        <w:rPr>
+          <w:color w:val="000000" w:themeColor="text1"/>
+          <w:lang w:val="en-US"/>
+        </w:rPr>
+        <w:t xml:space="preserve"> (int, foreign key), </w:t>
+      </w:r>
+      <w:proofErr w:type="spellStart"/>
       <w:r>
         <w:rPr>
           <w:color w:val="000000" w:themeColor="text1"/>
@@ -4890,7 +5287,31 @@
           <w:color w:val="000000" w:themeColor="text1"/>
           <w:lang w:val="en-US"/>
         </w:rPr>
-        <w:t>rder_ID (int, foreign key), payment_one (float), quantity (int), and subtotal (float).</w:t>
+        <w:t>rder_ID</w:t>
+      </w:r>
+      <w:proofErr w:type="spellEnd"/>
+      <w:r>
+        <w:rPr>
+          <w:color w:val="000000" w:themeColor="text1"/>
+          <w:lang w:val="en-US"/>
+        </w:rPr>
+        <w:t xml:space="preserve"> (int, foreign key), </w:t>
+      </w:r>
+      <w:proofErr w:type="spellStart"/>
+      <w:r>
+        <w:rPr>
+          <w:color w:val="000000" w:themeColor="text1"/>
+          <w:lang w:val="en-US"/>
+        </w:rPr>
+        <w:t>payment_one</w:t>
+      </w:r>
+      <w:proofErr w:type="spellEnd"/>
+      <w:r>
+        <w:rPr>
+          <w:color w:val="000000" w:themeColor="text1"/>
+          <w:lang w:val="en-US"/>
+        </w:rPr>
+        <w:t xml:space="preserve"> (float), quantity (int), and subtotal (float).</w:t>
       </w:r>
     </w:p>
     <w:p>
@@ -4948,6 +5369,7 @@
           <w:lang w:val="en-US"/>
         </w:rPr>
       </w:pPr>
+      <w:proofErr w:type="spellStart"/>
       <w:r>
         <w:rPr>
           <w:color w:val="000000" w:themeColor="text1"/>
@@ -4955,6 +5377,7 @@
         </w:rPr>
         <w:t>payment_id</w:t>
       </w:r>
+      <w:proofErr w:type="spellEnd"/>
       <w:r>
         <w:rPr>
           <w:color w:val="000000" w:themeColor="text1"/>
@@ -4967,36 +5390,77 @@
           <w:color w:val="000000" w:themeColor="text1"/>
           <w:lang w:val="en-US"/>
         </w:rPr>
-        <w:t>, user_</w:t>
-      </w:r>
-      <w:r>
-        <w:rPr>
-          <w:color w:val="000000" w:themeColor="text1"/>
-          <w:lang w:val="en-US"/>
-        </w:rPr>
-        <w:t>ID (int, foreign key)</w:t>
-      </w:r>
-      <w:r>
-        <w:rPr>
-          <w:color w:val="000000" w:themeColor="text1"/>
-          <w:lang w:val="en-US"/>
-        </w:rPr>
-        <w:t>, order_</w:t>
-      </w:r>
-      <w:r>
-        <w:rPr>
-          <w:color w:val="000000" w:themeColor="text1"/>
-          <w:lang w:val="en-US"/>
-        </w:rPr>
-        <w:t>ID (int, foreign key)</w:t>
-      </w:r>
-      <w:r>
-        <w:rPr>
-          <w:color w:val="000000" w:themeColor="text1"/>
-          <w:lang w:val="en-US"/>
-        </w:rPr>
-        <w:t>, payment_amount</w:t>
-      </w:r>
+        <w:t xml:space="preserve">, </w:t>
+      </w:r>
+      <w:proofErr w:type="spellStart"/>
+      <w:r>
+        <w:rPr>
+          <w:color w:val="000000" w:themeColor="text1"/>
+          <w:lang w:val="en-US"/>
+        </w:rPr>
+        <w:t>user_</w:t>
+      </w:r>
+      <w:r>
+        <w:rPr>
+          <w:color w:val="000000" w:themeColor="text1"/>
+          <w:lang w:val="en-US"/>
+        </w:rPr>
+        <w:t>ID</w:t>
+      </w:r>
+      <w:proofErr w:type="spellEnd"/>
+      <w:r>
+        <w:rPr>
+          <w:color w:val="000000" w:themeColor="text1"/>
+          <w:lang w:val="en-US"/>
+        </w:rPr>
+        <w:t xml:space="preserve"> (int, foreign key)</w:t>
+      </w:r>
+      <w:r>
+        <w:rPr>
+          <w:color w:val="000000" w:themeColor="text1"/>
+          <w:lang w:val="en-US"/>
+        </w:rPr>
+        <w:t xml:space="preserve">, </w:t>
+      </w:r>
+      <w:proofErr w:type="spellStart"/>
+      <w:r>
+        <w:rPr>
+          <w:color w:val="000000" w:themeColor="text1"/>
+          <w:lang w:val="en-US"/>
+        </w:rPr>
+        <w:t>order_</w:t>
+      </w:r>
+      <w:r>
+        <w:rPr>
+          <w:color w:val="000000" w:themeColor="text1"/>
+          <w:lang w:val="en-US"/>
+        </w:rPr>
+        <w:t>ID</w:t>
+      </w:r>
+      <w:proofErr w:type="spellEnd"/>
+      <w:r>
+        <w:rPr>
+          <w:color w:val="000000" w:themeColor="text1"/>
+          <w:lang w:val="en-US"/>
+        </w:rPr>
+        <w:t xml:space="preserve"> (int, foreign key)</w:t>
+      </w:r>
+      <w:r>
+        <w:rPr>
+          <w:color w:val="000000" w:themeColor="text1"/>
+          <w:lang w:val="en-US"/>
+        </w:rPr>
+        <w:t xml:space="preserve">, </w:t>
+      </w:r>
+      <w:proofErr w:type="spellStart"/>
+      <w:r>
+        <w:rPr>
+          <w:color w:val="000000" w:themeColor="text1"/>
+          <w:lang w:val="en-US"/>
+        </w:rPr>
+        <w:t>payment_amount</w:t>
+      </w:r>
+      <w:proofErr w:type="spellEnd"/>
       <w:r>
         <w:rPr>
           <w:color w:val="000000" w:themeColor="text1"/>
@@ -5023,7 +5487,15 @@
           <w:color w:val="000000" w:themeColor="text1"/>
           <w:lang w:val="en-US"/>
         </w:rPr>
-        <w:t>, payment_</w:t>
+        <w:t xml:space="preserve">, </w:t>
+      </w:r>
+      <w:proofErr w:type="spellStart"/>
+      <w:r>
+        <w:rPr>
+          <w:color w:val="000000" w:themeColor="text1"/>
+          <w:lang w:val="en-US"/>
+        </w:rPr>
+        <w:t>payment_</w:t>
       </w:r>
       <w:r>
         <w:rPr>
@@ -5039,6 +5511,7 @@
         </w:rPr>
         <w:t>ate</w:t>
       </w:r>
+      <w:proofErr w:type="spellEnd"/>
       <w:r>
         <w:rPr>
           <w:color w:val="000000" w:themeColor="text1"/>
@@ -5051,7 +5524,15 @@
           <w:color w:val="000000" w:themeColor="text1"/>
           <w:lang w:val="en-US"/>
         </w:rPr>
-        <w:t>, and payment_</w:t>
+        <w:t xml:space="preserve">, and </w:t>
+      </w:r>
+      <w:proofErr w:type="spellStart"/>
+      <w:r>
+        <w:rPr>
+          <w:color w:val="000000" w:themeColor="text1"/>
+          <w:lang w:val="en-US"/>
+        </w:rPr>
+        <w:t>payment_</w:t>
       </w:r>
       <w:r>
         <w:rPr>
@@ -5067,12 +5548,29 @@
         </w:rPr>
         <w:t>ethod</w:t>
       </w:r>
-      <w:r>
-        <w:rPr>
-          <w:color w:val="000000" w:themeColor="text1"/>
-          <w:lang w:val="en-US"/>
-        </w:rPr>
-        <w:t xml:space="preserve"> (enum)</w:t>
+      <w:proofErr w:type="spellEnd"/>
+      <w:r>
+        <w:rPr>
+          <w:color w:val="000000" w:themeColor="text1"/>
+          <w:lang w:val="en-US"/>
+        </w:rPr>
+        <w:t xml:space="preserve"> (</w:t>
+      </w:r>
+      <w:proofErr w:type="spellStart"/>
+      <w:r>
+        <w:rPr>
+          <w:color w:val="000000" w:themeColor="text1"/>
+          <w:lang w:val="en-US"/>
+        </w:rPr>
+        <w:t>enum</w:t>
+      </w:r>
+      <w:proofErr w:type="spellEnd"/>
+      <w:r>
+        <w:rPr>
+          <w:color w:val="000000" w:themeColor="text1"/>
+          <w:lang w:val="en-US"/>
+        </w:rPr>
+        <w:t>)</w:t>
       </w:r>
     </w:p>
     <w:p>
@@ -5380,14 +5878,27 @@
                               <w:r>
                                 <w:t xml:space="preserve">Figure </w:t>
                               </w:r>
-                              <w:fldSimple w:instr=" SEQ Figure \* ARABIC ">
-                                <w:r>
-                                  <w:rPr>
-                                    <w:noProof/>
-                                  </w:rPr>
-                                  <w:t>1</w:t>
-                                </w:r>
-                              </w:fldSimple>
+                              <w:r>
+                                <w:fldChar w:fldCharType="begin"/>
+                              </w:r>
+                              <w:r>
+                                <w:instrText xml:space="preserve"> SEQ Figure \* ARABIC </w:instrText>
+                              </w:r>
+                              <w:r>
+                                <w:fldChar w:fldCharType="separate"/>
+                              </w:r>
+                              <w:r>
+                                <w:rPr>
+                                  <w:noProof/>
+                                </w:rPr>
+                                <w:t>1</w:t>
+                              </w:r>
+                              <w:r>
+                                <w:rPr>
+                                  <w:noProof/>
+                                </w:rPr>
+                                <w:fldChar w:fldCharType="end"/>
+                              </w:r>
                               <w:r>
                                 <w:t>:</w:t>
                               </w:r>
@@ -5456,14 +5967,27 @@
                         <w:r>
                           <w:t xml:space="preserve">Figure </w:t>
                         </w:r>
-                        <w:fldSimple w:instr=" SEQ Figure \* ARABIC ">
-                          <w:r>
-                            <w:rPr>
-                              <w:noProof/>
-                            </w:rPr>
-                            <w:t>1</w:t>
-                          </w:r>
-                        </w:fldSimple>
+                        <w:r>
+                          <w:fldChar w:fldCharType="begin"/>
+                        </w:r>
+                        <w:r>
+                          <w:instrText xml:space="preserve"> SEQ Figure \* ARABIC </w:instrText>
+                        </w:r>
+                        <w:r>
+                          <w:fldChar w:fldCharType="separate"/>
+                        </w:r>
+                        <w:r>
+                          <w:rPr>
+                            <w:noProof/>
+                          </w:rPr>
+                          <w:t>1</w:t>
+                        </w:r>
+                        <w:r>
+                          <w:rPr>
+                            <w:noProof/>
+                          </w:rPr>
+                          <w:fldChar w:fldCharType="end"/>
+                        </w:r>
                         <w:r>
                           <w:t>:</w:t>
                         </w:r>
@@ -5592,14 +6116,27 @@
                               <w:r>
                                 <w:t xml:space="preserve">Figure </w:t>
                               </w:r>
-                              <w:fldSimple w:instr=" SEQ Figure \* ARABIC ">
-                                <w:r>
-                                  <w:rPr>
-                                    <w:noProof/>
-                                  </w:rPr>
-                                  <w:t>2</w:t>
-                                </w:r>
-                              </w:fldSimple>
+                              <w:r>
+                                <w:fldChar w:fldCharType="begin"/>
+                              </w:r>
+                              <w:r>
+                                <w:instrText xml:space="preserve"> SEQ Figure \* ARABIC </w:instrText>
+                              </w:r>
+                              <w:r>
+                                <w:fldChar w:fldCharType="separate"/>
+                              </w:r>
+                              <w:r>
+                                <w:rPr>
+                                  <w:noProof/>
+                                </w:rPr>
+                                <w:t>2</w:t>
+                              </w:r>
+                              <w:r>
+                                <w:rPr>
+                                  <w:noProof/>
+                                </w:rPr>
+                                <w:fldChar w:fldCharType="end"/>
+                              </w:r>
                               <w:r>
                                 <w:t>: “Users who spent more than £10” Query</w:t>
                               </w:r>
@@ -5642,14 +6179,27 @@
                         <w:r>
                           <w:t xml:space="preserve">Figure </w:t>
                         </w:r>
-                        <w:fldSimple w:instr=" SEQ Figure \* ARABIC ">
-                          <w:r>
-                            <w:rPr>
-                              <w:noProof/>
-                            </w:rPr>
-                            <w:t>2</w:t>
-                          </w:r>
-                        </w:fldSimple>
+                        <w:r>
+                          <w:fldChar w:fldCharType="begin"/>
+                        </w:r>
+                        <w:r>
+                          <w:instrText xml:space="preserve"> SEQ Figure \* ARABIC </w:instrText>
+                        </w:r>
+                        <w:r>
+                          <w:fldChar w:fldCharType="separate"/>
+                        </w:r>
+                        <w:r>
+                          <w:rPr>
+                            <w:noProof/>
+                          </w:rPr>
+                          <w:t>2</w:t>
+                        </w:r>
+                        <w:r>
+                          <w:rPr>
+                            <w:noProof/>
+                          </w:rPr>
+                          <w:fldChar w:fldCharType="end"/>
+                        </w:r>
                         <w:r>
                           <w:t>: “Users who spent more than £10” Query</w:t>
                         </w:r>
@@ -5788,14 +6338,27 @@
                               <w:r>
                                 <w:t xml:space="preserve">Figure </w:t>
                               </w:r>
-                              <w:fldSimple w:instr=" SEQ Figure \* ARABIC ">
-                                <w:r>
-                                  <w:rPr>
-                                    <w:noProof/>
-                                  </w:rPr>
-                                  <w:t>3</w:t>
-                                </w:r>
-                              </w:fldSimple>
+                              <w:r>
+                                <w:fldChar w:fldCharType="begin"/>
+                              </w:r>
+                              <w:r>
+                                <w:instrText xml:space="preserve"> SEQ Figure \* ARABIC </w:instrText>
+                              </w:r>
+                              <w:r>
+                                <w:fldChar w:fldCharType="separate"/>
+                              </w:r>
+                              <w:r>
+                                <w:rPr>
+                                  <w:noProof/>
+                                </w:rPr>
+                                <w:t>3</w:t>
+                              </w:r>
+                              <w:r>
+                                <w:rPr>
+                                  <w:noProof/>
+                                </w:rPr>
+                                <w:fldChar w:fldCharType="end"/>
+                              </w:r>
                               <w:r>
                                 <w:t xml:space="preserve">: </w:t>
                               </w:r>
@@ -5844,14 +6407,27 @@
                         <w:r>
                           <w:t xml:space="preserve">Figure </w:t>
                         </w:r>
-                        <w:fldSimple w:instr=" SEQ Figure \* ARABIC ">
-                          <w:r>
-                            <w:rPr>
-                              <w:noProof/>
-                            </w:rPr>
-                            <w:t>3</w:t>
-                          </w:r>
-                        </w:fldSimple>
+                        <w:r>
+                          <w:fldChar w:fldCharType="begin"/>
+                        </w:r>
+                        <w:r>
+                          <w:instrText xml:space="preserve"> SEQ Figure \* ARABIC </w:instrText>
+                        </w:r>
+                        <w:r>
+                          <w:fldChar w:fldCharType="separate"/>
+                        </w:r>
+                        <w:r>
+                          <w:rPr>
+                            <w:noProof/>
+                          </w:rPr>
+                          <w:t>3</w:t>
+                        </w:r>
+                        <w:r>
+                          <w:rPr>
+                            <w:noProof/>
+                          </w:rPr>
+                          <w:fldChar w:fldCharType="end"/>
+                        </w:r>
                         <w:r>
                           <w:t xml:space="preserve">: </w:t>
                         </w:r>
@@ -5984,14 +6560,27 @@
                               <w:r>
                                 <w:t xml:space="preserve">Figure </w:t>
                               </w:r>
-                              <w:fldSimple w:instr=" SEQ Figure \* ARABIC ">
-                                <w:r>
-                                  <w:rPr>
-                                    <w:noProof/>
-                                  </w:rPr>
-                                  <w:t>4</w:t>
-                                </w:r>
-                              </w:fldSimple>
+                              <w:r>
+                                <w:fldChar w:fldCharType="begin"/>
+                              </w:r>
+                              <w:r>
+                                <w:instrText xml:space="preserve"> SEQ Figure \* ARABIC </w:instrText>
+                              </w:r>
+                              <w:r>
+                                <w:fldChar w:fldCharType="separate"/>
+                              </w:r>
+                              <w:r>
+                                <w:rPr>
+                                  <w:noProof/>
+                                </w:rPr>
+                                <w:t>4</w:t>
+                              </w:r>
+                              <w:r>
+                                <w:rPr>
+                                  <w:noProof/>
+                                </w:rPr>
+                                <w:fldChar w:fldCharType="end"/>
+                              </w:r>
                               <w:r>
                                 <w:t>:</w:t>
                               </w:r>
@@ -6032,14 +6621,27 @@
                         <w:r>
                           <w:t xml:space="preserve">Figure </w:t>
                         </w:r>
-                        <w:fldSimple w:instr=" SEQ Figure \* ARABIC ">
-                          <w:r>
-                            <w:rPr>
-                              <w:noProof/>
-                            </w:rPr>
-                            <w:t>4</w:t>
-                          </w:r>
-                        </w:fldSimple>
+                        <w:r>
+                          <w:fldChar w:fldCharType="begin"/>
+                        </w:r>
+                        <w:r>
+                          <w:instrText xml:space="preserve"> SEQ Figure \* ARABIC </w:instrText>
+                        </w:r>
+                        <w:r>
+                          <w:fldChar w:fldCharType="separate"/>
+                        </w:r>
+                        <w:r>
+                          <w:rPr>
+                            <w:noProof/>
+                          </w:rPr>
+                          <w:t>4</w:t>
+                        </w:r>
+                        <w:r>
+                          <w:rPr>
+                            <w:noProof/>
+                          </w:rPr>
+                          <w:fldChar w:fldCharType="end"/>
+                        </w:r>
                         <w:r>
                           <w:t>:</w:t>
                         </w:r>
@@ -6163,14 +6765,27 @@
                               <w:r>
                                 <w:t xml:space="preserve">Figure </w:t>
                               </w:r>
-                              <w:fldSimple w:instr=" SEQ Figure \* ARABIC ">
-                                <w:r>
-                                  <w:rPr>
-                                    <w:noProof/>
-                                  </w:rPr>
-                                  <w:t>5</w:t>
-                                </w:r>
-                              </w:fldSimple>
+                              <w:r>
+                                <w:fldChar w:fldCharType="begin"/>
+                              </w:r>
+                              <w:r>
+                                <w:instrText xml:space="preserve"> SEQ Figure \* ARABIC </w:instrText>
+                              </w:r>
+                              <w:r>
+                                <w:fldChar w:fldCharType="separate"/>
+                              </w:r>
+                              <w:r>
+                                <w:rPr>
+                                  <w:noProof/>
+                                </w:rPr>
+                                <w:t>5</w:t>
+                              </w:r>
+                              <w:r>
+                                <w:rPr>
+                                  <w:noProof/>
+                                </w:rPr>
+                                <w:fldChar w:fldCharType="end"/>
+                              </w:r>
                               <w:r>
                                 <w:t>: Saved queries</w:t>
                               </w:r>
@@ -6212,14 +6827,27 @@
                         <w:r>
                           <w:t xml:space="preserve">Figure </w:t>
                         </w:r>
-                        <w:fldSimple w:instr=" SEQ Figure \* ARABIC ">
-                          <w:r>
-                            <w:rPr>
-                              <w:noProof/>
-                            </w:rPr>
-                            <w:t>5</w:t>
-                          </w:r>
-                        </w:fldSimple>
+                        <w:r>
+                          <w:fldChar w:fldCharType="begin"/>
+                        </w:r>
+                        <w:r>
+                          <w:instrText xml:space="preserve"> SEQ Figure \* ARABIC </w:instrText>
+                        </w:r>
+                        <w:r>
+                          <w:fldChar w:fldCharType="separate"/>
+                        </w:r>
+                        <w:r>
+                          <w:rPr>
+                            <w:noProof/>
+                          </w:rPr>
+                          <w:t>5</w:t>
+                        </w:r>
+                        <w:r>
+                          <w:rPr>
+                            <w:noProof/>
+                          </w:rPr>
+                          <w:fldChar w:fldCharType="end"/>
+                        </w:r>
                         <w:r>
                           <w:t>: Saved queries</w:t>
                         </w:r>
@@ -6572,6 +7200,22 @@
     </w:p>
     <w:p>
       <w:pPr>
+        <w:spacing w:before="80" w:after="80"/>
+        <w:rPr>
+          <w:color w:val="000000" w:themeColor="text1"/>
+        </w:rPr>
+      </w:pPr>
+    </w:p>
+    <w:p>
+      <w:pPr>
+        <w:spacing w:before="80" w:after="80"/>
+        <w:rPr>
+          <w:color w:val="000000" w:themeColor="text1"/>
+        </w:rPr>
+      </w:pPr>
+    </w:p>
+    <w:p>
+      <w:pPr>
         <w:rPr>
           <w:color w:val="000000" w:themeColor="text1"/>
         </w:rPr>
@@ -7068,11 +7712,19 @@
           <w:color w:val="000000" w:themeColor="text1"/>
         </w:rPr>
       </w:pPr>
-      <w:r>
-        <w:rPr>
-          <w:color w:val="000000" w:themeColor="text1"/>
-        </w:rPr>
-        <w:t xml:space="preserve">worldscientific (2022) ‘Predicate Logic’, </w:t>
+      <w:proofErr w:type="spellStart"/>
+      <w:r>
+        <w:rPr>
+          <w:color w:val="000000" w:themeColor="text1"/>
+        </w:rPr>
+        <w:t>worldscientific</w:t>
+      </w:r>
+      <w:proofErr w:type="spellEnd"/>
+      <w:r>
+        <w:rPr>
+          <w:color w:val="000000" w:themeColor="text1"/>
+        </w:rPr>
+        <w:t xml:space="preserve"> (2022) ‘Predicate Logic’, </w:t>
       </w:r>
       <w:r>
         <w:rPr>
@@ -7172,11 +7824,19 @@
           <w:color w:val="000000" w:themeColor="text1"/>
         </w:rPr>
       </w:pPr>
-      <w:r>
-        <w:rPr>
-          <w:color w:val="000000" w:themeColor="text1"/>
-        </w:rPr>
-        <w:t xml:space="preserve">byjus (2019) </w:t>
+      <w:proofErr w:type="spellStart"/>
+      <w:r>
+        <w:rPr>
+          <w:color w:val="000000" w:themeColor="text1"/>
+        </w:rPr>
+        <w:t>byjus</w:t>
+      </w:r>
+      <w:proofErr w:type="spellEnd"/>
+      <w:r>
+        <w:rPr>
+          <w:color w:val="000000" w:themeColor="text1"/>
+        </w:rPr>
+        <w:t xml:space="preserve"> (2019) </w:t>
       </w:r>
       <w:r>
         <w:rPr>
@@ -7352,7 +8012,21 @@
         <w:rPr>
           <w:color w:val="000000" w:themeColor="text1"/>
         </w:rPr>
-        <w:t>The most significant challenge I encountered was [specific challenge — e.g. 'understanding and implementing the Ordinary Least Squares regression algorithm from first principles, without relying on high-level library abstractions']. I overcame this by [approach — e.g. 'reviewing the module lecture notes on linear algebra, working through the derivation step by step, and cross-checking my implementation against scikit-learn's output'].</w:t>
+        <w:t>The most significant challenge I encountered was [specific challenge — e.g. 'understanding and implementing the Ordinary Least Squares regression algorithm from first principles, without relying on high-level library abstractions']. I overcame this by [approach — e.g. 'reviewing the module lecture notes on linear algebra, working through the derivation step by step, and cross-checking my implementation against scikit-</w:t>
+      </w:r>
+      <w:proofErr w:type="spellStart"/>
+      <w:r>
+        <w:rPr>
+          <w:color w:val="000000" w:themeColor="text1"/>
+        </w:rPr>
+        <w:t>learn's</w:t>
+      </w:r>
+      <w:proofErr w:type="spellEnd"/>
+      <w:r>
+        <w:rPr>
+          <w:color w:val="000000" w:themeColor="text1"/>
+        </w:rPr>
+        <w:t xml:space="preserve"> output'].</w:t>
       </w:r>
     </w:p>
     <w:p>
@@ -9689,10 +10363,6 @@
 </file>
 
 <file path=customXml/item1.xml><?xml version="1.0" encoding="utf-8"?>
-<b:Sources xmlns:b="http://schemas.openxmlformats.org/officeDocument/2006/bibliography" xmlns="http://schemas.openxmlformats.org/officeDocument/2006/bibliography" SelectedStyle="\APASixthEditionOfficeOnline.xsl" StyleName="APA" Version="6"/>
-</file>
-
-<file path=customXml/item2.xml><?xml version="1.0" encoding="utf-8"?>
 <s:customData xmlns="http://www.wps.cn/officeDocument/2013/wpsCustomData" xmlns:s="http://www.wps.cn/officeDocument/2013/wpsCustomData">
   <customSectProps>
     <customSectPr/>
@@ -9704,18 +10374,22 @@
 </s:customData>
 </file>
 
+<file path=customXml/item2.xml><?xml version="1.0" encoding="utf-8"?>
+<b:Sources xmlns:b="http://schemas.openxmlformats.org/officeDocument/2006/bibliography" xmlns="http://schemas.openxmlformats.org/officeDocument/2006/bibliography" SelectedStyle="\APASixthEditionOfficeOnline.xsl" StyleName="APA" Version="6"/>
+</file>
+
 <file path=customXml/itemProps1.xml><?xml version="1.0" encoding="utf-8"?>
+<ds:datastoreItem xmlns:ds="http://schemas.openxmlformats.org/officeDocument/2006/customXml" ds:itemID="{B1977F7D-205B-4081-913C-38D41E755F92}">
+  <ds:schemaRefs>
+    <ds:schemaRef ds:uri="http://www.wps.cn/officeDocument/2013/wpsCustomData"/>
+  </ds:schemaRefs>
+</ds:datastoreItem>
+</file>
+
+<file path=customXml/itemProps2.xml><?xml version="1.0" encoding="utf-8"?>
 <ds:datastoreItem xmlns:ds="http://schemas.openxmlformats.org/officeDocument/2006/customXml" ds:itemID="{11CE9064-0015-4BAE-B6CA-558D0B4F112B}">
   <ds:schemaRefs>
     <ds:schemaRef ds:uri="http://schemas.openxmlformats.org/officeDocument/2006/bibliography"/>
   </ds:schemaRefs>
 </ds:datastoreItem>
-</file>
-
-<file path=customXml/itemProps2.xml><?xml version="1.0" encoding="utf-8"?>
-<ds:datastoreItem xmlns:ds="http://schemas.openxmlformats.org/officeDocument/2006/customXml" ds:itemID="{B1977F7D-205B-4081-913C-38D41E755F92}">
-  <ds:schemaRefs>
-    <ds:schemaRef ds:uri="http://www.wps.cn/officeDocument/2013/wpsCustomData"/>
-  </ds:schemaRefs>
-</ds:datastoreItem>
 </file>
</xml_diff>

<commit_message>
added graph section 4.2
</commit_message>
<xml_diff>
--- a/Resturant_Report.docx
+++ b/Resturant_Report.docx
@@ -123,33 +123,7 @@
           <w:sz w:val="36"/>
           <w:szCs w:val="36"/>
         </w:rPr>
-        <w:t>[</w:t>
-      </w:r>
-      <w:proofErr w:type="spellStart"/>
-      <w:r>
-        <w:rPr>
-          <w:b/>
-          <w:bCs/>
-          <w:i/>
-          <w:iCs/>
-          <w:color w:val="000000" w:themeColor="text1"/>
-          <w:sz w:val="36"/>
-          <w:szCs w:val="36"/>
-        </w:rPr>
-        <w:t>Reastaurant</w:t>
-      </w:r>
-      <w:proofErr w:type="spellEnd"/>
-      <w:r>
-        <w:rPr>
-          <w:b/>
-          <w:bCs/>
-          <w:i/>
-          <w:iCs/>
-          <w:color w:val="000000" w:themeColor="text1"/>
-          <w:sz w:val="36"/>
-          <w:szCs w:val="36"/>
-        </w:rPr>
-        <w:t xml:space="preserve"> name] Database Design</w:t>
+        <w:t>[Reastaurant name] Database Design</w:t>
       </w:r>
     </w:p>
     <w:p>
@@ -254,7 +228,6 @@
               </w:rPr>
               <w:t>1. [</w:t>
             </w:r>
-            <w:proofErr w:type="spellStart"/>
             <w:r>
               <w:rPr>
                 <w:i/>
@@ -263,10 +236,11 @@
                 <w:sz w:val="22"/>
                 <w:szCs w:val="22"/>
               </w:rPr>
-              <w:t>Abdennouri</w:t>
-            </w:r>
-            <w:proofErr w:type="spellEnd"/>
-            <w:r>
+              <w:t>Abdennouri Mouatez Billah — 25016832]</w:t>
+            </w:r>
+          </w:p>
+          <w:p>
+            <w:pPr>
               <w:rPr>
                 <w:i/>
                 <w:iCs/>
@@ -274,9 +248,7 @@
                 <w:sz w:val="22"/>
                 <w:szCs w:val="22"/>
               </w:rPr>
-              <w:t xml:space="preserve"> </w:t>
-            </w:r>
-            <w:proofErr w:type="spellStart"/>
+            </w:pPr>
             <w:r>
               <w:rPr>
                 <w:i/>
@@ -285,9 +257,8 @@
                 <w:sz w:val="22"/>
                 <w:szCs w:val="22"/>
               </w:rPr>
-              <w:t>Mouatez</w:t>
-            </w:r>
-            <w:proofErr w:type="spellEnd"/>
+              <w:t>2. [</w:t>
+            </w:r>
             <w:r>
               <w:rPr>
                 <w:i/>
@@ -296,11 +267,9 @@
                 <w:sz w:val="22"/>
                 <w:szCs w:val="22"/>
               </w:rPr>
-              <w:t xml:space="preserve"> Billah — 25016832]</w:t>
-            </w:r>
-          </w:p>
-          <w:p>
-            <w:pPr>
+              <w:t>Giwa Marvellous - 25016834</w:t>
+            </w:r>
+            <w:r>
               <w:rPr>
                 <w:i/>
                 <w:iCs/>
@@ -308,6 +277,14 @@
                 <w:sz w:val="22"/>
                 <w:szCs w:val="22"/>
               </w:rPr>
+              <w:t xml:space="preserve">] </w:t>
+            </w:r>
+          </w:p>
+          <w:p>
+            <w:pPr>
+              <w:rPr>
+                <w:color w:val="000000" w:themeColor="text1"/>
+              </w:rPr>
             </w:pPr>
             <w:r>
               <w:rPr>
@@ -317,7 +294,7 @@
                 <w:sz w:val="22"/>
                 <w:szCs w:val="22"/>
               </w:rPr>
-              <w:t>2. [</w:t>
+              <w:t>3. [</w:t>
             </w:r>
             <w:r>
               <w:rPr>
@@ -327,66 +304,7 @@
                 <w:sz w:val="22"/>
                 <w:szCs w:val="22"/>
               </w:rPr>
-              <w:t>Giwa Marvellous - 25016834</w:t>
-            </w:r>
-            <w:r>
-              <w:rPr>
-                <w:i/>
-                <w:iCs/>
-                <w:color w:val="000000" w:themeColor="text1"/>
-                <w:sz w:val="22"/>
-                <w:szCs w:val="22"/>
-              </w:rPr>
-              <w:t xml:space="preserve">] </w:t>
-            </w:r>
-          </w:p>
-          <w:p>
-            <w:pPr>
-              <w:rPr>
-                <w:color w:val="000000" w:themeColor="text1"/>
-              </w:rPr>
-            </w:pPr>
-            <w:r>
-              <w:rPr>
-                <w:i/>
-                <w:iCs/>
-                <w:color w:val="000000" w:themeColor="text1"/>
-                <w:sz w:val="22"/>
-                <w:szCs w:val="22"/>
-              </w:rPr>
-              <w:t>3. [</w:t>
-            </w:r>
-            <w:r>
-              <w:rPr>
-                <w:i/>
-                <w:iCs/>
-                <w:color w:val="000000" w:themeColor="text1"/>
-                <w:sz w:val="22"/>
-                <w:szCs w:val="22"/>
-              </w:rPr>
-              <w:t xml:space="preserve">Rupesh </w:t>
-            </w:r>
-            <w:proofErr w:type="spellStart"/>
-            <w:r>
-              <w:rPr>
-                <w:i/>
-                <w:iCs/>
-                <w:color w:val="000000" w:themeColor="text1"/>
-                <w:sz w:val="22"/>
-                <w:szCs w:val="22"/>
-              </w:rPr>
-              <w:t>kumar</w:t>
-            </w:r>
-            <w:proofErr w:type="spellEnd"/>
-            <w:r>
-              <w:rPr>
-                <w:i/>
-                <w:iCs/>
-                <w:color w:val="000000" w:themeColor="text1"/>
-                <w:sz w:val="22"/>
-                <w:szCs w:val="22"/>
-              </w:rPr>
-              <w:t xml:space="preserve"> Sah - 25016818</w:t>
+              <w:t>Rupesh kumar Sah - 25016818</w:t>
             </w:r>
             <w:r>
               <w:rPr>
@@ -1088,6 +1006,7 @@
         <w:alias w:val="Table of Contents"/>
         <w:id w:val="1598983745"/>
       </w:sdtPr>
+      <w:sdtEndPr/>
       <w:sdtContent>
         <w:p>
           <w:pPr>
@@ -3835,21 +3754,7 @@
         <w:rPr>
           <w:color w:val="000000" w:themeColor="text1"/>
         </w:rPr>
-        <w:t>An organized collection of objects that can be represented in set-builder form or roster form. In set theory, the operations of the sets are carried when two or more sets combine to form a single set under some of the given conditions. The basic operations on sets are: Union of sets, Intersection of sets, A complement of a set, Cartesian product of sets and Set difference. (</w:t>
-      </w:r>
-      <w:proofErr w:type="spellStart"/>
-      <w:r>
-        <w:rPr>
-          <w:color w:val="000000" w:themeColor="text1"/>
-        </w:rPr>
-        <w:t>byjus</w:t>
-      </w:r>
-      <w:proofErr w:type="spellEnd"/>
-      <w:r>
-        <w:rPr>
-          <w:color w:val="000000" w:themeColor="text1"/>
-        </w:rPr>
-        <w:t>, 2019)</w:t>
+        <w:t>An organized collection of objects that can be represented in set-builder form or roster form. In set theory, the operations of the sets are carried when two or more sets combine to form a single set under some of the given conditions. The basic operations on sets are: Union of sets, Intersection of sets, A complement of a set, Cartesian product of sets and Set difference. (byjus, 2019)</w:t>
       </w:r>
     </w:p>
     <w:p>
@@ -3882,21 +3787,7 @@
           <w:color w:val="000000" w:themeColor="text1"/>
         </w:rPr>
         <w:lastRenderedPageBreak/>
-        <w:t xml:space="preserve">Sets relate to </w:t>
-      </w:r>
-      <w:proofErr w:type="spellStart"/>
-      <w:r>
-        <w:rPr>
-          <w:color w:val="000000" w:themeColor="text1"/>
-        </w:rPr>
-        <w:t>sql</w:t>
-      </w:r>
-      <w:proofErr w:type="spellEnd"/>
-      <w:r>
-        <w:rPr>
-          <w:color w:val="000000" w:themeColor="text1"/>
-        </w:rPr>
-        <w:t xml:space="preserve"> when making queries to show specific data where tables are combined (JOIN ON) which is the Union of sets for example and when provided with a certain a parameter to filter more than we get into Intersection of sets (WHERE, GROUP BY…etc)</w:t>
+        <w:t>Sets relate to sql when making queries to show specific data where tables are combined (JOIN ON) which is the Union of sets for example and when provided with a certain a parameter to filter more than we get into Intersection of sets (WHERE, GROUP BY…etc)</w:t>
       </w:r>
     </w:p>
     <w:p>
@@ -4034,21 +3925,7 @@
         <w:rPr>
           <w:color w:val="000000" w:themeColor="text1"/>
         </w:rPr>
-        <w:t xml:space="preserve">As we perform operations on sets to make queries, we basically applying relational algebra, and apart from the operations used before, SELECT was also used to print </w:t>
-      </w:r>
-      <w:proofErr w:type="spellStart"/>
-      <w:r>
-        <w:rPr>
-          <w:color w:val="000000" w:themeColor="text1"/>
-        </w:rPr>
-        <w:t>our</w:t>
-      </w:r>
-      <w:proofErr w:type="spellEnd"/>
-      <w:r>
-        <w:rPr>
-          <w:color w:val="000000" w:themeColor="text1"/>
-        </w:rPr>
-        <w:t xml:space="preserve"> the results for example and sorting operations (like DESC)</w:t>
+        <w:t>As we perform operations on sets to make queries, we basically applying relational algebra, and apart from the operations used before, SELECT was also used to print our the results for example and sorting operations (like DESC)</w:t>
       </w:r>
     </w:p>
     <w:p>
@@ -4108,21 +3985,7 @@
         <w:rPr>
           <w:color w:val="000000" w:themeColor="text1"/>
         </w:rPr>
-        <w:t>Predicate logic, also called first-order logic, is an enrichment of propositional logic to include predicates, individuals and quantifiers, and is widely accepted as the standard language of mathematics. Axiomatic predicate logic was established by Gottlob Frege in the late 19th century, who formalized the notion of quantified variable. (</w:t>
-      </w:r>
-      <w:proofErr w:type="spellStart"/>
-      <w:r>
-        <w:rPr>
-          <w:color w:val="000000" w:themeColor="text1"/>
-        </w:rPr>
-        <w:t>worldscientific</w:t>
-      </w:r>
-      <w:proofErr w:type="spellEnd"/>
-      <w:r>
-        <w:rPr>
-          <w:color w:val="000000" w:themeColor="text1"/>
-        </w:rPr>
-        <w:t>, 2022)</w:t>
+        <w:t>Predicate logic, also called first-order logic, is an enrichment of propositional logic to include predicates, individuals and quantifiers, and is widely accepted as the standard language of mathematics. Axiomatic predicate logic was established by Gottlob Frege in the late 19th century, who formalized the notion of quantified variable. (worldscientific, 2022)</w:t>
       </w:r>
     </w:p>
     <w:p>
@@ -4213,21 +4076,7 @@
           <w:color w:val="000000" w:themeColor="text1"/>
         </w:rPr>
         <w:br/>
-        <w:t xml:space="preserve">Another example is the functional dependencies (normalization) for example </w:t>
-      </w:r>
-      <w:proofErr w:type="spellStart"/>
-      <w:r>
-        <w:rPr>
-          <w:color w:val="000000" w:themeColor="text1"/>
-        </w:rPr>
-        <w:t>dish_id</w:t>
-      </w:r>
-      <w:proofErr w:type="spellEnd"/>
-      <w:r>
-        <w:rPr>
-          <w:color w:val="000000" w:themeColor="text1"/>
-        </w:rPr>
-        <w:t xml:space="preserve">  </w:t>
+        <w:t xml:space="preserve">Another example is the functional dependencies (normalization) for example dish_id  </w:t>
       </w:r>
       <w:r>
         <w:rPr>
@@ -4239,49 +4088,7 @@
         <w:rPr>
           <w:color w:val="000000" w:themeColor="text1"/>
         </w:rPr>
-        <w:t xml:space="preserve"> </w:t>
-      </w:r>
-      <w:proofErr w:type="spellStart"/>
-      <w:r>
-        <w:rPr>
-          <w:color w:val="000000" w:themeColor="text1"/>
-        </w:rPr>
-        <w:t>dishName</w:t>
-      </w:r>
-      <w:proofErr w:type="spellEnd"/>
-      <w:r>
-        <w:rPr>
-          <w:color w:val="000000" w:themeColor="text1"/>
-        </w:rPr>
-        <w:t xml:space="preserve">, which means that the </w:t>
-      </w:r>
-      <w:proofErr w:type="spellStart"/>
-      <w:r>
-        <w:rPr>
-          <w:color w:val="000000" w:themeColor="text1"/>
-        </w:rPr>
-        <w:t>dish_id</w:t>
-      </w:r>
-      <w:proofErr w:type="spellEnd"/>
-      <w:r>
-        <w:rPr>
-          <w:color w:val="000000" w:themeColor="text1"/>
-        </w:rPr>
-        <w:t xml:space="preserve"> determines the </w:t>
-      </w:r>
-      <w:proofErr w:type="spellStart"/>
-      <w:r>
-        <w:rPr>
-          <w:color w:val="000000" w:themeColor="text1"/>
-        </w:rPr>
-        <w:t>dishName</w:t>
-      </w:r>
-      <w:proofErr w:type="spellEnd"/>
-      <w:r>
-        <w:rPr>
-          <w:color w:val="000000" w:themeColor="text1"/>
-        </w:rPr>
-        <w:t>.</w:t>
+        <w:t xml:space="preserve"> dishName, which means that the dish_id determines the dishName.</w:t>
       </w:r>
     </w:p>
     <w:p>
@@ -4303,21 +4110,7 @@
         <w:rPr>
           <w:color w:val="000000" w:themeColor="text1"/>
         </w:rPr>
-        <w:t>To construct this model, graph theory was also implemented to decide the relationship between the tables (</w:t>
-      </w:r>
-      <w:proofErr w:type="spellStart"/>
-      <w:r>
-        <w:rPr>
-          <w:color w:val="000000" w:themeColor="text1"/>
-        </w:rPr>
-        <w:t>entites</w:t>
-      </w:r>
-      <w:proofErr w:type="spellEnd"/>
-      <w:r>
-        <w:rPr>
-          <w:color w:val="000000" w:themeColor="text1"/>
-        </w:rPr>
-        <w:t>) through the primary keys and foreign keys.</w:t>
+        <w:t>To construct this model, graph theory was also implemented to decide the relationship between the tables (entites) through the primary keys and foreign keys.</w:t>
       </w:r>
     </w:p>
     <w:p>
@@ -4420,19 +4213,11 @@
         </w:rPr>
         <w:t xml:space="preserve">. </w:t>
       </w:r>
-      <w:proofErr w:type="spellStart"/>
-      <w:r>
-        <w:rPr>
-          <w:color w:val="000000" w:themeColor="text1"/>
-        </w:rPr>
-        <w:t>Github</w:t>
-      </w:r>
-      <w:proofErr w:type="spellEnd"/>
-      <w:r>
-        <w:rPr>
-          <w:color w:val="000000" w:themeColor="text1"/>
-        </w:rPr>
-        <w:t xml:space="preserve"> to track the work.</w:t>
+      <w:r>
+        <w:rPr>
+          <w:color w:val="000000" w:themeColor="text1"/>
+        </w:rPr>
+        <w:t>Github to track the work.</w:t>
       </w:r>
     </w:p>
     <w:p>
@@ -4481,10 +4266,41 @@
     </w:p>
     <w:p>
       <w:r>
-        <w:t>#</w:t>
-      </w:r>
-      <w:r>
-        <w:t>A GRAPH WILL BE ADDED USING DRAW.IO SHOWCASING THE DATABASE DESIGN</w:t>
+        <w:drawing>
+          <wp:inline distT="0" distB="0" distL="0" distR="0" wp14:anchorId="75EBD0DB" wp14:editId="24FF00C3">
+            <wp:extent cx="5731510" cy="3575685"/>
+            <wp:effectExtent l="0" t="0" r="2540" b="5715"/>
+            <wp:docPr id="700363833" name="Picture 1"/>
+            <wp:cNvGraphicFramePr>
+              <a:graphicFrameLocks xmlns:a="http://schemas.openxmlformats.org/drawingml/2006/main" noChangeAspect="1"/>
+            </wp:cNvGraphicFramePr>
+            <a:graphic xmlns:a="http://schemas.openxmlformats.org/drawingml/2006/main">
+              <a:graphicData uri="http://schemas.openxmlformats.org/drawingml/2006/picture">
+                <pic:pic xmlns:pic="http://schemas.openxmlformats.org/drawingml/2006/picture">
+                  <pic:nvPicPr>
+                    <pic:cNvPr id="700363833" name=""/>
+                    <pic:cNvPicPr/>
+                  </pic:nvPicPr>
+                  <pic:blipFill>
+                    <a:blip r:embed="rId12"/>
+                    <a:stretch>
+                      <a:fillRect/>
+                    </a:stretch>
+                  </pic:blipFill>
+                  <pic:spPr>
+                    <a:xfrm>
+                      <a:off x="0" y="0"/>
+                      <a:ext cx="5731510" cy="3575685"/>
+                    </a:xfrm>
+                    <a:prstGeom prst="rect">
+                      <a:avLst/>
+                    </a:prstGeom>
+                  </pic:spPr>
+                </pic:pic>
+              </a:graphicData>
+            </a:graphic>
+          </wp:inline>
+        </w:drawing>
       </w:r>
     </w:p>
     <w:p>
@@ -4663,7 +4479,6 @@
         </w:rPr>
         <w:t xml:space="preserve">, </w:t>
       </w:r>
-      <w:proofErr w:type="spellStart"/>
       <w:r>
         <w:rPr>
           <w:color w:val="000000" w:themeColor="text1"/>
@@ -4678,29 +4493,12 @@
         </w:rPr>
         <w:t>num</w:t>
       </w:r>
-      <w:proofErr w:type="spellEnd"/>
       <w:r>
         <w:rPr>
           <w:color w:val="000000" w:themeColor="text1"/>
           <w:lang w:val="en-US"/>
         </w:rPr>
-        <w:t xml:space="preserve"> (</w:t>
-      </w:r>
-      <w:proofErr w:type="spellStart"/>
-      <w:r>
-        <w:rPr>
-          <w:color w:val="000000" w:themeColor="text1"/>
-          <w:lang w:val="en-US"/>
-        </w:rPr>
-        <w:t>bigint</w:t>
-      </w:r>
-      <w:proofErr w:type="spellEnd"/>
-      <w:r>
-        <w:rPr>
-          <w:color w:val="000000" w:themeColor="text1"/>
-          <w:lang w:val="en-US"/>
-        </w:rPr>
-        <w:t>)</w:t>
+        <w:t xml:space="preserve"> (bigint)</w:t>
       </w:r>
       <w:r>
         <w:rPr>
@@ -4757,6 +4555,7 @@
           <w:u w:val="single"/>
           <w:lang w:val="en-US"/>
         </w:rPr>
+        <w:lastRenderedPageBreak/>
         <w:t>Menu</w:t>
       </w:r>
       <w:r>
@@ -4779,7 +4578,6 @@
           <w:lang w:val="en-US"/>
         </w:rPr>
       </w:pPr>
-      <w:proofErr w:type="spellStart"/>
       <w:r>
         <w:rPr>
           <w:color w:val="000000" w:themeColor="text1"/>
@@ -4792,110 +4590,77 @@
           <w:color w:val="000000" w:themeColor="text1"/>
           <w:lang w:val="en-US"/>
         </w:rPr>
-        <w:t>ID</w:t>
-      </w:r>
-      <w:proofErr w:type="spellEnd"/>
+        <w:t>ID (int, primary key)</w:t>
+      </w:r>
       <w:r>
         <w:rPr>
           <w:color w:val="000000" w:themeColor="text1"/>
           <w:lang w:val="en-US"/>
         </w:rPr>
-        <w:t xml:space="preserve"> (int, primary key)</w:t>
+        <w:t>, dish</w:t>
       </w:r>
       <w:r>
         <w:rPr>
           <w:color w:val="000000" w:themeColor="text1"/>
           <w:lang w:val="en-US"/>
         </w:rPr>
-        <w:t xml:space="preserve">, </w:t>
-      </w:r>
-      <w:proofErr w:type="spellStart"/>
+        <w:t>N</w:t>
+      </w:r>
       <w:r>
         <w:rPr>
           <w:color w:val="000000" w:themeColor="text1"/>
           <w:lang w:val="en-US"/>
         </w:rPr>
-        <w:t>dish</w:t>
+        <w:t>ame</w:t>
       </w:r>
       <w:r>
         <w:rPr>
           <w:color w:val="000000" w:themeColor="text1"/>
           <w:lang w:val="en-US"/>
         </w:rPr>
-        <w:t>N</w:t>
+        <w:t xml:space="preserve"> (varchar)</w:t>
       </w:r>
       <w:r>
         <w:rPr>
           <w:color w:val="000000" w:themeColor="text1"/>
           <w:lang w:val="en-US"/>
         </w:rPr>
-        <w:t>ame</w:t>
-      </w:r>
-      <w:proofErr w:type="spellEnd"/>
+        <w:t>, description</w:t>
+      </w:r>
       <w:r>
         <w:rPr>
           <w:color w:val="000000" w:themeColor="text1"/>
           <w:lang w:val="en-US"/>
         </w:rPr>
-        <w:t xml:space="preserve"> (varchar)</w:t>
+        <w:t xml:space="preserve"> (text)</w:t>
       </w:r>
       <w:r>
         <w:rPr>
           <w:color w:val="000000" w:themeColor="text1"/>
           <w:lang w:val="en-US"/>
         </w:rPr>
-        <w:t>, description</w:t>
+        <w:t>, price</w:t>
       </w:r>
       <w:r>
         <w:rPr>
           <w:color w:val="000000" w:themeColor="text1"/>
           <w:lang w:val="en-US"/>
         </w:rPr>
-        <w:t xml:space="preserve"> (text)</w:t>
+        <w:t xml:space="preserve"> (float)</w:t>
       </w:r>
       <w:r>
         <w:rPr>
           <w:color w:val="000000" w:themeColor="text1"/>
           <w:lang w:val="en-US"/>
         </w:rPr>
-        <w:t>, price</w:t>
+        <w:t xml:space="preserve"> and category</w:t>
       </w:r>
       <w:r>
         <w:rPr>
           <w:color w:val="000000" w:themeColor="text1"/>
           <w:lang w:val="en-US"/>
         </w:rPr>
-        <w:t xml:space="preserve"> (float)</w:t>
-      </w:r>
-      <w:r>
-        <w:rPr>
-          <w:color w:val="000000" w:themeColor="text1"/>
-          <w:lang w:val="en-US"/>
-        </w:rPr>
-        <w:t xml:space="preserve"> and category</w:t>
-      </w:r>
-      <w:r>
-        <w:rPr>
-          <w:color w:val="000000" w:themeColor="text1"/>
-          <w:lang w:val="en-US"/>
-        </w:rPr>
-        <w:t xml:space="preserve"> (</w:t>
-      </w:r>
-      <w:proofErr w:type="spellStart"/>
-      <w:r>
-        <w:rPr>
-          <w:color w:val="000000" w:themeColor="text1"/>
-          <w:lang w:val="en-US"/>
-        </w:rPr>
-        <w:t>enum</w:t>
-      </w:r>
-      <w:proofErr w:type="spellEnd"/>
-      <w:r>
-        <w:rPr>
-          <w:color w:val="000000" w:themeColor="text1"/>
-          <w:lang w:val="en-US"/>
-        </w:rPr>
-        <w:t>)</w:t>
+        <w:t xml:space="preserve"> (enum)</w:t>
       </w:r>
       <w:r>
         <w:rPr>
@@ -4960,7 +4725,6 @@
           <w:lang w:val="en-US"/>
         </w:rPr>
       </w:pPr>
-      <w:proofErr w:type="spellStart"/>
       <w:r>
         <w:rPr>
           <w:color w:val="000000" w:themeColor="text1"/>
@@ -4973,89 +4737,104 @@
           <w:color w:val="000000" w:themeColor="text1"/>
           <w:lang w:val="en-US"/>
         </w:rPr>
-        <w:t>ID</w:t>
-      </w:r>
-      <w:proofErr w:type="spellEnd"/>
+        <w:t>ID (int, primary key)</w:t>
+      </w:r>
       <w:r>
         <w:rPr>
           <w:color w:val="000000" w:themeColor="text1"/>
           <w:lang w:val="en-US"/>
         </w:rPr>
-        <w:t xml:space="preserve"> (int, primary key)</w:t>
+        <w:t>, user_</w:t>
       </w:r>
       <w:r>
         <w:rPr>
           <w:color w:val="000000" w:themeColor="text1"/>
           <w:lang w:val="en-US"/>
         </w:rPr>
-        <w:t xml:space="preserve">, </w:t>
-      </w:r>
-      <w:proofErr w:type="spellStart"/>
+        <w:t>ID (int, foreign key)</w:t>
+      </w:r>
       <w:r>
         <w:rPr>
           <w:color w:val="000000" w:themeColor="text1"/>
           <w:lang w:val="en-US"/>
         </w:rPr>
-        <w:t>user_</w:t>
+        <w:t>, order_date</w:t>
       </w:r>
       <w:r>
         <w:rPr>
           <w:color w:val="000000" w:themeColor="text1"/>
           <w:lang w:val="en-US"/>
         </w:rPr>
-        <w:t>ID</w:t>
-      </w:r>
-      <w:proofErr w:type="spellEnd"/>
+        <w:t xml:space="preserve"> (date)</w:t>
+      </w:r>
       <w:r>
         <w:rPr>
           <w:color w:val="000000" w:themeColor="text1"/>
           <w:lang w:val="en-US"/>
         </w:rPr>
-        <w:t xml:space="preserve"> (int, foreign key)</w:t>
+        <w:t>, delivery</w:t>
       </w:r>
       <w:r>
         <w:rPr>
           <w:color w:val="000000" w:themeColor="text1"/>
           <w:lang w:val="en-US"/>
         </w:rPr>
-        <w:t xml:space="preserve">, </w:t>
-      </w:r>
-      <w:proofErr w:type="spellStart"/>
+        <w:t>_</w:t>
+      </w:r>
       <w:r>
         <w:rPr>
           <w:color w:val="000000" w:themeColor="text1"/>
           <w:lang w:val="en-US"/>
         </w:rPr>
-        <w:t>order_date</w:t>
-      </w:r>
-      <w:proofErr w:type="spellEnd"/>
+        <w:t>option</w:t>
+      </w:r>
       <w:r>
         <w:rPr>
           <w:color w:val="000000" w:themeColor="text1"/>
           <w:lang w:val="en-US"/>
         </w:rPr>
-        <w:t xml:space="preserve"> (date)</w:t>
+        <w:t xml:space="preserve"> (enum)</w:t>
       </w:r>
       <w:r>
         <w:rPr>
           <w:color w:val="000000" w:themeColor="text1"/>
           <w:lang w:val="en-US"/>
         </w:rPr>
-        <w:t xml:space="preserve">, </w:t>
-      </w:r>
-      <w:proofErr w:type="spellStart"/>
+        <w:t>, delivery</w:t>
+      </w:r>
       <w:r>
         <w:rPr>
           <w:color w:val="000000" w:themeColor="text1"/>
           <w:lang w:val="en-US"/>
         </w:rPr>
-        <w:t>delivery</w:t>
+        <w:t>_</w:t>
       </w:r>
       <w:r>
         <w:rPr>
           <w:color w:val="000000" w:themeColor="text1"/>
           <w:lang w:val="en-US"/>
         </w:rPr>
+        <w:t>address</w:t>
+      </w:r>
+      <w:r>
+        <w:rPr>
+          <w:color w:val="000000" w:themeColor="text1"/>
+          <w:lang w:val="en-US"/>
+        </w:rPr>
+        <w:t xml:space="preserve"> (varchar)</w:t>
+      </w:r>
+      <w:r>
+        <w:rPr>
+          <w:color w:val="000000" w:themeColor="text1"/>
+          <w:lang w:val="en-US"/>
+        </w:rPr>
+        <w:t xml:space="preserve"> and order</w:t>
+      </w:r>
+      <w:r>
+        <w:rPr>
+          <w:color w:val="000000" w:themeColor="text1"/>
+          <w:lang w:val="en-US"/>
+        </w:rPr>
         <w:t>_</w:t>
       </w:r>
       <w:r>
@@ -5063,121 +4842,14 @@
           <w:color w:val="000000" w:themeColor="text1"/>
           <w:lang w:val="en-US"/>
         </w:rPr>
-        <w:t>option</w:t>
-      </w:r>
-      <w:proofErr w:type="spellEnd"/>
+        <w:t>status</w:t>
+      </w:r>
       <w:r>
         <w:rPr>
           <w:color w:val="000000" w:themeColor="text1"/>
           <w:lang w:val="en-US"/>
         </w:rPr>
-        <w:t xml:space="preserve"> (</w:t>
-      </w:r>
-      <w:proofErr w:type="spellStart"/>
-      <w:r>
-        <w:rPr>
-          <w:color w:val="000000" w:themeColor="text1"/>
-          <w:lang w:val="en-US"/>
-        </w:rPr>
-        <w:t>enum</w:t>
-      </w:r>
-      <w:proofErr w:type="spellEnd"/>
-      <w:r>
-        <w:rPr>
-          <w:color w:val="000000" w:themeColor="text1"/>
-          <w:lang w:val="en-US"/>
-        </w:rPr>
-        <w:t>)</w:t>
-      </w:r>
-      <w:r>
-        <w:rPr>
-          <w:color w:val="000000" w:themeColor="text1"/>
-          <w:lang w:val="en-US"/>
-        </w:rPr>
-        <w:t xml:space="preserve">, </w:t>
-      </w:r>
-      <w:proofErr w:type="spellStart"/>
-      <w:r>
-        <w:rPr>
-          <w:color w:val="000000" w:themeColor="text1"/>
-          <w:lang w:val="en-US"/>
-        </w:rPr>
-        <w:t>delivery</w:t>
-      </w:r>
-      <w:r>
-        <w:rPr>
-          <w:color w:val="000000" w:themeColor="text1"/>
-          <w:lang w:val="en-US"/>
-        </w:rPr>
-        <w:t>_</w:t>
-      </w:r>
-      <w:r>
-        <w:rPr>
-          <w:color w:val="000000" w:themeColor="text1"/>
-          <w:lang w:val="en-US"/>
-        </w:rPr>
-        <w:t>address</w:t>
-      </w:r>
-      <w:proofErr w:type="spellEnd"/>
-      <w:r>
-        <w:rPr>
-          <w:color w:val="000000" w:themeColor="text1"/>
-          <w:lang w:val="en-US"/>
-        </w:rPr>
-        <w:t xml:space="preserve"> (varchar)</w:t>
-      </w:r>
-      <w:r>
-        <w:rPr>
-          <w:color w:val="000000" w:themeColor="text1"/>
-          <w:lang w:val="en-US"/>
-        </w:rPr>
-        <w:t xml:space="preserve"> and </w:t>
-      </w:r>
-      <w:proofErr w:type="spellStart"/>
-      <w:r>
-        <w:rPr>
-          <w:color w:val="000000" w:themeColor="text1"/>
-          <w:lang w:val="en-US"/>
-        </w:rPr>
-        <w:t>order</w:t>
-      </w:r>
-      <w:r>
-        <w:rPr>
-          <w:color w:val="000000" w:themeColor="text1"/>
-          <w:lang w:val="en-US"/>
-        </w:rPr>
-        <w:t>_</w:t>
-      </w:r>
-      <w:r>
-        <w:rPr>
-          <w:color w:val="000000" w:themeColor="text1"/>
-          <w:lang w:val="en-US"/>
-        </w:rPr>
-        <w:t>status</w:t>
-      </w:r>
-      <w:proofErr w:type="spellEnd"/>
-      <w:r>
-        <w:rPr>
-          <w:color w:val="000000" w:themeColor="text1"/>
-          <w:lang w:val="en-US"/>
-        </w:rPr>
-        <w:t xml:space="preserve"> (</w:t>
-      </w:r>
-      <w:proofErr w:type="spellStart"/>
-      <w:r>
-        <w:rPr>
-          <w:color w:val="000000" w:themeColor="text1"/>
-          <w:lang w:val="en-US"/>
-        </w:rPr>
-        <w:t>enum</w:t>
-      </w:r>
-      <w:proofErr w:type="spellEnd"/>
-      <w:r>
-        <w:rPr>
-          <w:color w:val="000000" w:themeColor="text1"/>
-          <w:lang w:val="en-US"/>
-        </w:rPr>
-        <w:t>)</w:t>
+        <w:t xml:space="preserve"> (enum)</w:t>
       </w:r>
       <w:r>
         <w:rPr>
@@ -5242,76 +4914,26 @@
           <w:lang w:val="en-US"/>
         </w:rPr>
       </w:pPr>
-      <w:proofErr w:type="spellStart"/>
       <w:r>
         <w:rPr>
           <w:color w:val="000000" w:themeColor="text1"/>
           <w:lang w:val="en-US"/>
         </w:rPr>
-        <w:t>orderDetails_ID</w:t>
-      </w:r>
-      <w:proofErr w:type="spellEnd"/>
+        <w:t xml:space="preserve">orderDetails_ID(int, primary key), dish_ID (int, foreign key), </w:t>
+      </w:r>
       <w:r>
         <w:rPr>
           <w:color w:val="000000" w:themeColor="text1"/>
           <w:lang w:val="en-US"/>
         </w:rPr>
-        <w:t xml:space="preserve">(int, primary key), </w:t>
-      </w:r>
-      <w:proofErr w:type="spellStart"/>
+        <w:t>o</w:t>
+      </w:r>
       <w:r>
         <w:rPr>
           <w:color w:val="000000" w:themeColor="text1"/>
           <w:lang w:val="en-US"/>
         </w:rPr>
-        <w:t>dish_ID</w:t>
-      </w:r>
-      <w:proofErr w:type="spellEnd"/>
-      <w:r>
-        <w:rPr>
-          <w:color w:val="000000" w:themeColor="text1"/>
-          <w:lang w:val="en-US"/>
-        </w:rPr>
-        <w:t xml:space="preserve"> (int, foreign key), </w:t>
-      </w:r>
-      <w:proofErr w:type="spellStart"/>
-      <w:r>
-        <w:rPr>
-          <w:color w:val="000000" w:themeColor="text1"/>
-          <w:lang w:val="en-US"/>
-        </w:rPr>
-        <w:t>o</w:t>
-      </w:r>
-      <w:r>
-        <w:rPr>
-          <w:color w:val="000000" w:themeColor="text1"/>
-          <w:lang w:val="en-US"/>
-        </w:rPr>
-        <w:t>rder_ID</w:t>
-      </w:r>
-      <w:proofErr w:type="spellEnd"/>
-      <w:r>
-        <w:rPr>
-          <w:color w:val="000000" w:themeColor="text1"/>
-          <w:lang w:val="en-US"/>
-        </w:rPr>
-        <w:t xml:space="preserve"> (int, foreign key), </w:t>
-      </w:r>
-      <w:proofErr w:type="spellStart"/>
-      <w:r>
-        <w:rPr>
-          <w:color w:val="000000" w:themeColor="text1"/>
-          <w:lang w:val="en-US"/>
-        </w:rPr>
-        <w:t>payment_one</w:t>
-      </w:r>
-      <w:proofErr w:type="spellEnd"/>
-      <w:r>
-        <w:rPr>
-          <w:color w:val="000000" w:themeColor="text1"/>
-          <w:lang w:val="en-US"/>
-        </w:rPr>
-        <w:t xml:space="preserve"> (float), quantity (int), and subtotal (float).</w:t>
+        <w:t>rder_ID (int, foreign key), payment_one (float), quantity (int), and subtotal (float).</w:t>
       </w:r>
     </w:p>
     <w:p>
@@ -5369,7 +4991,6 @@
           <w:lang w:val="en-US"/>
         </w:rPr>
       </w:pPr>
-      <w:proofErr w:type="spellStart"/>
       <w:r>
         <w:rPr>
           <w:color w:val="000000" w:themeColor="text1"/>
@@ -5377,7 +4998,6 @@
         </w:rPr>
         <w:t>payment_id</w:t>
       </w:r>
-      <w:proofErr w:type="spellEnd"/>
       <w:r>
         <w:rPr>
           <w:color w:val="000000" w:themeColor="text1"/>
@@ -5390,187 +5010,112 @@
           <w:color w:val="000000" w:themeColor="text1"/>
           <w:lang w:val="en-US"/>
         </w:rPr>
-        <w:t xml:space="preserve">, </w:t>
-      </w:r>
-      <w:proofErr w:type="spellStart"/>
+        <w:t>, user_</w:t>
+      </w:r>
       <w:r>
         <w:rPr>
           <w:color w:val="000000" w:themeColor="text1"/>
           <w:lang w:val="en-US"/>
         </w:rPr>
-        <w:t>user_</w:t>
+        <w:t>ID (int, foreign key)</w:t>
       </w:r>
       <w:r>
         <w:rPr>
           <w:color w:val="000000" w:themeColor="text1"/>
           <w:lang w:val="en-US"/>
         </w:rPr>
-        <w:t>ID</w:t>
-      </w:r>
-      <w:proofErr w:type="spellEnd"/>
+        <w:t>, order_</w:t>
+      </w:r>
       <w:r>
         <w:rPr>
           <w:color w:val="000000" w:themeColor="text1"/>
           <w:lang w:val="en-US"/>
         </w:rPr>
-        <w:t xml:space="preserve"> (int, foreign key)</w:t>
+        <w:t>ID (int, foreign key)</w:t>
       </w:r>
       <w:r>
         <w:rPr>
           <w:color w:val="000000" w:themeColor="text1"/>
           <w:lang w:val="en-US"/>
         </w:rPr>
-        <w:t xml:space="preserve">, </w:t>
-      </w:r>
-      <w:proofErr w:type="spellStart"/>
+        <w:t>, payment_amount</w:t>
+      </w:r>
       <w:r>
         <w:rPr>
           <w:color w:val="000000" w:themeColor="text1"/>
           <w:lang w:val="en-US"/>
         </w:rPr>
-        <w:t>order_</w:t>
+        <w:t xml:space="preserve"> (</w:t>
       </w:r>
       <w:r>
         <w:rPr>
           <w:color w:val="000000" w:themeColor="text1"/>
           <w:lang w:val="en-US"/>
         </w:rPr>
-        <w:t>ID</w:t>
-      </w:r>
-      <w:proofErr w:type="spellEnd"/>
+        <w:t>float</w:t>
+      </w:r>
       <w:r>
         <w:rPr>
           <w:color w:val="000000" w:themeColor="text1"/>
           <w:lang w:val="en-US"/>
         </w:rPr>
-        <w:t xml:space="preserve"> (int, foreign key)</w:t>
+        <w:t>)</w:t>
       </w:r>
       <w:r>
         <w:rPr>
           <w:color w:val="000000" w:themeColor="text1"/>
           <w:lang w:val="en-US"/>
         </w:rPr>
-        <w:t xml:space="preserve">, </w:t>
-      </w:r>
-      <w:proofErr w:type="spellStart"/>
+        <w:t>, payment_</w:t>
+      </w:r>
       <w:r>
         <w:rPr>
           <w:color w:val="000000" w:themeColor="text1"/>
           <w:lang w:val="en-US"/>
         </w:rPr>
-        <w:t>payment_amount</w:t>
-      </w:r>
-      <w:proofErr w:type="spellEnd"/>
+        <w:t>D</w:t>
+      </w:r>
       <w:r>
         <w:rPr>
           <w:color w:val="000000" w:themeColor="text1"/>
           <w:lang w:val="en-US"/>
         </w:rPr>
-        <w:t xml:space="preserve"> (</w:t>
+        <w:t>ate</w:t>
       </w:r>
       <w:r>
         <w:rPr>
           <w:color w:val="000000" w:themeColor="text1"/>
           <w:lang w:val="en-US"/>
         </w:rPr>
-        <w:t>float</w:t>
+        <w:t xml:space="preserve"> (timestamp)</w:t>
       </w:r>
       <w:r>
         <w:rPr>
           <w:color w:val="000000" w:themeColor="text1"/>
           <w:lang w:val="en-US"/>
         </w:rPr>
-        <w:t>)</w:t>
+        <w:t>, and payment_</w:t>
       </w:r>
       <w:r>
         <w:rPr>
           <w:color w:val="000000" w:themeColor="text1"/>
           <w:lang w:val="en-US"/>
         </w:rPr>
-        <w:t xml:space="preserve">, </w:t>
-      </w:r>
-      <w:proofErr w:type="spellStart"/>
+        <w:t>M</w:t>
+      </w:r>
       <w:r>
         <w:rPr>
           <w:color w:val="000000" w:themeColor="text1"/>
           <w:lang w:val="en-US"/>
         </w:rPr>
-        <w:t>payment_</w:t>
+        <w:t>ethod</w:t>
       </w:r>
       <w:r>
         <w:rPr>
           <w:color w:val="000000" w:themeColor="text1"/>
           <w:lang w:val="en-US"/>
         </w:rPr>
-        <w:t>D</w:t>
-      </w:r>
-      <w:r>
-        <w:rPr>
-          <w:color w:val="000000" w:themeColor="text1"/>
-          <w:lang w:val="en-US"/>
-        </w:rPr>
-        <w:t>ate</w:t>
-      </w:r>
-      <w:proofErr w:type="spellEnd"/>
-      <w:r>
-        <w:rPr>
-          <w:color w:val="000000" w:themeColor="text1"/>
-          <w:lang w:val="en-US"/>
-        </w:rPr>
-        <w:t xml:space="preserve"> (timestamp)</w:t>
-      </w:r>
-      <w:r>
-        <w:rPr>
-          <w:color w:val="000000" w:themeColor="text1"/>
-          <w:lang w:val="en-US"/>
-        </w:rPr>
-        <w:t xml:space="preserve">, and </w:t>
-      </w:r>
-      <w:proofErr w:type="spellStart"/>
-      <w:r>
-        <w:rPr>
-          <w:color w:val="000000" w:themeColor="text1"/>
-          <w:lang w:val="en-US"/>
-        </w:rPr>
-        <w:t>payment_</w:t>
-      </w:r>
-      <w:r>
-        <w:rPr>
-          <w:color w:val="000000" w:themeColor="text1"/>
-          <w:lang w:val="en-US"/>
-        </w:rPr>
-        <w:t>M</w:t>
-      </w:r>
-      <w:r>
-        <w:rPr>
-          <w:color w:val="000000" w:themeColor="text1"/>
-          <w:lang w:val="en-US"/>
-        </w:rPr>
-        <w:t>ethod</w:t>
-      </w:r>
-      <w:proofErr w:type="spellEnd"/>
-      <w:r>
-        <w:rPr>
-          <w:color w:val="000000" w:themeColor="text1"/>
-          <w:lang w:val="en-US"/>
-        </w:rPr>
-        <w:t xml:space="preserve"> (</w:t>
-      </w:r>
-      <w:proofErr w:type="spellStart"/>
-      <w:r>
-        <w:rPr>
-          <w:color w:val="000000" w:themeColor="text1"/>
-          <w:lang w:val="en-US"/>
-        </w:rPr>
-        <w:t>enum</w:t>
-      </w:r>
-      <w:proofErr w:type="spellEnd"/>
-      <w:r>
-        <w:rPr>
-          <w:color w:val="000000" w:themeColor="text1"/>
-          <w:lang w:val="en-US"/>
-        </w:rPr>
-        <w:t>)</w:t>
+        <w:t xml:space="preserve"> (enum)</w:t>
       </w:r>
     </w:p>
     <w:p>
@@ -5592,7 +5137,6 @@
         <w:rPr>
           <w:color w:val="000000" w:themeColor="text1"/>
         </w:rPr>
-        <w:lastRenderedPageBreak/>
         <w:t>The preparation of the data was made on</w:t>
       </w:r>
       <w:r>
@@ -5824,7 +5368,7 @@
                           </pic:cNvPicPr>
                         </pic:nvPicPr>
                         <pic:blipFill>
-                          <a:blip r:embed="rId12">
+                          <a:blip r:embed="rId13">
                             <a:extLst>
                               <a:ext uri="{28A0092B-C50C-407E-A947-70E740481C1C}">
                                 <a14:useLocalDpi xmlns:a14="http://schemas.microsoft.com/office/drawing/2010/main" val="0"/>
@@ -5945,7 +5489,7 @@
                   <o:lock v:ext="edit" aspectratio="t"/>
                 </v:shapetype>
                 <v:shape id="Picture 1" o:spid="_x0000_s1027" type="#_x0000_t75" style="position:absolute;width:57315;height:14141;visibility:visible;mso-wrap-style:square" o:gfxdata="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">
-                  <v:imagedata r:id="rId13" o:title=""/>
+                  <v:imagedata r:id="rId14" o:title=""/>
                 </v:shape>
                 <v:shapetype id="_x0000_t202" coordsize="21600,21600" o:spt="202" path="m,l,21600r21600,l21600,xe">
                   <v:stroke joinstyle="miter"/>
@@ -6026,6 +5570,7 @@
           <w:noProof/>
           <w:color w:val="000000" w:themeColor="text1"/>
         </w:rPr>
+        <w:lastRenderedPageBreak/>
         <mc:AlternateContent>
           <mc:Choice Requires="wpg">
             <w:drawing>
@@ -6062,7 +5607,7 @@
                           </pic:cNvPicPr>
                         </pic:nvPicPr>
                         <pic:blipFill>
-                          <a:blip r:embed="rId14">
+                          <a:blip r:embed="rId15">
                             <a:extLst>
                               <a:ext uri="{28A0092B-C50C-407E-A947-70E740481C1C}">
                                 <a14:useLocalDpi xmlns:a14="http://schemas.microsoft.com/office/drawing/2010/main" val="0"/>
@@ -6161,7 +5706,7 @@
             <w:pict>
               <v:group w14:anchorId="23935D95" id="Group 6" o:spid="_x0000_s1029" style="position:absolute;margin-left:0;margin-top:153.7pt;width:438.8pt;height:150.65pt;z-index:251672576" coordsize="55727,19132" o:gfxdata="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">
                 <v:shape id="Picture 1" o:spid="_x0000_s1030" type="#_x0000_t75" style="position:absolute;width:55727;height:16002;visibility:visible;mso-wrap-style:square" o:gfxdata="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">
-                  <v:imagedata r:id="rId15" o:title=""/>
+                  <v:imagedata r:id="rId16" o:title=""/>
                 </v:shape>
                 <v:shape id="Text Box 1" o:spid="_x0000_s1031" type="#_x0000_t202" style="position:absolute;top:16548;width:55727;height:2584;visibility:visible;mso-wrap-style:square;v-text-anchor:top" o:gfxdata="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" stroked="f">
                   <v:textbox style="mso-fit-shape-to-text:t" inset="0,0,0,0">
@@ -6242,7 +5787,6 @@
         <w:rPr>
           <w:noProof/>
         </w:rPr>
-        <w:lastRenderedPageBreak/>
         <mc:AlternateContent>
           <mc:Choice Requires="wpg">
             <w:drawing>
@@ -6279,7 +5823,7 @@
                           </pic:cNvPicPr>
                         </pic:nvPicPr>
                         <pic:blipFill>
-                          <a:blip r:embed="rId16">
+                          <a:blip r:embed="rId17">
                             <a:extLst>
                               <a:ext uri="{28A0092B-C50C-407E-A947-70E740481C1C}">
                                 <a14:useLocalDpi xmlns:a14="http://schemas.microsoft.com/office/drawing/2010/main" val="0"/>
@@ -6386,7 +5930,7 @@
             <w:pict>
               <v:group w14:anchorId="10092028" id="Group 3" o:spid="_x0000_s1032" style="position:absolute;margin-left:113.9pt;margin-top:.35pt;width:238.3pt;height:133.35pt;z-index:251662336" coordsize="30264,16935" o:gfxdata="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">
                 <v:shape id="Picture 1" o:spid="_x0000_s1033" type="#_x0000_t75" style="position:absolute;left:6713;width:16827;height:14103;visibility:visible;mso-wrap-style:square" o:gfxdata="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">
-                  <v:imagedata r:id="rId17" o:title="" cropbottom="44786f"/>
+                  <v:imagedata r:id="rId18" o:title="" cropbottom="44786f"/>
                 </v:shape>
                 <v:shape id="Text Box 1" o:spid="_x0000_s1034" type="#_x0000_t202" style="position:absolute;top:14351;width:30264;height:2584;visibility:visible;mso-wrap-style:square;v-text-anchor:top" o:gfxdata="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" filled="f" stroked="f">
                   <v:textbox style="mso-fit-shape-to-text:t" inset="0,0,0,0">
@@ -6511,7 +6055,7 @@
                           </pic:cNvPicPr>
                         </pic:nvPicPr>
                         <pic:blipFill>
-                          <a:blip r:embed="rId18">
+                          <a:blip r:embed="rId19">
                             <a:extLst>
                               <a:ext uri="{28A0092B-C50C-407E-A947-70E740481C1C}">
                                 <a14:useLocalDpi xmlns:a14="http://schemas.microsoft.com/office/drawing/2010/main" val="0"/>
@@ -6608,7 +6152,7 @@
             <w:pict>
               <v:group w14:anchorId="568B52E2" id="Group 4" o:spid="_x0000_s1035" style="position:absolute;margin-left:107.05pt;margin-top:12.55pt;width:252.05pt;height:82.3pt;z-index:251665408" coordsize="32010,10452" o:gfxdata="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">
                 <v:shape id="Picture 1" o:spid="_x0000_s1036" type="#_x0000_t75" style="position:absolute;width:32010;height:7334;visibility:visible;mso-wrap-style:square" o:gfxdata="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">
-                  <v:imagedata r:id="rId19" o:title=""/>
+                  <v:imagedata r:id="rId20" o:title=""/>
                 </v:shape>
                 <v:shape id="Text Box 1" o:spid="_x0000_s1037" type="#_x0000_t202" style="position:absolute;left:3646;top:7867;width:24650;height:2585;visibility:visible;mso-wrap-style:square;v-text-anchor:top" o:gfxdata="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" stroked="f">
                   <v:textbox style="mso-fit-shape-to-text:t" inset="0,0,0,0">
@@ -6712,7 +6256,7 @@
                           </pic:cNvPicPr>
                         </pic:nvPicPr>
                         <pic:blipFill>
-                          <a:blip r:embed="rId20">
+                          <a:blip r:embed="rId21">
                             <a:extLst>
                               <a:ext uri="{28A0092B-C50C-407E-A947-70E740481C1C}">
                                 <a14:useLocalDpi xmlns:a14="http://schemas.microsoft.com/office/drawing/2010/main" val="0"/>
@@ -6810,7 +6354,7 @@
             <w:pict>
               <v:group w14:anchorId="7E07497A" id="Group 7" o:spid="_x0000_s1038" style="position:absolute;margin-left:151.25pt;margin-top:8.25pt;width:164pt;height:139.7pt;z-index:251675648" coordsize="20828,17741" o:gfxdata="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">
                 <v:shape id="Picture 1" o:spid="_x0000_s1039" type="#_x0000_t75" style="position:absolute;width:20828;height:14579;visibility:visible;mso-wrap-style:square" o:gfxdata="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">
-                  <v:imagedata r:id="rId21" o:title=""/>
+                  <v:imagedata r:id="rId22" o:title=""/>
                 </v:shape>
                 <v:shape id="Text Box 1" o:spid="_x0000_s1040" type="#_x0000_t202" style="position:absolute;top:15157;width:20828;height:2584;visibility:visible;mso-wrap-style:square;v-text-anchor:top" o:gfxdata="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" stroked="f">
                   <v:textbox style="mso-fit-shape-to-text:t" inset="0,0,0,0">
@@ -6900,6 +6444,7 @@
         <w:rPr>
           <w:color w:val="000000" w:themeColor="text1"/>
         </w:rPr>
+        <w:lastRenderedPageBreak/>
         <w:t>#</w:t>
       </w:r>
       <w:r>
@@ -7107,7 +6652,6 @@
         <w:rPr>
           <w:color w:val="000000" w:themeColor="text1"/>
         </w:rPr>
-        <w:lastRenderedPageBreak/>
         <w:t>6.2 AI Tool Use</w:t>
       </w:r>
       <w:bookmarkEnd w:id="31"/>
@@ -7712,19 +7256,11 @@
           <w:color w:val="000000" w:themeColor="text1"/>
         </w:rPr>
       </w:pPr>
-      <w:proofErr w:type="spellStart"/>
-      <w:r>
-        <w:rPr>
-          <w:color w:val="000000" w:themeColor="text1"/>
-        </w:rPr>
-        <w:t>worldscientific</w:t>
-      </w:r>
-      <w:proofErr w:type="spellEnd"/>
-      <w:r>
-        <w:rPr>
-          <w:color w:val="000000" w:themeColor="text1"/>
-        </w:rPr>
-        <w:t xml:space="preserve"> (2022) ‘Predicate Logic’, </w:t>
+      <w:r>
+        <w:rPr>
+          <w:color w:val="000000" w:themeColor="text1"/>
+        </w:rPr>
+        <w:t xml:space="preserve">worldscientific (2022) ‘Predicate Logic’, </w:t>
       </w:r>
       <w:r>
         <w:rPr>
@@ -7740,7 +7276,7 @@
         </w:rPr>
         <w:t xml:space="preserve">, pp. 51–75. Available at: </w:t>
       </w:r>
-      <w:hyperlink r:id="rId22" w:history="1">
+      <w:hyperlink r:id="rId23" w:history="1">
         <w:r>
           <w:rPr>
             <w:rStyle w:val="Hyperlink"/>
@@ -7802,7 +7338,7 @@
         </w:rPr>
         <w:t xml:space="preserve">. Available at: </w:t>
       </w:r>
-      <w:hyperlink r:id="rId23" w:history="1">
+      <w:hyperlink r:id="rId24" w:history="1">
         <w:r>
           <w:rPr>
             <w:rStyle w:val="Hyperlink"/>
@@ -7824,19 +7360,11 @@
           <w:color w:val="000000" w:themeColor="text1"/>
         </w:rPr>
       </w:pPr>
-      <w:proofErr w:type="spellStart"/>
-      <w:r>
-        <w:rPr>
-          <w:color w:val="000000" w:themeColor="text1"/>
-        </w:rPr>
-        <w:t>byjus</w:t>
-      </w:r>
-      <w:proofErr w:type="spellEnd"/>
-      <w:r>
-        <w:rPr>
-          <w:color w:val="000000" w:themeColor="text1"/>
-        </w:rPr>
-        <w:t xml:space="preserve"> (2019) </w:t>
+      <w:r>
+        <w:rPr>
+          <w:color w:val="000000" w:themeColor="text1"/>
+        </w:rPr>
+        <w:t xml:space="preserve">byjus (2019) </w:t>
       </w:r>
       <w:r>
         <w:rPr>
@@ -7872,7 +7400,7 @@
         </w:rPr>
         <w:t xml:space="preserve">: </w:t>
       </w:r>
-      <w:hyperlink r:id="rId24" w:history="1">
+      <w:hyperlink r:id="rId25" w:history="1">
         <w:r>
           <w:rPr>
             <w:rStyle w:val="Hyperlink"/>
@@ -8012,21 +7540,7 @@
         <w:rPr>
           <w:color w:val="000000" w:themeColor="text1"/>
         </w:rPr>
-        <w:t>The most significant challenge I encountered was [specific challenge — e.g. 'understanding and implementing the Ordinary Least Squares regression algorithm from first principles, without relying on high-level library abstractions']. I overcame this by [approach — e.g. 'reviewing the module lecture notes on linear algebra, working through the derivation step by step, and cross-checking my implementation against scikit-</w:t>
-      </w:r>
-      <w:proofErr w:type="spellStart"/>
-      <w:r>
-        <w:rPr>
-          <w:color w:val="000000" w:themeColor="text1"/>
-        </w:rPr>
-        <w:t>learn's</w:t>
-      </w:r>
-      <w:proofErr w:type="spellEnd"/>
-      <w:r>
-        <w:rPr>
-          <w:color w:val="000000" w:themeColor="text1"/>
-        </w:rPr>
-        <w:t xml:space="preserve"> output'].</w:t>
+        <w:t>The most significant challenge I encountered was [specific challenge — e.g. 'understanding and implementing the Ordinary Least Squares regression algorithm from first principles, without relying on high-level library abstractions']. I overcame this by [approach — e.g. 'reviewing the module lecture notes on linear algebra, working through the derivation step by step, and cross-checking my implementation against scikit-learn's output'].</w:t>
       </w:r>
     </w:p>
     <w:p>
@@ -8080,8 +7594,8 @@
       </w:pPr>
     </w:p>
     <w:sectPr>
-      <w:headerReference w:type="default" r:id="rId25"/>
-      <w:footerReference w:type="default" r:id="rId26"/>
+      <w:headerReference w:type="default" r:id="rId26"/>
+      <w:footerReference w:type="default" r:id="rId27"/>
       <w:pgSz w:w="11906" w:h="16838"/>
       <w:pgMar w:top="1440" w:right="1440" w:bottom="1440" w:left="1440" w:header="708" w:footer="708" w:gutter="0"/>
       <w:cols w:space="720"/>
@@ -10363,6 +9877,10 @@
 </file>
 
 <file path=customXml/item1.xml><?xml version="1.0" encoding="utf-8"?>
+<b:Sources xmlns:b="http://schemas.openxmlformats.org/officeDocument/2006/bibliography" xmlns="http://schemas.openxmlformats.org/officeDocument/2006/bibliography" SelectedStyle="\APASixthEditionOfficeOnline.xsl" StyleName="APA" Version="6"/>
+</file>
+
+<file path=customXml/item2.xml><?xml version="1.0" encoding="utf-8"?>
 <s:customData xmlns="http://www.wps.cn/officeDocument/2013/wpsCustomData" xmlns:s="http://www.wps.cn/officeDocument/2013/wpsCustomData">
   <customSectProps>
     <customSectPr/>
@@ -10374,22 +9892,18 @@
 </s:customData>
 </file>
 
-<file path=customXml/item2.xml><?xml version="1.0" encoding="utf-8"?>
-<b:Sources xmlns:b="http://schemas.openxmlformats.org/officeDocument/2006/bibliography" xmlns="http://schemas.openxmlformats.org/officeDocument/2006/bibliography" SelectedStyle="\APASixthEditionOfficeOnline.xsl" StyleName="APA" Version="6"/>
+<file path=customXml/itemProps1.xml><?xml version="1.0" encoding="utf-8"?>
+<ds:datastoreItem xmlns:ds="http://schemas.openxmlformats.org/officeDocument/2006/customXml" ds:itemID="{11CE9064-0015-4BAE-B6CA-558D0B4F112B}">
+  <ds:schemaRefs>
+    <ds:schemaRef ds:uri="http://schemas.openxmlformats.org/officeDocument/2006/bibliography"/>
+  </ds:schemaRefs>
+</ds:datastoreItem>
 </file>
 
-<file path=customXml/itemProps1.xml><?xml version="1.0" encoding="utf-8"?>
+<file path=customXml/itemProps2.xml><?xml version="1.0" encoding="utf-8"?>
 <ds:datastoreItem xmlns:ds="http://schemas.openxmlformats.org/officeDocument/2006/customXml" ds:itemID="{B1977F7D-205B-4081-913C-38D41E755F92}">
   <ds:schemaRefs>
     <ds:schemaRef ds:uri="http://www.wps.cn/officeDocument/2013/wpsCustomData"/>
   </ds:schemaRefs>
 </ds:datastoreItem>
-</file>
-
-<file path=customXml/itemProps2.xml><?xml version="1.0" encoding="utf-8"?>
-<ds:datastoreItem xmlns:ds="http://schemas.openxmlformats.org/officeDocument/2006/customXml" ds:itemID="{11CE9064-0015-4BAE-B6CA-558D0B4F112B}">
-  <ds:schemaRefs>
-    <ds:schemaRef ds:uri="http://schemas.openxmlformats.org/officeDocument/2006/bibliography"/>
-  </ds:schemaRefs>
-</ds:datastoreItem>
 </file>
</xml_diff>

<commit_message>
added 5.3, normalised 4.3 + added proof pics to it
</commit_message>
<xml_diff>
--- a/Resturant_Report.docx
+++ b/Resturant_Report.docx
@@ -16,43 +16,7 @@
           <w:sz w:val="18"/>
           <w:szCs w:val="18"/>
         </w:rPr>
-        <w:t>M-CSC005U</w:t>
-      </w:r>
-      <w:proofErr w:type="gramStart"/>
-      <w:r>
-        <w:rPr>
-          <w:color w:val="000000" w:themeColor="text1"/>
-          <w:sz w:val="18"/>
-          <w:szCs w:val="18"/>
-        </w:rPr>
-        <w:t>1  ·</w:t>
-      </w:r>
-      <w:proofErr w:type="gramEnd"/>
-      <w:r>
-        <w:rPr>
-          <w:color w:val="000000" w:themeColor="text1"/>
-          <w:sz w:val="18"/>
-          <w:szCs w:val="18"/>
-        </w:rPr>
-        <w:t xml:space="preserve">  Computational Mathematics and Data </w:t>
-      </w:r>
-      <w:proofErr w:type="gramStart"/>
-      <w:r>
-        <w:rPr>
-          <w:color w:val="000000" w:themeColor="text1"/>
-          <w:sz w:val="18"/>
-          <w:szCs w:val="18"/>
-        </w:rPr>
-        <w:t>Analytics  ·</w:t>
-      </w:r>
-      <w:proofErr w:type="gramEnd"/>
-      <w:r>
-        <w:rPr>
-          <w:color w:val="000000" w:themeColor="text1"/>
-          <w:sz w:val="18"/>
-          <w:szCs w:val="18"/>
-        </w:rPr>
-        <w:t xml:space="preserve">  Level 4</w:t>
+        <w:t>M-CSC005U1  ·  Computational Mathematics and Data Analytics  ·  Level 4</w:t>
       </w:r>
     </w:p>
     <w:p>
@@ -112,43 +76,7 @@
           <w:iCs/>
           <w:color w:val="000000" w:themeColor="text1"/>
         </w:rPr>
-        <w:t>Group Project (</w:t>
-      </w:r>
-      <w:proofErr w:type="gramStart"/>
-      <w:r>
-        <w:rPr>
-          <w:i/>
-          <w:iCs/>
-          <w:color w:val="000000" w:themeColor="text1"/>
-        </w:rPr>
-        <w:t>Coursework)  —</w:t>
-      </w:r>
-      <w:proofErr w:type="gramEnd"/>
-      <w:r>
-        <w:rPr>
-          <w:i/>
-          <w:iCs/>
-          <w:color w:val="000000" w:themeColor="text1"/>
-        </w:rPr>
-        <w:t xml:space="preserve">  Assessment </w:t>
-      </w:r>
-      <w:proofErr w:type="gramStart"/>
-      <w:r>
-        <w:rPr>
-          <w:i/>
-          <w:iCs/>
-          <w:color w:val="000000" w:themeColor="text1"/>
-        </w:rPr>
-        <w:t>1  (</w:t>
-      </w:r>
-      <w:proofErr w:type="gramEnd"/>
-      <w:r>
-        <w:rPr>
-          <w:i/>
-          <w:iCs/>
-          <w:color w:val="000000" w:themeColor="text1"/>
-        </w:rPr>
-        <w:t>60% of module)</w:t>
+        <w:t>Group Project (Coursework)  —  Assessment 1  (60% of module)</w:t>
       </w:r>
     </w:p>
     <w:p>
@@ -195,33 +123,7 @@
           <w:sz w:val="36"/>
           <w:szCs w:val="36"/>
         </w:rPr>
-        <w:t>[</w:t>
-      </w:r>
-      <w:proofErr w:type="spellStart"/>
-      <w:r>
-        <w:rPr>
-          <w:b/>
-          <w:bCs/>
-          <w:i/>
-          <w:iCs/>
-          <w:color w:val="000000" w:themeColor="text1"/>
-          <w:sz w:val="36"/>
-          <w:szCs w:val="36"/>
-        </w:rPr>
-        <w:t>Reastaurant</w:t>
-      </w:r>
-      <w:proofErr w:type="spellEnd"/>
-      <w:r>
-        <w:rPr>
-          <w:b/>
-          <w:bCs/>
-          <w:i/>
-          <w:iCs/>
-          <w:color w:val="000000" w:themeColor="text1"/>
-          <w:sz w:val="36"/>
-          <w:szCs w:val="36"/>
-        </w:rPr>
-        <w:t xml:space="preserve"> name] Database Design</w:t>
+        <w:t>[Restaurant name] Database Design</w:t>
       </w:r>
     </w:p>
     <w:p>
@@ -324,10 +226,11 @@
                 <w:sz w:val="22"/>
                 <w:szCs w:val="22"/>
               </w:rPr>
-              <w:t>1. [</w:t>
-            </w:r>
-            <w:proofErr w:type="spellStart"/>
-            <w:r>
+              <w:t>1. [Abdennouri Mouatez Billah — 25016832]</w:t>
+            </w:r>
+          </w:p>
+          <w:p>
+            <w:pPr>
               <w:rPr>
                 <w:i/>
                 <w:iCs/>
@@ -335,9 +238,7 @@
                 <w:sz w:val="22"/>
                 <w:szCs w:val="22"/>
               </w:rPr>
-              <w:t>Abdennouri</w:t>
-            </w:r>
-            <w:proofErr w:type="spellEnd"/>
+            </w:pPr>
             <w:r>
               <w:rPr>
                 <w:i/>
@@ -346,9 +247,8 @@
                 <w:sz w:val="22"/>
                 <w:szCs w:val="22"/>
               </w:rPr>
-              <w:t xml:space="preserve"> </w:t>
-            </w:r>
-            <w:proofErr w:type="spellStart"/>
+              <w:t>2. [</w:t>
+            </w:r>
             <w:r>
               <w:rPr>
                 <w:i/>
@@ -357,9 +257,8 @@
                 <w:sz w:val="22"/>
                 <w:szCs w:val="22"/>
               </w:rPr>
-              <w:t>Mouatez</w:t>
-            </w:r>
-            <w:proofErr w:type="spellEnd"/>
+              <w:t>Giwa Marvellous - 25016834</w:t>
+            </w:r>
             <w:r>
               <w:rPr>
                 <w:i/>
@@ -368,11 +267,16 @@
                 <w:sz w:val="22"/>
                 <w:szCs w:val="22"/>
               </w:rPr>
-              <w:t xml:space="preserve"> Billah — 25016832]</w:t>
+              <w:t xml:space="preserve">] </w:t>
             </w:r>
           </w:p>
           <w:p>
             <w:pPr>
+              <w:rPr>
+                <w:color w:val="000000" w:themeColor="text1"/>
+              </w:rPr>
+            </w:pPr>
+            <w:r>
               <w:rPr>
                 <w:i/>
                 <w:iCs/>
@@ -380,7 +284,8 @@
                 <w:sz w:val="22"/>
                 <w:szCs w:val="22"/>
               </w:rPr>
-            </w:pPr>
+              <w:t>3. [</w:t>
+            </w:r>
             <w:r>
               <w:rPr>
                 <w:i/>
@@ -389,76 +294,7 @@
                 <w:sz w:val="22"/>
                 <w:szCs w:val="22"/>
               </w:rPr>
-              <w:t>2. [</w:t>
-            </w:r>
-            <w:r>
-              <w:rPr>
-                <w:i/>
-                <w:iCs/>
-                <w:color w:val="000000" w:themeColor="text1"/>
-                <w:sz w:val="22"/>
-                <w:szCs w:val="22"/>
-              </w:rPr>
-              <w:t>Giwa Marvellous - 25016834</w:t>
-            </w:r>
-            <w:r>
-              <w:rPr>
-                <w:i/>
-                <w:iCs/>
-                <w:color w:val="000000" w:themeColor="text1"/>
-                <w:sz w:val="22"/>
-                <w:szCs w:val="22"/>
-              </w:rPr>
-              <w:t xml:space="preserve">] </w:t>
-            </w:r>
-          </w:p>
-          <w:p>
-            <w:pPr>
-              <w:rPr>
-                <w:color w:val="000000" w:themeColor="text1"/>
-              </w:rPr>
-            </w:pPr>
-            <w:r>
-              <w:rPr>
-                <w:i/>
-                <w:iCs/>
-                <w:color w:val="000000" w:themeColor="text1"/>
-                <w:sz w:val="22"/>
-                <w:szCs w:val="22"/>
-              </w:rPr>
-              <w:t>3. [</w:t>
-            </w:r>
-            <w:r>
-              <w:rPr>
-                <w:i/>
-                <w:iCs/>
-                <w:color w:val="000000" w:themeColor="text1"/>
-                <w:sz w:val="22"/>
-                <w:szCs w:val="22"/>
-              </w:rPr>
-              <w:t xml:space="preserve">Rupesh </w:t>
-            </w:r>
-            <w:proofErr w:type="spellStart"/>
-            <w:r>
-              <w:rPr>
-                <w:i/>
-                <w:iCs/>
-                <w:color w:val="000000" w:themeColor="text1"/>
-                <w:sz w:val="22"/>
-                <w:szCs w:val="22"/>
-              </w:rPr>
-              <w:t>kumar</w:t>
-            </w:r>
-            <w:proofErr w:type="spellEnd"/>
-            <w:r>
-              <w:rPr>
-                <w:i/>
-                <w:iCs/>
-                <w:color w:val="000000" w:themeColor="text1"/>
-                <w:sz w:val="22"/>
-                <w:szCs w:val="22"/>
-              </w:rPr>
-              <w:t xml:space="preserve"> Sah - 25016818</w:t>
+              <w:t>Rupesh kumar Sah - 25016818</w:t>
             </w:r>
             <w:r>
               <w:rPr>
@@ -3125,7 +2961,11 @@
           <w:tab w:val="right" w:leader="dot" w:pos="9016"/>
         </w:tabs>
         <w:rPr>
+          <w:rFonts w:asciiTheme="minorHAnsi" w:eastAsiaTheme="minorEastAsia" w:hAnsiTheme="minorHAnsi" w:cstheme="minorBidi"/>
           <w:noProof/>
+          <w:color w:val="auto"/>
+          <w:kern w:val="2"/>
+          <w14:ligatures w14:val="standardContextual"/>
         </w:rPr>
       </w:pPr>
       <w:r>
@@ -3158,13 +2998,13 @@
         </w:rPr>
         <w:fldChar w:fldCharType="separate"/>
       </w:r>
-      <w:hyperlink w:anchor="_Toc230530959" w:history="1">
+      <w:hyperlink w:anchor="_Toc233102031" w:history="1">
         <w:r>
           <w:rPr>
             <w:rStyle w:val="Hyperlink"/>
             <w:noProof/>
           </w:rPr>
-          <w:t>Figure 1: “Most day ordered in” Query</w:t>
+          <w:t>Figure 1: Insertion of the data</w:t>
         </w:r>
         <w:r>
           <w:rPr>
@@ -3185,7 +3025,223 @@
             <w:noProof/>
             <w:webHidden/>
           </w:rPr>
-          <w:instrText xml:space="preserve"> PAGEREF _Toc230530959 \h </w:instrText>
+          <w:instrText xml:space="preserve"> PAGEREF _Toc233102031 \h </w:instrText>
+        </w:r>
+        <w:r>
+          <w:rPr>
+            <w:noProof/>
+            <w:webHidden/>
+          </w:rPr>
+        </w:r>
+        <w:r>
+          <w:rPr>
+            <w:noProof/>
+            <w:webHidden/>
+          </w:rPr>
+          <w:fldChar w:fldCharType="separate"/>
+        </w:r>
+        <w:r>
+          <w:rPr>
+            <w:noProof/>
+            <w:webHidden/>
+          </w:rPr>
+          <w:t>7</w:t>
+        </w:r>
+        <w:r>
+          <w:rPr>
+            <w:noProof/>
+            <w:webHidden/>
+          </w:rPr>
+          <w:fldChar w:fldCharType="end"/>
+        </w:r>
+      </w:hyperlink>
+    </w:p>
+    <w:p>
+      <w:pPr>
+        <w:pStyle w:val="TableofFigures"/>
+        <w:tabs>
+          <w:tab w:val="right" w:leader="dot" w:pos="9016"/>
+        </w:tabs>
+        <w:rPr>
+          <w:rFonts w:asciiTheme="minorHAnsi" w:eastAsiaTheme="minorEastAsia" w:hAnsiTheme="minorHAnsi" w:cstheme="minorBidi"/>
+          <w:noProof/>
+          <w:color w:val="auto"/>
+          <w:kern w:val="2"/>
+          <w14:ligatures w14:val="standardContextual"/>
+        </w:rPr>
+      </w:pPr>
+      <w:hyperlink w:anchor="_Toc233102032" w:history="1">
+        <w:r>
+          <w:rPr>
+            <w:rStyle w:val="Hyperlink"/>
+            <w:noProof/>
+          </w:rPr>
+          <w:t>Figure 2: Duplicate keys error</w:t>
+        </w:r>
+        <w:r>
+          <w:rPr>
+            <w:noProof/>
+            <w:webHidden/>
+          </w:rPr>
+          <w:tab/>
+        </w:r>
+        <w:r>
+          <w:rPr>
+            <w:noProof/>
+            <w:webHidden/>
+          </w:rPr>
+          <w:fldChar w:fldCharType="begin"/>
+        </w:r>
+        <w:r>
+          <w:rPr>
+            <w:noProof/>
+            <w:webHidden/>
+          </w:rPr>
+          <w:instrText xml:space="preserve"> PAGEREF _Toc233102032 \h </w:instrText>
+        </w:r>
+        <w:r>
+          <w:rPr>
+            <w:noProof/>
+            <w:webHidden/>
+          </w:rPr>
+        </w:r>
+        <w:r>
+          <w:rPr>
+            <w:noProof/>
+            <w:webHidden/>
+          </w:rPr>
+          <w:fldChar w:fldCharType="separate"/>
+        </w:r>
+        <w:r>
+          <w:rPr>
+            <w:noProof/>
+            <w:webHidden/>
+          </w:rPr>
+          <w:t>8</w:t>
+        </w:r>
+        <w:r>
+          <w:rPr>
+            <w:noProof/>
+            <w:webHidden/>
+          </w:rPr>
+          <w:fldChar w:fldCharType="end"/>
+        </w:r>
+      </w:hyperlink>
+    </w:p>
+    <w:p>
+      <w:pPr>
+        <w:pStyle w:val="TableofFigures"/>
+        <w:tabs>
+          <w:tab w:val="right" w:leader="dot" w:pos="9016"/>
+        </w:tabs>
+        <w:rPr>
+          <w:rFonts w:asciiTheme="minorHAnsi" w:eastAsiaTheme="minorEastAsia" w:hAnsiTheme="minorHAnsi" w:cstheme="minorBidi"/>
+          <w:noProof/>
+          <w:color w:val="auto"/>
+          <w:kern w:val="2"/>
+          <w14:ligatures w14:val="standardContextual"/>
+        </w:rPr>
+      </w:pPr>
+      <w:hyperlink w:anchor="_Toc233102033" w:history="1">
+        <w:r>
+          <w:rPr>
+            <w:rStyle w:val="Hyperlink"/>
+            <w:noProof/>
+          </w:rPr>
+          <w:t>Figure 3: PK not being automatically indexed error</w:t>
+        </w:r>
+        <w:r>
+          <w:rPr>
+            <w:noProof/>
+            <w:webHidden/>
+          </w:rPr>
+          <w:tab/>
+        </w:r>
+        <w:r>
+          <w:rPr>
+            <w:noProof/>
+            <w:webHidden/>
+          </w:rPr>
+          <w:fldChar w:fldCharType="begin"/>
+        </w:r>
+        <w:r>
+          <w:rPr>
+            <w:noProof/>
+            <w:webHidden/>
+          </w:rPr>
+          <w:instrText xml:space="preserve"> PAGEREF _Toc233102033 \h </w:instrText>
+        </w:r>
+        <w:r>
+          <w:rPr>
+            <w:noProof/>
+            <w:webHidden/>
+          </w:rPr>
+        </w:r>
+        <w:r>
+          <w:rPr>
+            <w:noProof/>
+            <w:webHidden/>
+          </w:rPr>
+          <w:fldChar w:fldCharType="separate"/>
+        </w:r>
+        <w:r>
+          <w:rPr>
+            <w:noProof/>
+            <w:webHidden/>
+          </w:rPr>
+          <w:t>8</w:t>
+        </w:r>
+        <w:r>
+          <w:rPr>
+            <w:noProof/>
+            <w:webHidden/>
+          </w:rPr>
+          <w:fldChar w:fldCharType="end"/>
+        </w:r>
+      </w:hyperlink>
+    </w:p>
+    <w:p>
+      <w:pPr>
+        <w:pStyle w:val="TableofFigures"/>
+        <w:tabs>
+          <w:tab w:val="right" w:leader="dot" w:pos="9016"/>
+        </w:tabs>
+        <w:rPr>
+          <w:rFonts w:asciiTheme="minorHAnsi" w:eastAsiaTheme="minorEastAsia" w:hAnsiTheme="minorHAnsi" w:cstheme="minorBidi"/>
+          <w:noProof/>
+          <w:color w:val="auto"/>
+          <w:kern w:val="2"/>
+          <w14:ligatures w14:val="standardContextual"/>
+        </w:rPr>
+      </w:pPr>
+      <w:hyperlink w:anchor="_Toc233102034" w:history="1">
+        <w:r>
+          <w:rPr>
+            <w:rStyle w:val="Hyperlink"/>
+            <w:noProof/>
+          </w:rPr>
+          <w:t>Figure 4: “Most day ordered in” Query</w:t>
+        </w:r>
+        <w:r>
+          <w:rPr>
+            <w:noProof/>
+            <w:webHidden/>
+          </w:rPr>
+          <w:tab/>
+        </w:r>
+        <w:r>
+          <w:rPr>
+            <w:noProof/>
+            <w:webHidden/>
+          </w:rPr>
+          <w:fldChar w:fldCharType="begin"/>
+        </w:r>
+        <w:r>
+          <w:rPr>
+            <w:noProof/>
+            <w:webHidden/>
+          </w:rPr>
+          <w:instrText xml:space="preserve"> PAGEREF _Toc233102034 \h </w:instrText>
         </w:r>
         <w:r>
           <w:rPr>
@@ -3223,16 +3279,20 @@
           <w:tab w:val="right" w:leader="dot" w:pos="9016"/>
         </w:tabs>
         <w:rPr>
+          <w:rFonts w:asciiTheme="minorHAnsi" w:eastAsiaTheme="minorEastAsia" w:hAnsiTheme="minorHAnsi" w:cstheme="minorBidi"/>
           <w:noProof/>
-        </w:rPr>
-      </w:pPr>
-      <w:hyperlink w:anchor="_Toc230530960" w:history="1">
+          <w:color w:val="auto"/>
+          <w:kern w:val="2"/>
+          <w14:ligatures w14:val="standardContextual"/>
+        </w:rPr>
+      </w:pPr>
+      <w:hyperlink w:anchor="_Toc233102035" w:history="1">
         <w:r>
           <w:rPr>
             <w:rStyle w:val="Hyperlink"/>
             <w:noProof/>
           </w:rPr>
-          <w:t>Figure 2: “Users who spent more than £10” Query</w:t>
+          <w:t>Figure 5: “Users who spent more than £10” Query</w:t>
         </w:r>
         <w:r>
           <w:rPr>
@@ -3253,7 +3313,7 @@
             <w:noProof/>
             <w:webHidden/>
           </w:rPr>
-          <w:instrText xml:space="preserve"> PAGEREF _Toc230530960 \h </w:instrText>
+          <w:instrText xml:space="preserve"> PAGEREF _Toc233102035 \h </w:instrText>
         </w:r>
         <w:r>
           <w:rPr>
@@ -3291,16 +3351,20 @@
           <w:tab w:val="right" w:leader="dot" w:pos="9016"/>
         </w:tabs>
         <w:rPr>
+          <w:rFonts w:asciiTheme="minorHAnsi" w:eastAsiaTheme="minorEastAsia" w:hAnsiTheme="minorHAnsi" w:cstheme="minorBidi"/>
           <w:noProof/>
-        </w:rPr>
-      </w:pPr>
-      <w:hyperlink w:anchor="_Toc230530961" w:history="1">
+          <w:color w:val="auto"/>
+          <w:kern w:val="2"/>
+          <w14:ligatures w14:val="standardContextual"/>
+        </w:rPr>
+      </w:pPr>
+      <w:hyperlink w:anchor="_Toc233102036" w:history="1">
         <w:r>
           <w:rPr>
             <w:rStyle w:val="Hyperlink"/>
             <w:noProof/>
           </w:rPr>
-          <w:t>Figure 3: Result of “Users who spent more than £10” Query</w:t>
+          <w:t>Figure 6: Result of “Users who spent more than £10” Query</w:t>
         </w:r>
         <w:r>
           <w:rPr>
@@ -3321,7 +3385,7 @@
             <w:noProof/>
             <w:webHidden/>
           </w:rPr>
-          <w:instrText xml:space="preserve"> PAGEREF _Toc230530961 \h </w:instrText>
+          <w:instrText xml:space="preserve"> PAGEREF _Toc233102036 \h </w:instrText>
         </w:r>
         <w:r>
           <w:rPr>
@@ -3359,16 +3423,20 @@
           <w:tab w:val="right" w:leader="dot" w:pos="9016"/>
         </w:tabs>
         <w:rPr>
+          <w:rFonts w:asciiTheme="minorHAnsi" w:eastAsiaTheme="minorEastAsia" w:hAnsiTheme="minorHAnsi" w:cstheme="minorBidi"/>
           <w:noProof/>
-        </w:rPr>
-      </w:pPr>
-      <w:hyperlink w:anchor="_Toc230530962" w:history="1">
+          <w:color w:val="auto"/>
+          <w:kern w:val="2"/>
+          <w14:ligatures w14:val="standardContextual"/>
+        </w:rPr>
+      </w:pPr>
+      <w:hyperlink w:anchor="_Toc233102037" w:history="1">
         <w:r>
           <w:rPr>
             <w:rStyle w:val="Hyperlink"/>
             <w:noProof/>
           </w:rPr>
-          <w:t>Figure 4: Result of “Most day ordered in” Query</w:t>
+          <w:t>Figure 7: Result of “Most day ordered in” Query</w:t>
         </w:r>
         <w:r>
           <w:rPr>
@@ -3389,7 +3457,79 @@
             <w:noProof/>
             <w:webHidden/>
           </w:rPr>
-          <w:instrText xml:space="preserve"> PAGEREF _Toc230530962 \h </w:instrText>
+          <w:instrText xml:space="preserve"> PAGEREF _Toc233102037 \h </w:instrText>
+        </w:r>
+        <w:r>
+          <w:rPr>
+            <w:noProof/>
+            <w:webHidden/>
+          </w:rPr>
+        </w:r>
+        <w:r>
+          <w:rPr>
+            <w:noProof/>
+            <w:webHidden/>
+          </w:rPr>
+          <w:fldChar w:fldCharType="separate"/>
+        </w:r>
+        <w:r>
+          <w:rPr>
+            <w:noProof/>
+            <w:webHidden/>
+          </w:rPr>
+          <w:t>9</w:t>
+        </w:r>
+        <w:r>
+          <w:rPr>
+            <w:noProof/>
+            <w:webHidden/>
+          </w:rPr>
+          <w:fldChar w:fldCharType="end"/>
+        </w:r>
+      </w:hyperlink>
+    </w:p>
+    <w:p>
+      <w:pPr>
+        <w:pStyle w:val="TableofFigures"/>
+        <w:tabs>
+          <w:tab w:val="right" w:leader="dot" w:pos="9016"/>
+        </w:tabs>
+        <w:rPr>
+          <w:rFonts w:asciiTheme="minorHAnsi" w:eastAsiaTheme="minorEastAsia" w:hAnsiTheme="minorHAnsi" w:cstheme="minorBidi"/>
+          <w:noProof/>
+          <w:color w:val="auto"/>
+          <w:kern w:val="2"/>
+          <w14:ligatures w14:val="standardContextual"/>
+        </w:rPr>
+      </w:pPr>
+      <w:hyperlink w:anchor="_Toc233102038" w:history="1">
+        <w:r>
+          <w:rPr>
+            <w:rStyle w:val="Hyperlink"/>
+            <w:noProof/>
+          </w:rPr>
+          <w:t>Figure 8: Saved queries</w:t>
+        </w:r>
+        <w:r>
+          <w:rPr>
+            <w:noProof/>
+            <w:webHidden/>
+          </w:rPr>
+          <w:tab/>
+        </w:r>
+        <w:r>
+          <w:rPr>
+            <w:noProof/>
+            <w:webHidden/>
+          </w:rPr>
+          <w:fldChar w:fldCharType="begin"/>
+        </w:r>
+        <w:r>
+          <w:rPr>
+            <w:noProof/>
+            <w:webHidden/>
+          </w:rPr>
+          <w:instrText xml:space="preserve"> PAGEREF _Toc233102038 \h </w:instrText>
         </w:r>
         <w:r>
           <w:rPr>
@@ -3427,16 +3567,20 @@
           <w:tab w:val="right" w:leader="dot" w:pos="9016"/>
         </w:tabs>
         <w:rPr>
+          <w:rFonts w:asciiTheme="minorHAnsi" w:eastAsiaTheme="minorEastAsia" w:hAnsiTheme="minorHAnsi" w:cstheme="minorBidi"/>
           <w:noProof/>
-        </w:rPr>
-      </w:pPr>
-      <w:hyperlink w:anchor="_Toc230530963" w:history="1">
+          <w:color w:val="auto"/>
+          <w:kern w:val="2"/>
+          <w14:ligatures w14:val="standardContextual"/>
+        </w:rPr>
+      </w:pPr>
+      <w:hyperlink w:anchor="_Toc233102039" w:history="1">
         <w:r>
           <w:rPr>
             <w:rStyle w:val="Hyperlink"/>
             <w:noProof/>
           </w:rPr>
-          <w:t>Figure 5: Saved queries</w:t>
+          <w:t>Figure 9: Number of users who started using the software throughout the months</w:t>
         </w:r>
         <w:r>
           <w:rPr>
@@ -3457,7 +3601,7 @@
             <w:noProof/>
             <w:webHidden/>
           </w:rPr>
-          <w:instrText xml:space="preserve"> PAGEREF _Toc230530963 \h </w:instrText>
+          <w:instrText xml:space="preserve"> PAGEREF _Toc233102039 \h </w:instrText>
         </w:r>
         <w:r>
           <w:rPr>
@@ -3907,35 +4051,7 @@
         <w:rPr>
           <w:color w:val="000000" w:themeColor="text1"/>
         </w:rPr>
-        <w:t xml:space="preserve">An organized collection of objects that can be represented in set-builder form or roster form. In set theory, the operations of the sets are carried when two or more sets combine to form a single set under some of the given conditions. The basic operations on sets </w:t>
-      </w:r>
-      <w:proofErr w:type="gramStart"/>
-      <w:r>
-        <w:rPr>
-          <w:color w:val="000000" w:themeColor="text1"/>
-        </w:rPr>
-        <w:t>are:</w:t>
-      </w:r>
-      <w:proofErr w:type="gramEnd"/>
-      <w:r>
-        <w:rPr>
-          <w:color w:val="000000" w:themeColor="text1"/>
-        </w:rPr>
-        <w:t xml:space="preserve"> Union of sets, Intersection of sets, A complement of a set, Cartesian product of sets and Set difference. (</w:t>
-      </w:r>
-      <w:proofErr w:type="spellStart"/>
-      <w:r>
-        <w:rPr>
-          <w:color w:val="000000" w:themeColor="text1"/>
-        </w:rPr>
-        <w:t>byjus</w:t>
-      </w:r>
-      <w:proofErr w:type="spellEnd"/>
-      <w:r>
-        <w:rPr>
-          <w:color w:val="000000" w:themeColor="text1"/>
-        </w:rPr>
-        <w:t>, 2019)</w:t>
+        <w:t>An organized collection of objects that can be represented in set-builder form or roster form. In set theory, the operations of the sets are carried when two or more sets combine to form a single set under some of the given conditions. The basic operations on sets are: Union of sets, Intersection of sets, A complement of a set, Cartesian product of sets and Set difference. (byjus, 2019)</w:t>
       </w:r>
     </w:p>
     <w:p>
@@ -3968,21 +4084,7 @@
           <w:color w:val="000000" w:themeColor="text1"/>
         </w:rPr>
         <w:lastRenderedPageBreak/>
-        <w:t xml:space="preserve">Sets relate to </w:t>
-      </w:r>
-      <w:proofErr w:type="spellStart"/>
-      <w:r>
-        <w:rPr>
-          <w:color w:val="000000" w:themeColor="text1"/>
-        </w:rPr>
-        <w:t>sql</w:t>
-      </w:r>
-      <w:proofErr w:type="spellEnd"/>
-      <w:r>
-        <w:rPr>
-          <w:color w:val="000000" w:themeColor="text1"/>
-        </w:rPr>
-        <w:t xml:space="preserve"> when making queries to show specific data where tables are combined (JOIN ON) which is the Union of sets for example and when provided with a certain a parameter to filter more than we get into Intersection of sets (WHERE, GROUP BY…etc)</w:t>
+        <w:t>Sets relate to sql when making queries to show specific data where tables are combined (JOIN ON) which is the Union of sets for example and when provided with a certain a parameter to filter more than we get into Intersection of sets (WHERE, GROUP BY…etc)</w:t>
       </w:r>
     </w:p>
     <w:p>
@@ -4120,29 +4222,7 @@
         <w:rPr>
           <w:color w:val="000000" w:themeColor="text1"/>
         </w:rPr>
-        <w:t xml:space="preserve">As we perform operations on sets to make queries, we basically applying relational algebra, and apart from the operations used before, SELECT was also used to print </w:t>
-      </w:r>
-      <w:proofErr w:type="spellStart"/>
-      <w:proofErr w:type="gramStart"/>
-      <w:r>
-        <w:rPr>
-          <w:color w:val="000000" w:themeColor="text1"/>
-        </w:rPr>
-        <w:t>our</w:t>
-      </w:r>
-      <w:proofErr w:type="spellEnd"/>
-      <w:r>
-        <w:rPr>
-          <w:color w:val="000000" w:themeColor="text1"/>
-        </w:rPr>
-        <w:t xml:space="preserve"> the</w:t>
-      </w:r>
-      <w:proofErr w:type="gramEnd"/>
-      <w:r>
-        <w:rPr>
-          <w:color w:val="000000" w:themeColor="text1"/>
-        </w:rPr>
-        <w:t xml:space="preserve"> results for example and sorting operations (like DESC)</w:t>
+        <w:t>As we perform operations on sets to make queries, we basically applying relational algebra, and apart from the operations used before, SELECT was also used to print our the results for example and sorting operations (like DESC)</w:t>
       </w:r>
     </w:p>
     <w:p>
@@ -4202,21 +4282,7 @@
         <w:rPr>
           <w:color w:val="000000" w:themeColor="text1"/>
         </w:rPr>
-        <w:t>Predicate logic, also called first-order logic, is an enrichment of propositional logic to include predicates, individuals and quantifiers, and is widely accepted as the standard language of mathematics. Axiomatic predicate logic was established by Gottlob Frege in the late 19th century, who formalized the notion of quantified variable. (</w:t>
-      </w:r>
-      <w:proofErr w:type="spellStart"/>
-      <w:r>
-        <w:rPr>
-          <w:color w:val="000000" w:themeColor="text1"/>
-        </w:rPr>
-        <w:t>worldscientific</w:t>
-      </w:r>
-      <w:proofErr w:type="spellEnd"/>
-      <w:r>
-        <w:rPr>
-          <w:color w:val="000000" w:themeColor="text1"/>
-        </w:rPr>
-        <w:t>, 2022)</w:t>
+        <w:t>Predicate logic, also called first-order logic, is an enrichment of propositional logic to include predicates, individuals and quantifiers, and is widely accepted as the standard language of mathematics. Axiomatic predicate logic was established by Gottlob Frege in the late 19th century, who formalized the notion of quantified variable. (worldscientific, 2022)</w:t>
       </w:r>
     </w:p>
     <w:p>
@@ -4307,21 +4373,7 @@
           <w:color w:val="000000" w:themeColor="text1"/>
         </w:rPr>
         <w:br/>
-        <w:t xml:space="preserve">Another example is the functional dependencies (normalization) for example </w:t>
-      </w:r>
-      <w:proofErr w:type="spellStart"/>
-      <w:r>
-        <w:rPr>
-          <w:color w:val="000000" w:themeColor="text1"/>
-        </w:rPr>
-        <w:t>dish_id</w:t>
-      </w:r>
-      <w:proofErr w:type="spellEnd"/>
-      <w:r>
-        <w:rPr>
-          <w:color w:val="000000" w:themeColor="text1"/>
-        </w:rPr>
-        <w:t xml:space="preserve">  </w:t>
+        <w:t xml:space="preserve">Another example is the functional dependencies (normalization) for example dish_id  </w:t>
       </w:r>
       <w:r>
         <w:rPr>
@@ -4333,49 +4385,7 @@
         <w:rPr>
           <w:color w:val="000000" w:themeColor="text1"/>
         </w:rPr>
-        <w:t xml:space="preserve"> </w:t>
-      </w:r>
-      <w:proofErr w:type="spellStart"/>
-      <w:r>
-        <w:rPr>
-          <w:color w:val="000000" w:themeColor="text1"/>
-        </w:rPr>
-        <w:t>dishName</w:t>
-      </w:r>
-      <w:proofErr w:type="spellEnd"/>
-      <w:r>
-        <w:rPr>
-          <w:color w:val="000000" w:themeColor="text1"/>
-        </w:rPr>
-        <w:t xml:space="preserve">, which means that the </w:t>
-      </w:r>
-      <w:proofErr w:type="spellStart"/>
-      <w:r>
-        <w:rPr>
-          <w:color w:val="000000" w:themeColor="text1"/>
-        </w:rPr>
-        <w:t>dish_id</w:t>
-      </w:r>
-      <w:proofErr w:type="spellEnd"/>
-      <w:r>
-        <w:rPr>
-          <w:color w:val="000000" w:themeColor="text1"/>
-        </w:rPr>
-        <w:t xml:space="preserve"> determines the </w:t>
-      </w:r>
-      <w:proofErr w:type="spellStart"/>
-      <w:r>
-        <w:rPr>
-          <w:color w:val="000000" w:themeColor="text1"/>
-        </w:rPr>
-        <w:t>dishName</w:t>
-      </w:r>
-      <w:proofErr w:type="spellEnd"/>
-      <w:r>
-        <w:rPr>
-          <w:color w:val="000000" w:themeColor="text1"/>
-        </w:rPr>
-        <w:t>.</w:t>
+        <w:t xml:space="preserve"> dishName, which means that the dish_id determines the dishName.</w:t>
       </w:r>
     </w:p>
     <w:p>
@@ -4397,21 +4407,7 @@
         <w:rPr>
           <w:color w:val="000000" w:themeColor="text1"/>
         </w:rPr>
-        <w:t>To construct this model, graph theory was also implemented to decide the relationship between the tables (</w:t>
-      </w:r>
-      <w:proofErr w:type="spellStart"/>
-      <w:r>
-        <w:rPr>
-          <w:color w:val="000000" w:themeColor="text1"/>
-        </w:rPr>
-        <w:t>entites</w:t>
-      </w:r>
-      <w:proofErr w:type="spellEnd"/>
-      <w:r>
-        <w:rPr>
-          <w:color w:val="000000" w:themeColor="text1"/>
-        </w:rPr>
-        <w:t>) through the primary keys and foreign keys.</w:t>
+        <w:t>To construct this model, graph theory was also implemented to decide the relationship between the tables (entites) through the primary keys and foreign keys.</w:t>
       </w:r>
     </w:p>
     <w:p>
@@ -4514,19 +4510,11 @@
         </w:rPr>
         <w:t xml:space="preserve">. </w:t>
       </w:r>
-      <w:proofErr w:type="spellStart"/>
-      <w:r>
-        <w:rPr>
-          <w:color w:val="000000" w:themeColor="text1"/>
-        </w:rPr>
-        <w:t>Github</w:t>
-      </w:r>
-      <w:proofErr w:type="spellEnd"/>
-      <w:r>
-        <w:rPr>
-          <w:color w:val="000000" w:themeColor="text1"/>
-        </w:rPr>
-        <w:t xml:space="preserve"> to track the work.</w:t>
+      <w:r>
+        <w:rPr>
+          <w:color w:val="000000" w:themeColor="text1"/>
+        </w:rPr>
+        <w:t>Github to track the work.</w:t>
       </w:r>
     </w:p>
     <w:p>
@@ -4575,6 +4563,9 @@
     </w:p>
     <w:p>
       <w:r>
+        <w:rPr>
+          <w:noProof/>
+        </w:rPr>
         <w:drawing>
           <wp:inline distT="0" distB="0" distL="0" distR="0" wp14:anchorId="75EBD0DB" wp14:editId="24FF00C3">
             <wp:extent cx="5731510" cy="3575685"/>
@@ -4788,7 +4779,6 @@
         </w:rPr>
         <w:t xml:space="preserve">, </w:t>
       </w:r>
-      <w:proofErr w:type="spellStart"/>
       <w:r>
         <w:rPr>
           <w:color w:val="000000" w:themeColor="text1"/>
@@ -4803,43 +4793,33 @@
         </w:rPr>
         <w:t>num</w:t>
       </w:r>
-      <w:proofErr w:type="spellEnd"/>
       <w:r>
         <w:rPr>
           <w:color w:val="000000" w:themeColor="text1"/>
           <w:lang w:val="en-US"/>
         </w:rPr>
-        <w:t xml:space="preserve"> (</w:t>
-      </w:r>
-      <w:proofErr w:type="spellStart"/>
+        <w:t xml:space="preserve"> (bigint)</w:t>
+      </w:r>
       <w:r>
         <w:rPr>
           <w:color w:val="000000" w:themeColor="text1"/>
           <w:lang w:val="en-US"/>
         </w:rPr>
-        <w:t>bigint</w:t>
-      </w:r>
-      <w:proofErr w:type="spellEnd"/>
+        <w:t>, and address</w:t>
+      </w:r>
       <w:r>
         <w:rPr>
           <w:color w:val="000000" w:themeColor="text1"/>
           <w:lang w:val="en-US"/>
         </w:rPr>
-        <w:t>)</w:t>
+        <w:t xml:space="preserve"> (varchar)</w:t>
       </w:r>
       <w:r>
         <w:rPr>
           <w:color w:val="000000" w:themeColor="text1"/>
           <w:lang w:val="en-US"/>
         </w:rPr>
-        <w:t>, and address</w:t>
-      </w:r>
-      <w:r>
-        <w:rPr>
-          <w:color w:val="000000" w:themeColor="text1"/>
-          <w:lang w:val="en-US"/>
-        </w:rPr>
-        <w:t xml:space="preserve"> (varchar)</w:t>
+        <w:t>, created_on (Date)</w:t>
       </w:r>
       <w:r>
         <w:rPr>
@@ -4905,7 +4885,6 @@
           <w:lang w:val="en-US"/>
         </w:rPr>
       </w:pPr>
-      <w:proofErr w:type="spellStart"/>
       <w:r>
         <w:rPr>
           <w:color w:val="000000" w:themeColor="text1"/>
@@ -4918,110 +4897,77 @@
           <w:color w:val="000000" w:themeColor="text1"/>
           <w:lang w:val="en-US"/>
         </w:rPr>
-        <w:t>ID</w:t>
-      </w:r>
-      <w:proofErr w:type="spellEnd"/>
+        <w:t>ID (int, primary key)</w:t>
+      </w:r>
       <w:r>
         <w:rPr>
           <w:color w:val="000000" w:themeColor="text1"/>
           <w:lang w:val="en-US"/>
         </w:rPr>
-        <w:t xml:space="preserve"> (int, primary key)</w:t>
+        <w:t>, dish</w:t>
       </w:r>
       <w:r>
         <w:rPr>
           <w:color w:val="000000" w:themeColor="text1"/>
           <w:lang w:val="en-US"/>
         </w:rPr>
-        <w:t xml:space="preserve">, </w:t>
-      </w:r>
-      <w:proofErr w:type="spellStart"/>
+        <w:t>N</w:t>
+      </w:r>
       <w:r>
         <w:rPr>
           <w:color w:val="000000" w:themeColor="text1"/>
           <w:lang w:val="en-US"/>
         </w:rPr>
-        <w:t>dish</w:t>
+        <w:t>ame</w:t>
       </w:r>
       <w:r>
         <w:rPr>
           <w:color w:val="000000" w:themeColor="text1"/>
           <w:lang w:val="en-US"/>
         </w:rPr>
-        <w:t>N</w:t>
+        <w:t xml:space="preserve"> (varchar)</w:t>
       </w:r>
       <w:r>
         <w:rPr>
           <w:color w:val="000000" w:themeColor="text1"/>
           <w:lang w:val="en-US"/>
         </w:rPr>
-        <w:t>ame</w:t>
-      </w:r>
-      <w:proofErr w:type="spellEnd"/>
+        <w:t>, description</w:t>
+      </w:r>
       <w:r>
         <w:rPr>
           <w:color w:val="000000" w:themeColor="text1"/>
           <w:lang w:val="en-US"/>
         </w:rPr>
-        <w:t xml:space="preserve"> (varchar)</w:t>
+        <w:t xml:space="preserve"> (text)</w:t>
       </w:r>
       <w:r>
         <w:rPr>
           <w:color w:val="000000" w:themeColor="text1"/>
           <w:lang w:val="en-US"/>
         </w:rPr>
-        <w:t>, description</w:t>
+        <w:t>, price</w:t>
       </w:r>
       <w:r>
         <w:rPr>
           <w:color w:val="000000" w:themeColor="text1"/>
           <w:lang w:val="en-US"/>
         </w:rPr>
-        <w:t xml:space="preserve"> (text)</w:t>
+        <w:t xml:space="preserve"> (float)</w:t>
       </w:r>
       <w:r>
         <w:rPr>
           <w:color w:val="000000" w:themeColor="text1"/>
           <w:lang w:val="en-US"/>
         </w:rPr>
-        <w:t>, price</w:t>
+        <w:t xml:space="preserve"> and category</w:t>
       </w:r>
       <w:r>
         <w:rPr>
           <w:color w:val="000000" w:themeColor="text1"/>
           <w:lang w:val="en-US"/>
         </w:rPr>
-        <w:t xml:space="preserve"> (float)</w:t>
-      </w:r>
-      <w:r>
-        <w:rPr>
-          <w:color w:val="000000" w:themeColor="text1"/>
-          <w:lang w:val="en-US"/>
-        </w:rPr>
-        <w:t xml:space="preserve"> and category</w:t>
-      </w:r>
-      <w:r>
-        <w:rPr>
-          <w:color w:val="000000" w:themeColor="text1"/>
-          <w:lang w:val="en-US"/>
-        </w:rPr>
-        <w:t xml:space="preserve"> (</w:t>
-      </w:r>
-      <w:proofErr w:type="spellStart"/>
-      <w:r>
-        <w:rPr>
-          <w:color w:val="000000" w:themeColor="text1"/>
-          <w:lang w:val="en-US"/>
-        </w:rPr>
-        <w:t>enum</w:t>
-      </w:r>
-      <w:proofErr w:type="spellEnd"/>
-      <w:r>
-        <w:rPr>
-          <w:color w:val="000000" w:themeColor="text1"/>
-          <w:lang w:val="en-US"/>
-        </w:rPr>
-        <w:t>)</w:t>
+        <w:t xml:space="preserve"> (enum)</w:t>
       </w:r>
       <w:r>
         <w:rPr>
@@ -5086,7 +5032,6 @@
           <w:lang w:val="en-US"/>
         </w:rPr>
       </w:pPr>
-      <w:proofErr w:type="spellStart"/>
       <w:r>
         <w:rPr>
           <w:color w:val="000000" w:themeColor="text1"/>
@@ -5099,89 +5044,104 @@
           <w:color w:val="000000" w:themeColor="text1"/>
           <w:lang w:val="en-US"/>
         </w:rPr>
-        <w:t>ID</w:t>
-      </w:r>
-      <w:proofErr w:type="spellEnd"/>
+        <w:t>ID (int, primary key)</w:t>
+      </w:r>
       <w:r>
         <w:rPr>
           <w:color w:val="000000" w:themeColor="text1"/>
           <w:lang w:val="en-US"/>
         </w:rPr>
-        <w:t xml:space="preserve"> (int, primary key)</w:t>
+        <w:t>, user_</w:t>
       </w:r>
       <w:r>
         <w:rPr>
           <w:color w:val="000000" w:themeColor="text1"/>
           <w:lang w:val="en-US"/>
         </w:rPr>
-        <w:t xml:space="preserve">, </w:t>
-      </w:r>
-      <w:proofErr w:type="spellStart"/>
+        <w:t>ID (int, foreign key)</w:t>
+      </w:r>
       <w:r>
         <w:rPr>
           <w:color w:val="000000" w:themeColor="text1"/>
           <w:lang w:val="en-US"/>
         </w:rPr>
-        <w:t>user_</w:t>
+        <w:t>, order_date</w:t>
       </w:r>
       <w:r>
         <w:rPr>
           <w:color w:val="000000" w:themeColor="text1"/>
           <w:lang w:val="en-US"/>
         </w:rPr>
-        <w:t>ID</w:t>
-      </w:r>
-      <w:proofErr w:type="spellEnd"/>
+        <w:t xml:space="preserve"> (date)</w:t>
+      </w:r>
       <w:r>
         <w:rPr>
           <w:color w:val="000000" w:themeColor="text1"/>
           <w:lang w:val="en-US"/>
         </w:rPr>
-        <w:t xml:space="preserve"> (int, foreign key)</w:t>
+        <w:t>, delivery</w:t>
       </w:r>
       <w:r>
         <w:rPr>
           <w:color w:val="000000" w:themeColor="text1"/>
           <w:lang w:val="en-US"/>
         </w:rPr>
-        <w:t xml:space="preserve">, </w:t>
-      </w:r>
-      <w:proofErr w:type="spellStart"/>
+        <w:t>_</w:t>
+      </w:r>
       <w:r>
         <w:rPr>
           <w:color w:val="000000" w:themeColor="text1"/>
           <w:lang w:val="en-US"/>
         </w:rPr>
-        <w:t>order_date</w:t>
-      </w:r>
-      <w:proofErr w:type="spellEnd"/>
+        <w:t>option</w:t>
+      </w:r>
       <w:r>
         <w:rPr>
           <w:color w:val="000000" w:themeColor="text1"/>
           <w:lang w:val="en-US"/>
         </w:rPr>
-        <w:t xml:space="preserve"> (date)</w:t>
+        <w:t xml:space="preserve"> (enum)</w:t>
       </w:r>
       <w:r>
         <w:rPr>
           <w:color w:val="000000" w:themeColor="text1"/>
           <w:lang w:val="en-US"/>
         </w:rPr>
-        <w:t xml:space="preserve">, </w:t>
-      </w:r>
-      <w:proofErr w:type="spellStart"/>
+        <w:t>, delivery</w:t>
+      </w:r>
       <w:r>
         <w:rPr>
           <w:color w:val="000000" w:themeColor="text1"/>
           <w:lang w:val="en-US"/>
         </w:rPr>
-        <w:t>delivery</w:t>
+        <w:t>_</w:t>
       </w:r>
       <w:r>
         <w:rPr>
           <w:color w:val="000000" w:themeColor="text1"/>
           <w:lang w:val="en-US"/>
         </w:rPr>
+        <w:t>address</w:t>
+      </w:r>
+      <w:r>
+        <w:rPr>
+          <w:color w:val="000000" w:themeColor="text1"/>
+          <w:lang w:val="en-US"/>
+        </w:rPr>
+        <w:t xml:space="preserve"> (varchar)</w:t>
+      </w:r>
+      <w:r>
+        <w:rPr>
+          <w:color w:val="000000" w:themeColor="text1"/>
+          <w:lang w:val="en-US"/>
+        </w:rPr>
+        <w:t xml:space="preserve"> and order</w:t>
+      </w:r>
+      <w:r>
+        <w:rPr>
+          <w:color w:val="000000" w:themeColor="text1"/>
+          <w:lang w:val="en-US"/>
+        </w:rPr>
         <w:t>_</w:t>
       </w:r>
       <w:r>
@@ -5189,121 +5149,14 @@
           <w:color w:val="000000" w:themeColor="text1"/>
           <w:lang w:val="en-US"/>
         </w:rPr>
-        <w:t>option</w:t>
-      </w:r>
-      <w:proofErr w:type="spellEnd"/>
+        <w:t>status</w:t>
+      </w:r>
       <w:r>
         <w:rPr>
           <w:color w:val="000000" w:themeColor="text1"/>
           <w:lang w:val="en-US"/>
         </w:rPr>
-        <w:t xml:space="preserve"> (</w:t>
-      </w:r>
-      <w:proofErr w:type="spellStart"/>
-      <w:r>
-        <w:rPr>
-          <w:color w:val="000000" w:themeColor="text1"/>
-          <w:lang w:val="en-US"/>
-        </w:rPr>
-        <w:t>enum</w:t>
-      </w:r>
-      <w:proofErr w:type="spellEnd"/>
-      <w:r>
-        <w:rPr>
-          <w:color w:val="000000" w:themeColor="text1"/>
-          <w:lang w:val="en-US"/>
-        </w:rPr>
-        <w:t>)</w:t>
-      </w:r>
-      <w:r>
-        <w:rPr>
-          <w:color w:val="000000" w:themeColor="text1"/>
-          <w:lang w:val="en-US"/>
-        </w:rPr>
-        <w:t xml:space="preserve">, </w:t>
-      </w:r>
-      <w:proofErr w:type="spellStart"/>
-      <w:r>
-        <w:rPr>
-          <w:color w:val="000000" w:themeColor="text1"/>
-          <w:lang w:val="en-US"/>
-        </w:rPr>
-        <w:t>delivery</w:t>
-      </w:r>
-      <w:r>
-        <w:rPr>
-          <w:color w:val="000000" w:themeColor="text1"/>
-          <w:lang w:val="en-US"/>
-        </w:rPr>
-        <w:t>_</w:t>
-      </w:r>
-      <w:r>
-        <w:rPr>
-          <w:color w:val="000000" w:themeColor="text1"/>
-          <w:lang w:val="en-US"/>
-        </w:rPr>
-        <w:t>address</w:t>
-      </w:r>
-      <w:proofErr w:type="spellEnd"/>
-      <w:r>
-        <w:rPr>
-          <w:color w:val="000000" w:themeColor="text1"/>
-          <w:lang w:val="en-US"/>
-        </w:rPr>
-        <w:t xml:space="preserve"> (varchar)</w:t>
-      </w:r>
-      <w:r>
-        <w:rPr>
-          <w:color w:val="000000" w:themeColor="text1"/>
-          <w:lang w:val="en-US"/>
-        </w:rPr>
-        <w:t xml:space="preserve"> and </w:t>
-      </w:r>
-      <w:proofErr w:type="spellStart"/>
-      <w:r>
-        <w:rPr>
-          <w:color w:val="000000" w:themeColor="text1"/>
-          <w:lang w:val="en-US"/>
-        </w:rPr>
-        <w:t>order</w:t>
-      </w:r>
-      <w:r>
-        <w:rPr>
-          <w:color w:val="000000" w:themeColor="text1"/>
-          <w:lang w:val="en-US"/>
-        </w:rPr>
-        <w:t>_</w:t>
-      </w:r>
-      <w:r>
-        <w:rPr>
-          <w:color w:val="000000" w:themeColor="text1"/>
-          <w:lang w:val="en-US"/>
-        </w:rPr>
-        <w:t>status</w:t>
-      </w:r>
-      <w:proofErr w:type="spellEnd"/>
-      <w:r>
-        <w:rPr>
-          <w:color w:val="000000" w:themeColor="text1"/>
-          <w:lang w:val="en-US"/>
-        </w:rPr>
-        <w:t xml:space="preserve"> (</w:t>
-      </w:r>
-      <w:proofErr w:type="spellStart"/>
-      <w:r>
-        <w:rPr>
-          <w:color w:val="000000" w:themeColor="text1"/>
-          <w:lang w:val="en-US"/>
-        </w:rPr>
-        <w:t>enum</w:t>
-      </w:r>
-      <w:proofErr w:type="spellEnd"/>
-      <w:r>
-        <w:rPr>
-          <w:color w:val="000000" w:themeColor="text1"/>
-          <w:lang w:val="en-US"/>
-        </w:rPr>
-        <w:t>)</w:t>
+        <w:t xml:space="preserve"> (enum)</w:t>
       </w:r>
       <w:r>
         <w:rPr>
@@ -5368,92 +5221,26 @@
           <w:lang w:val="en-US"/>
         </w:rPr>
       </w:pPr>
-      <w:proofErr w:type="spellStart"/>
       <w:r>
         <w:rPr>
           <w:color w:val="000000" w:themeColor="text1"/>
           <w:lang w:val="en-US"/>
         </w:rPr>
-        <w:t>orderDetails_</w:t>
-      </w:r>
-      <w:proofErr w:type="gramStart"/>
+        <w:t xml:space="preserve">orderDetails_ID(int, primary key), dish_ID (int, foreign key), </w:t>
+      </w:r>
       <w:r>
         <w:rPr>
           <w:color w:val="000000" w:themeColor="text1"/>
           <w:lang w:val="en-US"/>
         </w:rPr>
-        <w:t>ID</w:t>
-      </w:r>
-      <w:proofErr w:type="spellEnd"/>
+        <w:t>o</w:t>
+      </w:r>
       <w:r>
         <w:rPr>
           <w:color w:val="000000" w:themeColor="text1"/>
           <w:lang w:val="en-US"/>
         </w:rPr>
-        <w:t>(</w:t>
-      </w:r>
-      <w:proofErr w:type="gramEnd"/>
-      <w:r>
-        <w:rPr>
-          <w:color w:val="000000" w:themeColor="text1"/>
-          <w:lang w:val="en-US"/>
-        </w:rPr>
-        <w:t xml:space="preserve">int, primary key), </w:t>
-      </w:r>
-      <w:proofErr w:type="spellStart"/>
-      <w:r>
-        <w:rPr>
-          <w:color w:val="000000" w:themeColor="text1"/>
-          <w:lang w:val="en-US"/>
-        </w:rPr>
-        <w:t>dish_ID</w:t>
-      </w:r>
-      <w:proofErr w:type="spellEnd"/>
-      <w:r>
-        <w:rPr>
-          <w:color w:val="000000" w:themeColor="text1"/>
-          <w:lang w:val="en-US"/>
-        </w:rPr>
-        <w:t xml:space="preserve"> (int, foreign key), </w:t>
-      </w:r>
-      <w:proofErr w:type="spellStart"/>
-      <w:r>
-        <w:rPr>
-          <w:color w:val="000000" w:themeColor="text1"/>
-          <w:lang w:val="en-US"/>
-        </w:rPr>
-        <w:t>o</w:t>
-      </w:r>
-      <w:r>
-        <w:rPr>
-          <w:color w:val="000000" w:themeColor="text1"/>
-          <w:lang w:val="en-US"/>
-        </w:rPr>
-        <w:t>rder_ID</w:t>
-      </w:r>
-      <w:proofErr w:type="spellEnd"/>
-      <w:r>
-        <w:rPr>
-          <w:color w:val="000000" w:themeColor="text1"/>
-          <w:lang w:val="en-US"/>
-        </w:rPr>
-        <w:t xml:space="preserve"> (int, foreign key), </w:t>
-      </w:r>
-      <w:proofErr w:type="spellStart"/>
-      <w:r>
-        <w:rPr>
-          <w:color w:val="000000" w:themeColor="text1"/>
-          <w:lang w:val="en-US"/>
-        </w:rPr>
-        <w:t>payment_one</w:t>
-      </w:r>
-      <w:proofErr w:type="spellEnd"/>
-      <w:r>
-        <w:rPr>
-          <w:color w:val="000000" w:themeColor="text1"/>
-          <w:lang w:val="en-US"/>
-        </w:rPr>
-        <w:t xml:space="preserve"> (float), quantity (int), and subtotal (float).</w:t>
+        <w:t>rder_ID (int, foreign key), payment_one (float), quantity (int), and subtotal (float).</w:t>
       </w:r>
     </w:p>
     <w:p>
@@ -5511,7 +5298,6 @@
           <w:lang w:val="en-US"/>
         </w:rPr>
       </w:pPr>
-      <w:proofErr w:type="spellStart"/>
       <w:r>
         <w:rPr>
           <w:color w:val="000000" w:themeColor="text1"/>
@@ -5519,7 +5305,6 @@
         </w:rPr>
         <w:t>payment_id</w:t>
       </w:r>
-      <w:proofErr w:type="spellEnd"/>
       <w:r>
         <w:rPr>
           <w:color w:val="000000" w:themeColor="text1"/>
@@ -5532,187 +5317,112 @@
           <w:color w:val="000000" w:themeColor="text1"/>
           <w:lang w:val="en-US"/>
         </w:rPr>
-        <w:t xml:space="preserve">, </w:t>
-      </w:r>
-      <w:proofErr w:type="spellStart"/>
+        <w:t>, user_</w:t>
+      </w:r>
       <w:r>
         <w:rPr>
           <w:color w:val="000000" w:themeColor="text1"/>
           <w:lang w:val="en-US"/>
         </w:rPr>
-        <w:t>user_</w:t>
+        <w:t>ID (int, foreign key)</w:t>
       </w:r>
       <w:r>
         <w:rPr>
           <w:color w:val="000000" w:themeColor="text1"/>
           <w:lang w:val="en-US"/>
         </w:rPr>
-        <w:t>ID</w:t>
-      </w:r>
-      <w:proofErr w:type="spellEnd"/>
+        <w:t>, order_</w:t>
+      </w:r>
       <w:r>
         <w:rPr>
           <w:color w:val="000000" w:themeColor="text1"/>
           <w:lang w:val="en-US"/>
         </w:rPr>
-        <w:t xml:space="preserve"> (int, foreign key)</w:t>
+        <w:t>ID (int, foreign key)</w:t>
       </w:r>
       <w:r>
         <w:rPr>
           <w:color w:val="000000" w:themeColor="text1"/>
           <w:lang w:val="en-US"/>
         </w:rPr>
-        <w:t xml:space="preserve">, </w:t>
-      </w:r>
-      <w:proofErr w:type="spellStart"/>
+        <w:t>, payment_amount</w:t>
+      </w:r>
       <w:r>
         <w:rPr>
           <w:color w:val="000000" w:themeColor="text1"/>
           <w:lang w:val="en-US"/>
         </w:rPr>
-        <w:t>order_</w:t>
+        <w:t xml:space="preserve"> (</w:t>
       </w:r>
       <w:r>
         <w:rPr>
           <w:color w:val="000000" w:themeColor="text1"/>
           <w:lang w:val="en-US"/>
         </w:rPr>
-        <w:t>ID</w:t>
-      </w:r>
-      <w:proofErr w:type="spellEnd"/>
+        <w:t>float</w:t>
+      </w:r>
       <w:r>
         <w:rPr>
           <w:color w:val="000000" w:themeColor="text1"/>
           <w:lang w:val="en-US"/>
         </w:rPr>
-        <w:t xml:space="preserve"> (int, foreign key)</w:t>
+        <w:t>)</w:t>
       </w:r>
       <w:r>
         <w:rPr>
           <w:color w:val="000000" w:themeColor="text1"/>
           <w:lang w:val="en-US"/>
         </w:rPr>
-        <w:t xml:space="preserve">, </w:t>
-      </w:r>
-      <w:proofErr w:type="spellStart"/>
+        <w:t>, payment_</w:t>
+      </w:r>
       <w:r>
         <w:rPr>
           <w:color w:val="000000" w:themeColor="text1"/>
           <w:lang w:val="en-US"/>
         </w:rPr>
-        <w:t>payment_amount</w:t>
-      </w:r>
-      <w:proofErr w:type="spellEnd"/>
+        <w:t>D</w:t>
+      </w:r>
       <w:r>
         <w:rPr>
           <w:color w:val="000000" w:themeColor="text1"/>
           <w:lang w:val="en-US"/>
         </w:rPr>
-        <w:t xml:space="preserve"> (</w:t>
+        <w:t>ate</w:t>
       </w:r>
       <w:r>
         <w:rPr>
           <w:color w:val="000000" w:themeColor="text1"/>
           <w:lang w:val="en-US"/>
         </w:rPr>
-        <w:t>float</w:t>
+        <w:t xml:space="preserve"> (timestamp)</w:t>
       </w:r>
       <w:r>
         <w:rPr>
           <w:color w:val="000000" w:themeColor="text1"/>
           <w:lang w:val="en-US"/>
         </w:rPr>
-        <w:t>)</w:t>
+        <w:t>, and payment_</w:t>
       </w:r>
       <w:r>
         <w:rPr>
           <w:color w:val="000000" w:themeColor="text1"/>
           <w:lang w:val="en-US"/>
         </w:rPr>
-        <w:t xml:space="preserve">, </w:t>
-      </w:r>
-      <w:proofErr w:type="spellStart"/>
+        <w:t>M</w:t>
+      </w:r>
       <w:r>
         <w:rPr>
           <w:color w:val="000000" w:themeColor="text1"/>
           <w:lang w:val="en-US"/>
         </w:rPr>
-        <w:t>payment_</w:t>
+        <w:t>ethod</w:t>
       </w:r>
       <w:r>
         <w:rPr>
           <w:color w:val="000000" w:themeColor="text1"/>
           <w:lang w:val="en-US"/>
         </w:rPr>
-        <w:t>D</w:t>
-      </w:r>
-      <w:r>
-        <w:rPr>
-          <w:color w:val="000000" w:themeColor="text1"/>
-          <w:lang w:val="en-US"/>
-        </w:rPr>
-        <w:t>ate</w:t>
-      </w:r>
-      <w:proofErr w:type="spellEnd"/>
-      <w:r>
-        <w:rPr>
-          <w:color w:val="000000" w:themeColor="text1"/>
-          <w:lang w:val="en-US"/>
-        </w:rPr>
-        <w:t xml:space="preserve"> (timestamp)</w:t>
-      </w:r>
-      <w:r>
-        <w:rPr>
-          <w:color w:val="000000" w:themeColor="text1"/>
-          <w:lang w:val="en-US"/>
-        </w:rPr>
-        <w:t xml:space="preserve">, and </w:t>
-      </w:r>
-      <w:proofErr w:type="spellStart"/>
-      <w:r>
-        <w:rPr>
-          <w:color w:val="000000" w:themeColor="text1"/>
-          <w:lang w:val="en-US"/>
-        </w:rPr>
-        <w:t>payment_</w:t>
-      </w:r>
-      <w:r>
-        <w:rPr>
-          <w:color w:val="000000" w:themeColor="text1"/>
-          <w:lang w:val="en-US"/>
-        </w:rPr>
-        <w:t>M</w:t>
-      </w:r>
-      <w:r>
-        <w:rPr>
-          <w:color w:val="000000" w:themeColor="text1"/>
-          <w:lang w:val="en-US"/>
-        </w:rPr>
-        <w:t>ethod</w:t>
-      </w:r>
-      <w:proofErr w:type="spellEnd"/>
-      <w:r>
-        <w:rPr>
-          <w:color w:val="000000" w:themeColor="text1"/>
-          <w:lang w:val="en-US"/>
-        </w:rPr>
-        <w:t xml:space="preserve"> (</w:t>
-      </w:r>
-      <w:proofErr w:type="spellStart"/>
-      <w:r>
-        <w:rPr>
-          <w:color w:val="000000" w:themeColor="text1"/>
-          <w:lang w:val="en-US"/>
-        </w:rPr>
-        <w:t>enum</w:t>
-      </w:r>
-      <w:proofErr w:type="spellEnd"/>
-      <w:r>
-        <w:rPr>
-          <w:color w:val="000000" w:themeColor="text1"/>
-          <w:lang w:val="en-US"/>
-        </w:rPr>
-        <w:t>)</w:t>
+        <w:t xml:space="preserve"> (enum)</w:t>
       </w:r>
     </w:p>
     <w:p>
@@ -5722,200 +5432,6 @@
           <w:color w:val="000000" w:themeColor="text1"/>
         </w:rPr>
       </w:pPr>
-    </w:p>
-    <w:p>
-      <w:pPr>
-        <w:spacing w:before="80" w:after="80"/>
-        <w:rPr>
-          <w:color w:val="000000" w:themeColor="text1"/>
-        </w:rPr>
-      </w:pPr>
-      <w:r>
-        <w:rPr>
-          <w:color w:val="000000" w:themeColor="text1"/>
-        </w:rPr>
-        <w:t>The preparation of the data was made on</w:t>
-      </w:r>
-      <w:r>
-        <w:rPr>
-          <w:b/>
-          <w:bCs/>
-          <w:color w:val="000000" w:themeColor="text1"/>
-        </w:rPr>
-        <w:t xml:space="preserve"> MySQL</w:t>
-      </w:r>
-      <w:r>
-        <w:rPr>
-          <w:color w:val="000000" w:themeColor="text1"/>
-        </w:rPr>
-        <w:t xml:space="preserve"> using the </w:t>
-      </w:r>
-      <w:r>
-        <w:rPr>
-          <w:b/>
-          <w:bCs/>
-          <w:color w:val="000000" w:themeColor="text1"/>
-        </w:rPr>
-        <w:t xml:space="preserve">INSERT </w:t>
-      </w:r>
-      <w:r>
-        <w:rPr>
-          <w:color w:val="000000" w:themeColor="text1"/>
-        </w:rPr>
-        <w:t xml:space="preserve">code to apply information about the attribute of each table using </w:t>
-      </w:r>
-      <w:r>
-        <w:rPr>
-          <w:b/>
-          <w:bCs/>
-          <w:color w:val="000000" w:themeColor="text1"/>
-        </w:rPr>
-        <w:t xml:space="preserve">COPILOT </w:t>
-      </w:r>
-      <w:r>
-        <w:rPr>
-          <w:color w:val="000000" w:themeColor="text1"/>
-        </w:rPr>
-        <w:t>to generate</w:t>
-      </w:r>
-      <w:r>
-        <w:rPr>
-          <w:color w:val="000000" w:themeColor="text1"/>
-        </w:rPr>
-        <w:t xml:space="preserve"> approximately</w:t>
-      </w:r>
-      <w:r>
-        <w:rPr>
-          <w:color w:val="000000" w:themeColor="text1"/>
-        </w:rPr>
-        <w:t xml:space="preserve"> 68 table</w:t>
-      </w:r>
-      <w:r>
-        <w:rPr>
-          <w:color w:val="000000" w:themeColor="text1"/>
-        </w:rPr>
-        <w:t xml:space="preserve"> rows </w:t>
-      </w:r>
-      <w:r>
-        <w:rPr>
-          <w:color w:val="000000" w:themeColor="text1"/>
-        </w:rPr>
-        <w:t xml:space="preserve">for each attribute. After applying the generated tables by copilot, </w:t>
-      </w:r>
-      <w:r>
-        <w:rPr>
-          <w:color w:val="000000" w:themeColor="text1"/>
-        </w:rPr>
-        <w:t xml:space="preserve">some </w:t>
-      </w:r>
-      <w:r>
-        <w:rPr>
-          <w:color w:val="000000" w:themeColor="text1"/>
-        </w:rPr>
-        <w:t xml:space="preserve">errors </w:t>
-      </w:r>
-      <w:r>
-        <w:rPr>
-          <w:color w:val="000000" w:themeColor="text1"/>
-        </w:rPr>
-        <w:t xml:space="preserve">were encountered </w:t>
-      </w:r>
-      <w:r>
-        <w:rPr>
-          <w:color w:val="000000" w:themeColor="text1"/>
-        </w:rPr>
-        <w:t xml:space="preserve">(duplicating the primary keys, data overflow, arithmetic overflow and unknown column error) </w:t>
-      </w:r>
-      <w:r>
-        <w:rPr>
-          <w:color w:val="000000" w:themeColor="text1"/>
-        </w:rPr>
-        <w:t>and were</w:t>
-      </w:r>
-      <w:r>
-        <w:rPr>
-          <w:color w:val="000000" w:themeColor="text1"/>
-        </w:rPr>
-        <w:t xml:space="preserve"> solved</w:t>
-      </w:r>
-      <w:r>
-        <w:rPr>
-          <w:color w:val="000000" w:themeColor="text1"/>
-        </w:rPr>
-        <w:t xml:space="preserve"> accordingly</w:t>
-      </w:r>
-      <w:r>
-        <w:rPr>
-          <w:color w:val="000000" w:themeColor="text1"/>
-        </w:rPr>
-        <w:t xml:space="preserve"> </w:t>
-      </w:r>
-      <w:r>
-        <w:rPr>
-          <w:color w:val="000000" w:themeColor="text1"/>
-        </w:rPr>
-        <w:t>(</w:t>
-      </w:r>
-      <w:r>
-        <w:rPr>
-          <w:color w:val="000000" w:themeColor="text1"/>
-        </w:rPr>
-        <w:t>by removing the duplicated primary keys, minimizing the data to the required varchar of the property, minimizing integer required and clearing the column that is not mentioned in the attribute</w:t>
-      </w:r>
-      <w:r>
-        <w:rPr>
-          <w:color w:val="000000" w:themeColor="text1"/>
-        </w:rPr>
-        <w:t>).</w:t>
-      </w:r>
-    </w:p>
-    <w:p>
-      <w:pPr>
-        <w:spacing w:before="80" w:after="80"/>
-        <w:rPr>
-          <w:color w:val="000000" w:themeColor="text1"/>
-        </w:rPr>
-      </w:pPr>
-    </w:p>
-    <w:p>
-      <w:pPr>
-        <w:spacing w:before="80" w:after="80"/>
-        <w:rPr>
-          <w:color w:val="000000" w:themeColor="text1"/>
-        </w:rPr>
-      </w:pPr>
-    </w:p>
-    <w:p>
-      <w:pPr>
-        <w:pStyle w:val="Heading1"/>
-        <w:rPr>
-          <w:color w:val="000000" w:themeColor="text1"/>
-        </w:rPr>
-      </w:pPr>
-      <w:bookmarkStart w:id="15" w:name="_Toc230531902"/>
-      <w:r>
-        <w:rPr>
-          <w:color w:val="000000" w:themeColor="text1"/>
-        </w:rPr>
-        <w:t>5. Results and Analysis</w:t>
-      </w:r>
-      <w:bookmarkEnd w:id="15"/>
-    </w:p>
-    <w:p>
-      <w:pPr>
-        <w:pStyle w:val="Heading2"/>
-        <w:rPr>
-          <w:color w:val="000000" w:themeColor="text1"/>
-        </w:rPr>
-      </w:pPr>
-      <w:bookmarkStart w:id="16" w:name="_Toc230531903"/>
-      <w:r>
-        <w:rPr>
-          <w:color w:val="000000" w:themeColor="text1"/>
-        </w:rPr>
-        <w:t>5.1 Queries</w:t>
-      </w:r>
-      <w:bookmarkEnd w:id="16"/>
     </w:p>
     <w:p>
       <w:pPr>
@@ -5932,7 +5448,662 @@
         <mc:AlternateContent>
           <mc:Choice Requires="wpg">
             <w:drawing>
-              <wp:anchor distT="0" distB="0" distL="114300" distR="114300" simplePos="0" relativeHeight="251668480" behindDoc="0" locked="0" layoutInCell="1" allowOverlap="1" wp14:anchorId="28E612FB" wp14:editId="5AD0683F">
+              <wp:anchor distT="0" distB="0" distL="114300" distR="114300" simplePos="0" relativeHeight="251678720" behindDoc="0" locked="0" layoutInCell="1" allowOverlap="1" wp14:anchorId="72C0AC2D" wp14:editId="270C8E29">
+                <wp:simplePos x="0" y="0"/>
+                <wp:positionH relativeFrom="column">
+                  <wp:posOffset>0</wp:posOffset>
+                </wp:positionH>
+                <wp:positionV relativeFrom="paragraph">
+                  <wp:posOffset>625817</wp:posOffset>
+                </wp:positionV>
+                <wp:extent cx="5731510" cy="2339975"/>
+                <wp:effectExtent l="0" t="0" r="2540" b="3175"/>
+                <wp:wrapSquare wrapText="bothSides"/>
+                <wp:docPr id="1094018035" name="Group 7"/>
+                <wp:cNvGraphicFramePr/>
+                <a:graphic xmlns:a="http://schemas.openxmlformats.org/drawingml/2006/main">
+                  <a:graphicData uri="http://schemas.microsoft.com/office/word/2010/wordprocessingGroup">
+                    <wpg:wgp>
+                      <wpg:cNvGrpSpPr/>
+                      <wpg:grpSpPr>
+                        <a:xfrm>
+                          <a:off x="0" y="0"/>
+                          <a:ext cx="5731510" cy="2339975"/>
+                          <a:chOff x="0" y="0"/>
+                          <a:chExt cx="5731510" cy="2339975"/>
+                        </a:xfrm>
+                      </wpg:grpSpPr>
+                      <pic:pic xmlns:pic="http://schemas.openxmlformats.org/drawingml/2006/picture">
+                        <pic:nvPicPr>
+                          <pic:cNvPr id="932591681" name="Picture 1"/>
+                          <pic:cNvPicPr>
+                            <a:picLocks noChangeAspect="1"/>
+                          </pic:cNvPicPr>
+                        </pic:nvPicPr>
+                        <pic:blipFill>
+                          <a:blip r:embed="rId13">
+                            <a:extLst>
+                              <a:ext uri="{28A0092B-C50C-407E-A947-70E740481C1C}">
+                                <a14:useLocalDpi xmlns:a14="http://schemas.microsoft.com/office/drawing/2010/main" val="0"/>
+                              </a:ext>
+                            </a:extLst>
+                          </a:blip>
+                          <a:stretch>
+                            <a:fillRect/>
+                          </a:stretch>
+                        </pic:blipFill>
+                        <pic:spPr>
+                          <a:xfrm>
+                            <a:off x="0" y="0"/>
+                            <a:ext cx="5731510" cy="2025650"/>
+                          </a:xfrm>
+                          <a:prstGeom prst="rect">
+                            <a:avLst/>
+                          </a:prstGeom>
+                        </pic:spPr>
+                      </pic:pic>
+                      <wps:wsp>
+                        <wps:cNvPr id="348867582" name="Text Box 1"/>
+                        <wps:cNvSpPr txBox="1"/>
+                        <wps:spPr>
+                          <a:xfrm>
+                            <a:off x="0" y="2081530"/>
+                            <a:ext cx="5731510" cy="258445"/>
+                          </a:xfrm>
+                          <a:prstGeom prst="rect">
+                            <a:avLst/>
+                          </a:prstGeom>
+                          <a:solidFill>
+                            <a:prstClr val="white"/>
+                          </a:solidFill>
+                          <a:ln>
+                            <a:noFill/>
+                          </a:ln>
+                        </wps:spPr>
+                        <wps:txbx>
+                          <w:txbxContent>
+                            <w:p>
+                              <w:pPr>
+                                <w:pStyle w:val="Caption"/>
+                                <w:jc w:val="center"/>
+                                <w:rPr>
+                                  <w:noProof/>
+                                  <w:color w:val="000000" w:themeColor="text1"/>
+                                </w:rPr>
+                              </w:pPr>
+                              <w:bookmarkStart w:id="15" w:name="_Toc233102031"/>
+                              <w:r>
+                                <w:t xml:space="preserve">Figure </w:t>
+                              </w:r>
+                              <w:fldSimple w:instr=" SEQ Figure \* ARABIC ">
+                                <w:r>
+                                  <w:rPr>
+                                    <w:noProof/>
+                                  </w:rPr>
+                                  <w:t>1</w:t>
+                                </w:r>
+                              </w:fldSimple>
+                              <w:r>
+                                <w:t>: Insertion of the data</w:t>
+                              </w:r>
+                              <w:bookmarkEnd w:id="15"/>
+                            </w:p>
+                          </w:txbxContent>
+                        </wps:txbx>
+                        <wps:bodyPr rot="0" spcFirstLastPara="0" vertOverflow="overflow" horzOverflow="overflow" vert="horz" wrap="square" lIns="0" tIns="0" rIns="0" bIns="0" numCol="1" spcCol="0" rtlCol="0" fromWordArt="0" anchor="t" anchorCtr="0" forceAA="0" compatLnSpc="1">
+                          <a:prstTxWarp prst="textNoShape">
+                            <a:avLst/>
+                          </a:prstTxWarp>
+                          <a:spAutoFit/>
+                        </wps:bodyPr>
+                      </wps:wsp>
+                    </wpg:wgp>
+                  </a:graphicData>
+                </a:graphic>
+              </wp:anchor>
+            </w:drawing>
+          </mc:Choice>
+          <mc:Fallback>
+            <w:pict>
+              <v:group w14:anchorId="72C0AC2D" id="Group 7" o:spid="_x0000_s1026" style="position:absolute;margin-left:0;margin-top:49.3pt;width:451.3pt;height:184.25pt;z-index:251678720" coordsize="57315,23399" o:gfxdata="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">
+                <v:shapetype id="_x0000_t75" coordsize="21600,21600" o:spt="75" o:preferrelative="t" path="m@4@5l@4@11@9@11@9@5xe" filled="f" stroked="f">
+                  <v:stroke joinstyle="miter"/>
+                  <v:formulas>
+                    <v:f eqn="if lineDrawn pixelLineWidth 0"/>
+                    <v:f eqn="sum @0 1 0"/>
+                    <v:f eqn="sum 0 0 @1"/>
+                    <v:f eqn="prod @2 1 2"/>
+                    <v:f eqn="prod @3 21600 pixelWidth"/>
+                    <v:f eqn="prod @3 21600 pixelHeight"/>
+                    <v:f eqn="sum @0 0 1"/>
+                    <v:f eqn="prod @6 1 2"/>
+                    <v:f eqn="prod @7 21600 pixelWidth"/>
+                    <v:f eqn="sum @8 21600 0"/>
+                    <v:f eqn="prod @7 21600 pixelHeight"/>
+                    <v:f eqn="sum @10 21600 0"/>
+                  </v:formulas>
+                  <v:path o:extrusionok="f" gradientshapeok="t" o:connecttype="rect"/>
+                  <o:lock v:ext="edit" aspectratio="t"/>
+                </v:shapetype>
+                <v:shape id="Picture 1" o:spid="_x0000_s1027" type="#_x0000_t75" style="position:absolute;width:57315;height:20256;visibility:visible;mso-wrap-style:square" o:gfxdata="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">
+                  <v:imagedata r:id="rId14" o:title=""/>
+                </v:shape>
+                <v:shapetype id="_x0000_t202" coordsize="21600,21600" o:spt="202" path="m,l,21600r21600,l21600,xe">
+                  <v:stroke joinstyle="miter"/>
+                  <v:path gradientshapeok="t" o:connecttype="rect"/>
+                </v:shapetype>
+                <v:shape id="Text Box 1" o:spid="_x0000_s1028" type="#_x0000_t202" style="position:absolute;top:20815;width:57315;height:2584;visibility:visible;mso-wrap-style:square;v-text-anchor:top" o:gfxdata="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" stroked="f">
+                  <v:textbox style="mso-fit-shape-to-text:t" inset="0,0,0,0">
+                    <w:txbxContent>
+                      <w:p>
+                        <w:pPr>
+                          <w:pStyle w:val="Caption"/>
+                          <w:jc w:val="center"/>
+                          <w:rPr>
+                            <w:noProof/>
+                            <w:color w:val="000000" w:themeColor="text1"/>
+                          </w:rPr>
+                        </w:pPr>
+                        <w:bookmarkStart w:id="16" w:name="_Toc233102031"/>
+                        <w:r>
+                          <w:t xml:space="preserve">Figure </w:t>
+                        </w:r>
+                        <w:fldSimple w:instr=" SEQ Figure \* ARABIC ">
+                          <w:r>
+                            <w:rPr>
+                              <w:noProof/>
+                            </w:rPr>
+                            <w:t>1</w:t>
+                          </w:r>
+                        </w:fldSimple>
+                        <w:r>
+                          <w:t>: Insertion of the data</w:t>
+                        </w:r>
+                        <w:bookmarkEnd w:id="16"/>
+                      </w:p>
+                    </w:txbxContent>
+                  </v:textbox>
+                </v:shape>
+                <w10:wrap type="square"/>
+              </v:group>
+            </w:pict>
+          </mc:Fallback>
+        </mc:AlternateContent>
+      </w:r>
+      <w:r>
+        <w:rPr>
+          <w:color w:val="000000" w:themeColor="text1"/>
+        </w:rPr>
+        <w:t>The preparation of the data was made on</w:t>
+      </w:r>
+      <w:r>
+        <w:rPr>
+          <w:b/>
+          <w:bCs/>
+          <w:color w:val="000000" w:themeColor="text1"/>
+        </w:rPr>
+        <w:t xml:space="preserve"> MySQL</w:t>
+      </w:r>
+      <w:r>
+        <w:rPr>
+          <w:color w:val="000000" w:themeColor="text1"/>
+        </w:rPr>
+        <w:t xml:space="preserve"> using the </w:t>
+      </w:r>
+      <w:r>
+        <w:rPr>
+          <w:b/>
+          <w:bCs/>
+          <w:color w:val="000000" w:themeColor="text1"/>
+        </w:rPr>
+        <w:t xml:space="preserve">INSERT </w:t>
+      </w:r>
+      <w:r>
+        <w:rPr>
+          <w:color w:val="000000" w:themeColor="text1"/>
+        </w:rPr>
+        <w:t xml:space="preserve">code to apply information about the attribute of each table using </w:t>
+      </w:r>
+      <w:r>
+        <w:rPr>
+          <w:b/>
+          <w:bCs/>
+          <w:color w:val="000000" w:themeColor="text1"/>
+        </w:rPr>
+        <w:t xml:space="preserve">COPILOT </w:t>
+      </w:r>
+      <w:r>
+        <w:rPr>
+          <w:color w:val="000000" w:themeColor="text1"/>
+        </w:rPr>
+        <w:t>to generate</w:t>
+      </w:r>
+      <w:r>
+        <w:rPr>
+          <w:color w:val="000000" w:themeColor="text1"/>
+        </w:rPr>
+        <w:t xml:space="preserve"> approximately</w:t>
+      </w:r>
+      <w:r>
+        <w:rPr>
+          <w:color w:val="000000" w:themeColor="text1"/>
+        </w:rPr>
+        <w:t xml:space="preserve"> 68 table</w:t>
+      </w:r>
+      <w:r>
+        <w:rPr>
+          <w:color w:val="000000" w:themeColor="text1"/>
+        </w:rPr>
+        <w:t xml:space="preserve"> rows </w:t>
+      </w:r>
+      <w:r>
+        <w:rPr>
+          <w:color w:val="000000" w:themeColor="text1"/>
+        </w:rPr>
+        <w:t>for each attribute</w:t>
+      </w:r>
+      <w:r>
+        <w:rPr>
+          <w:color w:val="000000" w:themeColor="text1"/>
+        </w:rPr>
+        <w:t>.</w:t>
+      </w:r>
+    </w:p>
+    <w:p>
+      <w:pPr>
+        <w:spacing w:before="80" w:after="80"/>
+        <w:rPr>
+          <w:color w:val="000000" w:themeColor="text1"/>
+        </w:rPr>
+      </w:pPr>
+    </w:p>
+    <w:p>
+      <w:pPr>
+        <w:spacing w:before="80" w:after="80"/>
+        <w:rPr>
+          <w:color w:val="000000" w:themeColor="text1"/>
+        </w:rPr>
+      </w:pPr>
+      <w:r>
+        <w:rPr>
+          <w:color w:val="000000" w:themeColor="text1"/>
+        </w:rPr>
+        <w:t xml:space="preserve">After applying the generated tables by copilot, </w:t>
+      </w:r>
+      <w:r>
+        <w:rPr>
+          <w:color w:val="000000" w:themeColor="text1"/>
+        </w:rPr>
+        <w:t xml:space="preserve">some </w:t>
+      </w:r>
+      <w:r>
+        <w:rPr>
+          <w:color w:val="000000" w:themeColor="text1"/>
+        </w:rPr>
+        <w:t xml:space="preserve">errors </w:t>
+      </w:r>
+      <w:r>
+        <w:rPr>
+          <w:color w:val="000000" w:themeColor="text1"/>
+        </w:rPr>
+        <w:t xml:space="preserve">were encountered </w:t>
+      </w:r>
+      <w:r>
+        <w:rPr>
+          <w:color w:val="000000" w:themeColor="text1"/>
+        </w:rPr>
+        <w:t xml:space="preserve">(duplicating the primary keys, data overflow, arithmetic overflow and unknown column error) </w:t>
+      </w:r>
+      <w:r>
+        <w:rPr>
+          <w:color w:val="000000" w:themeColor="text1"/>
+        </w:rPr>
+        <w:t>and were</w:t>
+      </w:r>
+      <w:r>
+        <w:rPr>
+          <w:color w:val="000000" w:themeColor="text1"/>
+        </w:rPr>
+        <w:t xml:space="preserve"> solved</w:t>
+      </w:r>
+      <w:r>
+        <w:rPr>
+          <w:color w:val="000000" w:themeColor="text1"/>
+        </w:rPr>
+        <w:t xml:space="preserve"> accordingly</w:t>
+      </w:r>
+      <w:r>
+        <w:rPr>
+          <w:color w:val="000000" w:themeColor="text1"/>
+        </w:rPr>
+        <w:t xml:space="preserve"> </w:t>
+      </w:r>
+      <w:r>
+        <w:rPr>
+          <w:color w:val="000000" w:themeColor="text1"/>
+        </w:rPr>
+        <w:t>(</w:t>
+      </w:r>
+      <w:r>
+        <w:rPr>
+          <w:color w:val="000000" w:themeColor="text1"/>
+        </w:rPr>
+        <w:t>by removing the duplicated primary keys, minimizing the data to the required varchar of the property, minimizing integer required and clearing the column that is not mentioned in the attribute</w:t>
+      </w:r>
+      <w:r>
+        <w:rPr>
+          <w:color w:val="000000" w:themeColor="text1"/>
+        </w:rPr>
+        <w:t>).</w:t>
+      </w:r>
+    </w:p>
+    <w:p>
+      <w:pPr>
+        <w:spacing w:before="80" w:after="80"/>
+        <w:rPr>
+          <w:color w:val="000000" w:themeColor="text1"/>
+        </w:rPr>
+      </w:pPr>
+    </w:p>
+    <w:p>
+      <w:pPr>
+        <w:spacing w:before="80" w:after="80"/>
+        <w:rPr>
+          <w:color w:val="000000" w:themeColor="text1"/>
+        </w:rPr>
+      </w:pPr>
+    </w:p>
+    <w:p>
+      <w:pPr>
+        <w:keepNext/>
+        <w:spacing w:before="80" w:after="80"/>
+      </w:pPr>
+      <w:r>
+        <w:rPr>
+          <w:noProof/>
+          <w:color w:val="000000" w:themeColor="text1"/>
+        </w:rPr>
+        <w:lastRenderedPageBreak/>
+        <mc:AlternateContent>
+          <mc:Choice Requires="wpg">
+            <w:drawing>
+              <wp:anchor distT="0" distB="0" distL="114300" distR="114300" simplePos="0" relativeHeight="251681792" behindDoc="0" locked="0" layoutInCell="1" allowOverlap="1" wp14:anchorId="242A8C47" wp14:editId="7124C127">
+                <wp:simplePos x="0" y="0"/>
+                <wp:positionH relativeFrom="column">
+                  <wp:posOffset>0</wp:posOffset>
+                </wp:positionH>
+                <wp:positionV relativeFrom="paragraph">
+                  <wp:posOffset>0</wp:posOffset>
+                </wp:positionV>
+                <wp:extent cx="5731510" cy="3550285"/>
+                <wp:effectExtent l="0" t="0" r="2540" b="0"/>
+                <wp:wrapSquare wrapText="bothSides"/>
+                <wp:docPr id="772336767" name="Group 8"/>
+                <wp:cNvGraphicFramePr/>
+                <a:graphic xmlns:a="http://schemas.openxmlformats.org/drawingml/2006/main">
+                  <a:graphicData uri="http://schemas.microsoft.com/office/word/2010/wordprocessingGroup">
+                    <wpg:wgp>
+                      <wpg:cNvGrpSpPr/>
+                      <wpg:grpSpPr>
+                        <a:xfrm>
+                          <a:off x="0" y="0"/>
+                          <a:ext cx="5731510" cy="3550285"/>
+                          <a:chOff x="0" y="0"/>
+                          <a:chExt cx="5731510" cy="3550285"/>
+                        </a:xfrm>
+                      </wpg:grpSpPr>
+                      <pic:pic xmlns:pic="http://schemas.openxmlformats.org/drawingml/2006/picture">
+                        <pic:nvPicPr>
+                          <pic:cNvPr id="642757891" name="Picture 1"/>
+                          <pic:cNvPicPr>
+                            <a:picLocks noChangeAspect="1"/>
+                          </pic:cNvPicPr>
+                        </pic:nvPicPr>
+                        <pic:blipFill>
+                          <a:blip r:embed="rId15">
+                            <a:extLst>
+                              <a:ext uri="{28A0092B-C50C-407E-A947-70E740481C1C}">
+                                <a14:useLocalDpi xmlns:a14="http://schemas.microsoft.com/office/drawing/2010/main" val="0"/>
+                              </a:ext>
+                            </a:extLst>
+                          </a:blip>
+                          <a:stretch>
+                            <a:fillRect/>
+                          </a:stretch>
+                        </pic:blipFill>
+                        <pic:spPr>
+                          <a:xfrm>
+                            <a:off x="0" y="0"/>
+                            <a:ext cx="5731510" cy="3236595"/>
+                          </a:xfrm>
+                          <a:prstGeom prst="rect">
+                            <a:avLst/>
+                          </a:prstGeom>
+                        </pic:spPr>
+                      </pic:pic>
+                      <wps:wsp>
+                        <wps:cNvPr id="1135171373" name="Text Box 1"/>
+                        <wps:cNvSpPr txBox="1"/>
+                        <wps:spPr>
+                          <a:xfrm>
+                            <a:off x="0" y="3291840"/>
+                            <a:ext cx="5731510" cy="258445"/>
+                          </a:xfrm>
+                          <a:prstGeom prst="rect">
+                            <a:avLst/>
+                          </a:prstGeom>
+                          <a:solidFill>
+                            <a:prstClr val="white"/>
+                          </a:solidFill>
+                          <a:ln>
+                            <a:noFill/>
+                          </a:ln>
+                        </wps:spPr>
+                        <wps:txbx>
+                          <w:txbxContent>
+                            <w:p>
+                              <w:pPr>
+                                <w:pStyle w:val="Caption"/>
+                                <w:jc w:val="center"/>
+                                <w:rPr>
+                                  <w:noProof/>
+                                  <w:color w:val="000000" w:themeColor="text1"/>
+                                </w:rPr>
+                              </w:pPr>
+                              <w:bookmarkStart w:id="17" w:name="_Toc233102032"/>
+                              <w:r>
+                                <w:t xml:space="preserve">Figure </w:t>
+                              </w:r>
+                              <w:fldSimple w:instr=" SEQ Figure \* ARABIC ">
+                                <w:r>
+                                  <w:rPr>
+                                    <w:noProof/>
+                                  </w:rPr>
+                                  <w:t>2</w:t>
+                                </w:r>
+                              </w:fldSimple>
+                              <w:r>
+                                <w:t>: Duplicate keys error</w:t>
+                              </w:r>
+                              <w:bookmarkEnd w:id="17"/>
+                            </w:p>
+                          </w:txbxContent>
+                        </wps:txbx>
+                        <wps:bodyPr rot="0" spcFirstLastPara="0" vertOverflow="overflow" horzOverflow="overflow" vert="horz" wrap="square" lIns="0" tIns="0" rIns="0" bIns="0" numCol="1" spcCol="0" rtlCol="0" fromWordArt="0" anchor="t" anchorCtr="0" forceAA="0" compatLnSpc="1">
+                          <a:prstTxWarp prst="textNoShape">
+                            <a:avLst/>
+                          </a:prstTxWarp>
+                          <a:spAutoFit/>
+                        </wps:bodyPr>
+                      </wps:wsp>
+                    </wpg:wgp>
+                  </a:graphicData>
+                </a:graphic>
+              </wp:anchor>
+            </w:drawing>
+          </mc:Choice>
+          <mc:Fallback>
+            <w:pict>
+              <v:group w14:anchorId="242A8C47" id="Group 8" o:spid="_x0000_s1029" style="position:absolute;margin-left:0;margin-top:0;width:451.3pt;height:279.55pt;z-index:251681792" coordsize="57315,35502" o:gfxdata="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">
+                <v:shape id="Picture 1" o:spid="_x0000_s1030" type="#_x0000_t75" style="position:absolute;width:57315;height:32365;visibility:visible;mso-wrap-style:square" o:gfxdata="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">
+                  <v:imagedata r:id="rId16" o:title=""/>
+                </v:shape>
+                <v:shape id="Text Box 1" o:spid="_x0000_s1031" type="#_x0000_t202" style="position:absolute;top:32918;width:57315;height:2584;visibility:visible;mso-wrap-style:square;v-text-anchor:top" o:gfxdata="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" stroked="f">
+                  <v:textbox style="mso-fit-shape-to-text:t" inset="0,0,0,0">
+                    <w:txbxContent>
+                      <w:p>
+                        <w:pPr>
+                          <w:pStyle w:val="Caption"/>
+                          <w:jc w:val="center"/>
+                          <w:rPr>
+                            <w:noProof/>
+                            <w:color w:val="000000" w:themeColor="text1"/>
+                          </w:rPr>
+                        </w:pPr>
+                        <w:bookmarkStart w:id="18" w:name="_Toc233102032"/>
+                        <w:r>
+                          <w:t xml:space="preserve">Figure </w:t>
+                        </w:r>
+                        <w:fldSimple w:instr=" SEQ Figure \* ARABIC ">
+                          <w:r>
+                            <w:rPr>
+                              <w:noProof/>
+                            </w:rPr>
+                            <w:t>2</w:t>
+                          </w:r>
+                        </w:fldSimple>
+                        <w:r>
+                          <w:t>: Duplicate keys error</w:t>
+                        </w:r>
+                        <w:bookmarkEnd w:id="18"/>
+                      </w:p>
+                    </w:txbxContent>
+                  </v:textbox>
+                </v:shape>
+                <w10:wrap type="square"/>
+              </v:group>
+            </w:pict>
+          </mc:Fallback>
+        </mc:AlternateContent>
+      </w:r>
+      <w:r>
+        <w:rPr>
+          <w:noProof/>
+          <w:color w:val="000000" w:themeColor="text1"/>
+        </w:rPr>
+        <w:drawing>
+          <wp:inline distT="0" distB="0" distL="0" distR="0" wp14:anchorId="06924853" wp14:editId="20DF7435">
+            <wp:extent cx="5731510" cy="4516120"/>
+            <wp:effectExtent l="0" t="0" r="2540" b="0"/>
+            <wp:docPr id="130228381" name="Picture 1"/>
+            <wp:cNvGraphicFramePr>
+              <a:graphicFrameLocks xmlns:a="http://schemas.openxmlformats.org/drawingml/2006/main" noChangeAspect="1"/>
+            </wp:cNvGraphicFramePr>
+            <a:graphic xmlns:a="http://schemas.openxmlformats.org/drawingml/2006/main">
+              <a:graphicData uri="http://schemas.openxmlformats.org/drawingml/2006/picture">
+                <pic:pic xmlns:pic="http://schemas.openxmlformats.org/drawingml/2006/picture">
+                  <pic:nvPicPr>
+                    <pic:cNvPr id="130228381" name=""/>
+                    <pic:cNvPicPr/>
+                  </pic:nvPicPr>
+                  <pic:blipFill>
+                    <a:blip r:embed="rId17"/>
+                    <a:stretch>
+                      <a:fillRect/>
+                    </a:stretch>
+                  </pic:blipFill>
+                  <pic:spPr>
+                    <a:xfrm>
+                      <a:off x="0" y="0"/>
+                      <a:ext cx="5731510" cy="4516120"/>
+                    </a:xfrm>
+                    <a:prstGeom prst="rect">
+                      <a:avLst/>
+                    </a:prstGeom>
+                  </pic:spPr>
+                </pic:pic>
+              </a:graphicData>
+            </a:graphic>
+          </wp:inline>
+        </w:drawing>
+      </w:r>
+    </w:p>
+    <w:p>
+      <w:pPr>
+        <w:pStyle w:val="Caption"/>
+        <w:jc w:val="center"/>
+        <w:rPr>
+          <w:color w:val="000000" w:themeColor="text1"/>
+        </w:rPr>
+      </w:pPr>
+      <w:bookmarkStart w:id="19" w:name="_Toc233102033"/>
+      <w:r>
+        <w:t xml:space="preserve">Figure </w:t>
+      </w:r>
+      <w:fldSimple w:instr=" SEQ Figure \* ARABIC ">
+        <w:r>
+          <w:rPr>
+            <w:noProof/>
+          </w:rPr>
+          <w:t>3</w:t>
+        </w:r>
+      </w:fldSimple>
+      <w:r>
+        <w:t>: PK not being automatically indexed error</w:t>
+      </w:r>
+      <w:bookmarkEnd w:id="19"/>
+    </w:p>
+    <w:p>
+      <w:bookmarkStart w:id="20" w:name="_Toc230531902"/>
+    </w:p>
+    <w:p>
+      <w:pPr>
+        <w:pStyle w:val="Heading1"/>
+        <w:rPr>
+          <w:color w:val="000000" w:themeColor="text1"/>
+        </w:rPr>
+      </w:pPr>
+      <w:r>
+        <w:rPr>
+          <w:color w:val="000000" w:themeColor="text1"/>
+        </w:rPr>
+        <w:lastRenderedPageBreak/>
+        <w:t>5. Results and Analysis</w:t>
+      </w:r>
+      <w:bookmarkEnd w:id="20"/>
+    </w:p>
+    <w:p>
+      <w:pPr>
+        <w:pStyle w:val="Heading2"/>
+        <w:rPr>
+          <w:color w:val="000000" w:themeColor="text1"/>
+        </w:rPr>
+      </w:pPr>
+      <w:bookmarkStart w:id="21" w:name="_Toc230531903"/>
+      <w:r>
+        <w:rPr>
+          <w:color w:val="000000" w:themeColor="text1"/>
+        </w:rPr>
+        <w:t>5.1 Queries</w:t>
+      </w:r>
+      <w:bookmarkEnd w:id="21"/>
+    </w:p>
+    <w:p>
+      <w:pPr>
+        <w:spacing w:before="80" w:after="80"/>
+        <w:rPr>
+          <w:color w:val="000000" w:themeColor="text1"/>
+        </w:rPr>
+      </w:pPr>
+      <w:r>
+        <w:rPr>
+          <w:noProof/>
+          <w:color w:val="000000" w:themeColor="text1"/>
+        </w:rPr>
+        <mc:AlternateContent>
+          <mc:Choice Requires="wpg">
+            <w:drawing>
+              <wp:anchor distT="0" distB="0" distL="114300" distR="114300" simplePos="0" relativeHeight="251666432" behindDoc="0" locked="0" layoutInCell="1" allowOverlap="1" wp14:anchorId="28E612FB" wp14:editId="064A8728">
                 <wp:simplePos x="0" y="0"/>
                 <wp:positionH relativeFrom="column">
                   <wp:posOffset>0</wp:posOffset>
@@ -5965,7 +6136,7 @@
                           </pic:cNvPicPr>
                         </pic:nvPicPr>
                         <pic:blipFill>
-                          <a:blip r:embed="rId13">
+                          <a:blip r:embed="rId18">
                             <a:extLst>
                               <a:ext uri="{28A0092B-C50C-407E-A947-70E740481C1C}">
                                 <a14:useLocalDpi xmlns:a14="http://schemas.microsoft.com/office/drawing/2010/main" val="0"/>
@@ -6015,38 +6186,25 @@
                                   <w:color w:val="000000" w:themeColor="text1"/>
                                 </w:rPr>
                               </w:pPr>
-                              <w:bookmarkStart w:id="17" w:name="_Toc230530959"/>
+                              <w:bookmarkStart w:id="22" w:name="_Toc233102034"/>
                               <w:r>
                                 <w:t xml:space="preserve">Figure </w:t>
                               </w:r>
-                              <w:r>
-                                <w:fldChar w:fldCharType="begin"/>
-                              </w:r>
-                              <w:r>
-                                <w:instrText xml:space="preserve"> SEQ Figure \* ARABIC </w:instrText>
-                              </w:r>
-                              <w:r>
-                                <w:fldChar w:fldCharType="separate"/>
-                              </w:r>
-                              <w:r>
-                                <w:rPr>
-                                  <w:noProof/>
-                                </w:rPr>
-                                <w:t>1</w:t>
-                              </w:r>
-                              <w:r>
-                                <w:rPr>
-                                  <w:noProof/>
-                                </w:rPr>
-                                <w:fldChar w:fldCharType="end"/>
-                              </w:r>
+                              <w:fldSimple w:instr=" SEQ Figure \* ARABIC ">
+                                <w:r>
+                                  <w:rPr>
+                                    <w:noProof/>
+                                  </w:rPr>
+                                  <w:t>4</w:t>
+                                </w:r>
+                              </w:fldSimple>
                               <w:r>
                                 <w:t>:</w:t>
                               </w:r>
                               <w:r>
                                 <w:t xml:space="preserve"> “Most day ordered in” Query</w:t>
                               </w:r>
-                              <w:bookmarkEnd w:id="17"/>
+                              <w:bookmarkEnd w:id="22"/>
                             </w:p>
                           </w:txbxContent>
                         </wps:txbx>
@@ -6065,34 +6223,11 @@
           </mc:Choice>
           <mc:Fallback>
             <w:pict>
-              <v:group w14:anchorId="28E612FB" id="Group 5" o:spid="_x0000_s1026" style="position:absolute;margin-left:0;margin-top:31.3pt;width:451.3pt;height:136.05pt;z-index:251668480" coordsize="57315,17278" o:gfxdata="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">
-                <v:shapetype id="_x0000_t75" coordsize="21600,21600" o:spt="75" o:preferrelative="t" path="m@4@5l@4@11@9@11@9@5xe" filled="f" stroked="f">
-                  <v:stroke joinstyle="miter"/>
-                  <v:formulas>
-                    <v:f eqn="if lineDrawn pixelLineWidth 0"/>
-                    <v:f eqn="sum @0 1 0"/>
-                    <v:f eqn="sum 0 0 @1"/>
-                    <v:f eqn="prod @2 1 2"/>
-                    <v:f eqn="prod @3 21600 pixelWidth"/>
-                    <v:f eqn="prod @3 21600 pixelHeight"/>
-                    <v:f eqn="sum @0 0 1"/>
-                    <v:f eqn="prod @6 1 2"/>
-                    <v:f eqn="prod @7 21600 pixelWidth"/>
-                    <v:f eqn="sum @8 21600 0"/>
-                    <v:f eqn="prod @7 21600 pixelHeight"/>
-                    <v:f eqn="sum @10 21600 0"/>
-                  </v:formulas>
-                  <v:path o:extrusionok="f" gradientshapeok="t" o:connecttype="rect"/>
-                  <o:lock v:ext="edit" aspectratio="t"/>
-                </v:shapetype>
-                <v:shape id="Picture 1" o:spid="_x0000_s1027" type="#_x0000_t75" style="position:absolute;width:57315;height:14141;visibility:visible;mso-wrap-style:square" o:gfxdata="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">
-                  <v:imagedata r:id="rId14" o:title=""/>
+              <v:group w14:anchorId="28E612FB" id="Group 5" o:spid="_x0000_s1032" style="position:absolute;margin-left:0;margin-top:31.3pt;width:451.3pt;height:136.05pt;z-index:251666432" coordsize="57315,17278" o:gfxdata="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">
+                <v:shape id="Picture 1" o:spid="_x0000_s1033" type="#_x0000_t75" style="position:absolute;width:57315;height:14141;visibility:visible;mso-wrap-style:square" o:gfxdata="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">
+                  <v:imagedata r:id="rId19" o:title=""/>
                 </v:shape>
-                <v:shapetype id="_x0000_t202" coordsize="21600,21600" o:spt="202" path="m,l,21600r21600,l21600,xe">
-                  <v:stroke joinstyle="miter"/>
-                  <v:path gradientshapeok="t" o:connecttype="rect"/>
-                </v:shapetype>
-                <v:shape id="Text Box 1" o:spid="_x0000_s1028" type="#_x0000_t202" style="position:absolute;top:14693;width:57315;height:2585;visibility:visible;mso-wrap-style:square;v-text-anchor:top" o:gfxdata="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" stroked="f">
+                <v:shape id="Text Box 1" o:spid="_x0000_s1034" type="#_x0000_t202" style="position:absolute;top:14693;width:57315;height:2585;visibility:visible;mso-wrap-style:square;v-text-anchor:top" o:gfxdata="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" stroked="f">
                   <v:textbox style="mso-fit-shape-to-text:t" inset="0,0,0,0">
                     <w:txbxContent>
                       <w:p>
@@ -6104,38 +6239,25 @@
                             <w:color w:val="000000" w:themeColor="text1"/>
                           </w:rPr>
                         </w:pPr>
-                        <w:bookmarkStart w:id="18" w:name="_Toc230530959"/>
+                        <w:bookmarkStart w:id="23" w:name="_Toc233102034"/>
                         <w:r>
                           <w:t xml:space="preserve">Figure </w:t>
                         </w:r>
-                        <w:r>
-                          <w:fldChar w:fldCharType="begin"/>
-                        </w:r>
-                        <w:r>
-                          <w:instrText xml:space="preserve"> SEQ Figure \* ARABIC </w:instrText>
-                        </w:r>
-                        <w:r>
-                          <w:fldChar w:fldCharType="separate"/>
-                        </w:r>
-                        <w:r>
-                          <w:rPr>
-                            <w:noProof/>
-                          </w:rPr>
-                          <w:t>1</w:t>
-                        </w:r>
-                        <w:r>
-                          <w:rPr>
-                            <w:noProof/>
-                          </w:rPr>
-                          <w:fldChar w:fldCharType="end"/>
-                        </w:r>
+                        <w:fldSimple w:instr=" SEQ Figure \* ARABIC ">
+                          <w:r>
+                            <w:rPr>
+                              <w:noProof/>
+                            </w:rPr>
+                            <w:t>4</w:t>
+                          </w:r>
+                        </w:fldSimple>
                         <w:r>
                           <w:t>:</w:t>
                         </w:r>
                         <w:r>
                           <w:t xml:space="preserve"> “Most day ordered in” Query</w:t>
                         </w:r>
-                        <w:bookmarkEnd w:id="18"/>
+                        <w:bookmarkEnd w:id="23"/>
                       </w:p>
                     </w:txbxContent>
                   </v:textbox>
@@ -6167,11 +6289,10 @@
           <w:noProof/>
           <w:color w:val="000000" w:themeColor="text1"/>
         </w:rPr>
-        <w:lastRenderedPageBreak/>
         <mc:AlternateContent>
           <mc:Choice Requires="wpg">
             <w:drawing>
-              <wp:anchor distT="0" distB="0" distL="114300" distR="114300" simplePos="0" relativeHeight="251672576" behindDoc="0" locked="0" layoutInCell="1" allowOverlap="1" wp14:anchorId="23935D95" wp14:editId="083C2DEE">
+              <wp:anchor distT="0" distB="0" distL="114300" distR="114300" simplePos="0" relativeHeight="251670528" behindDoc="0" locked="0" layoutInCell="1" allowOverlap="1" wp14:anchorId="23935D95" wp14:editId="742FC219">
                 <wp:simplePos x="0" y="0"/>
                 <wp:positionH relativeFrom="column">
                   <wp:posOffset>0</wp:posOffset>
@@ -6204,7 +6325,7 @@
                           </pic:cNvPicPr>
                         </pic:nvPicPr>
                         <pic:blipFill>
-                          <a:blip r:embed="rId15">
+                          <a:blip r:embed="rId20">
                             <a:extLst>
                               <a:ext uri="{28A0092B-C50C-407E-A947-70E740481C1C}">
                                 <a14:useLocalDpi xmlns:a14="http://schemas.microsoft.com/office/drawing/2010/main" val="0"/>
@@ -6254,35 +6375,22 @@
                                   <w:color w:val="000000" w:themeColor="text1"/>
                                 </w:rPr>
                               </w:pPr>
-                              <w:bookmarkStart w:id="19" w:name="_Toc230530960"/>
+                              <w:bookmarkStart w:id="24" w:name="_Toc233102035"/>
                               <w:r>
                                 <w:t xml:space="preserve">Figure </w:t>
                               </w:r>
-                              <w:r>
-                                <w:fldChar w:fldCharType="begin"/>
-                              </w:r>
-                              <w:r>
-                                <w:instrText xml:space="preserve"> SEQ Figure \* ARABIC </w:instrText>
-                              </w:r>
-                              <w:r>
-                                <w:fldChar w:fldCharType="separate"/>
-                              </w:r>
-                              <w:r>
-                                <w:rPr>
-                                  <w:noProof/>
-                                </w:rPr>
-                                <w:t>2</w:t>
-                              </w:r>
-                              <w:r>
-                                <w:rPr>
-                                  <w:noProof/>
-                                </w:rPr>
-                                <w:fldChar w:fldCharType="end"/>
-                              </w:r>
+                              <w:fldSimple w:instr=" SEQ Figure \* ARABIC ">
+                                <w:r>
+                                  <w:rPr>
+                                    <w:noProof/>
+                                  </w:rPr>
+                                  <w:t>5</w:t>
+                                </w:r>
+                              </w:fldSimple>
                               <w:r>
                                 <w:t>: “Users who spent more than £10” Query</w:t>
                               </w:r>
-                              <w:bookmarkEnd w:id="19"/>
+                              <w:bookmarkEnd w:id="24"/>
                             </w:p>
                           </w:txbxContent>
                         </wps:txbx>
@@ -6301,11 +6409,11 @@
           </mc:Choice>
           <mc:Fallback>
             <w:pict>
-              <v:group w14:anchorId="23935D95" id="Group 6" o:spid="_x0000_s1029" style="position:absolute;margin-left:0;margin-top:153.7pt;width:438.8pt;height:150.65pt;z-index:251672576" coordsize="55727,19132" o:gfxdata="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">
-                <v:shape id="Picture 1" o:spid="_x0000_s1030" type="#_x0000_t75" style="position:absolute;width:55727;height:16002;visibility:visible;mso-wrap-style:square" o:gfxdata="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">
-                  <v:imagedata r:id="rId16" o:title=""/>
+              <v:group w14:anchorId="23935D95" id="Group 6" o:spid="_x0000_s1035" style="position:absolute;margin-left:0;margin-top:153.7pt;width:438.8pt;height:150.65pt;z-index:251670528" coordsize="55727,19132" o:gfxdata="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">
+                <v:shape id="Picture 1" o:spid="_x0000_s1036" type="#_x0000_t75" style="position:absolute;width:55727;height:16002;visibility:visible;mso-wrap-style:square" o:gfxdata="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">
+                  <v:imagedata r:id="rId21" o:title=""/>
                 </v:shape>
-                <v:shape id="Text Box 1" o:spid="_x0000_s1031" type="#_x0000_t202" style="position:absolute;top:16548;width:55727;height:2584;visibility:visible;mso-wrap-style:square;v-text-anchor:top" o:gfxdata="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" stroked="f">
+                <v:shape id="Text Box 1" o:spid="_x0000_s1037" type="#_x0000_t202" style="position:absolute;top:16548;width:55727;height:2584;visibility:visible;mso-wrap-style:square;v-text-anchor:top" o:gfxdata="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" stroked="f">
                   <v:textbox style="mso-fit-shape-to-text:t" inset="0,0,0,0">
                     <w:txbxContent>
                       <w:p>
@@ -6317,35 +6425,22 @@
                             <w:color w:val="000000" w:themeColor="text1"/>
                           </w:rPr>
                         </w:pPr>
-                        <w:bookmarkStart w:id="20" w:name="_Toc230530960"/>
+                        <w:bookmarkStart w:id="25" w:name="_Toc233102035"/>
                         <w:r>
                           <w:t xml:space="preserve">Figure </w:t>
                         </w:r>
-                        <w:r>
-                          <w:fldChar w:fldCharType="begin"/>
-                        </w:r>
-                        <w:r>
-                          <w:instrText xml:space="preserve"> SEQ Figure \* ARABIC </w:instrText>
-                        </w:r>
-                        <w:r>
-                          <w:fldChar w:fldCharType="separate"/>
-                        </w:r>
-                        <w:r>
-                          <w:rPr>
-                            <w:noProof/>
-                          </w:rPr>
-                          <w:t>2</w:t>
-                        </w:r>
-                        <w:r>
-                          <w:rPr>
-                            <w:noProof/>
-                          </w:rPr>
-                          <w:fldChar w:fldCharType="end"/>
-                        </w:r>
+                        <w:fldSimple w:instr=" SEQ Figure \* ARABIC ">
+                          <w:r>
+                            <w:rPr>
+                              <w:noProof/>
+                            </w:rPr>
+                            <w:t>5</w:t>
+                          </w:r>
+                        </w:fldSimple>
                         <w:r>
                           <w:t>: “Users who spent more than £10” Query</w:t>
                         </w:r>
-                        <w:bookmarkEnd w:id="20"/>
+                        <w:bookmarkEnd w:id="25"/>
                       </w:p>
                     </w:txbxContent>
                   </v:textbox>
@@ -6370,14 +6465,14 @@
           <w:color w:val="000000" w:themeColor="text1"/>
         </w:rPr>
       </w:pPr>
-      <w:bookmarkStart w:id="21" w:name="_Toc230531904"/>
+      <w:bookmarkStart w:id="26" w:name="_Toc230531904"/>
       <w:r>
         <w:rPr>
           <w:color w:val="000000" w:themeColor="text1"/>
         </w:rPr>
         <w:t>5.2 Queries Output</w:t>
       </w:r>
-      <w:bookmarkEnd w:id="21"/>
+      <w:bookmarkEnd w:id="26"/>
     </w:p>
     <w:p>
       <w:r>
@@ -6387,7 +6482,7 @@
         <mc:AlternateContent>
           <mc:Choice Requires="wpg">
             <w:drawing>
-              <wp:anchor distT="0" distB="0" distL="114300" distR="114300" simplePos="0" relativeHeight="251662336" behindDoc="0" locked="0" layoutInCell="1" allowOverlap="1" wp14:anchorId="10092028" wp14:editId="035C8126">
+              <wp:anchor distT="0" distB="0" distL="114300" distR="114300" simplePos="0" relativeHeight="251660288" behindDoc="0" locked="0" layoutInCell="1" allowOverlap="1" wp14:anchorId="10092028" wp14:editId="056AF98E">
                 <wp:simplePos x="0" y="0"/>
                 <wp:positionH relativeFrom="column">
                   <wp:posOffset>1446530</wp:posOffset>
@@ -6420,7 +6515,7 @@
                           </pic:cNvPicPr>
                         </pic:nvPicPr>
                         <pic:blipFill>
-                          <a:blip r:embed="rId17">
+                          <a:blip r:embed="rId22">
                             <a:extLst>
                               <a:ext uri="{28A0092B-C50C-407E-A947-70E740481C1C}">
                                 <a14:useLocalDpi xmlns:a14="http://schemas.microsoft.com/office/drawing/2010/main" val="0"/>
@@ -6475,38 +6570,25 @@
                                   <w:szCs w:val="28"/>
                                 </w:rPr>
                               </w:pPr>
-                              <w:bookmarkStart w:id="22" w:name="_Toc230530961"/>
+                              <w:bookmarkStart w:id="27" w:name="_Toc233102036"/>
                               <w:r>
                                 <w:t xml:space="preserve">Figure </w:t>
                               </w:r>
-                              <w:r>
-                                <w:fldChar w:fldCharType="begin"/>
-                              </w:r>
-                              <w:r>
-                                <w:instrText xml:space="preserve"> SEQ Figure \* ARABIC </w:instrText>
-                              </w:r>
-                              <w:r>
-                                <w:fldChar w:fldCharType="separate"/>
-                              </w:r>
-                              <w:r>
-                                <w:rPr>
-                                  <w:noProof/>
-                                </w:rPr>
-                                <w:t>3</w:t>
-                              </w:r>
-                              <w:r>
-                                <w:rPr>
-                                  <w:noProof/>
-                                </w:rPr>
-                                <w:fldChar w:fldCharType="end"/>
-                              </w:r>
+                              <w:fldSimple w:instr=" SEQ Figure \* ARABIC ">
+                                <w:r>
+                                  <w:rPr>
+                                    <w:noProof/>
+                                  </w:rPr>
+                                  <w:t>6</w:t>
+                                </w:r>
+                              </w:fldSimple>
                               <w:r>
                                 <w:t xml:space="preserve">: </w:t>
                               </w:r>
                               <w:r>
                                 <w:t>Result of “Users who spent more than £10” Query</w:t>
                               </w:r>
-                              <w:bookmarkEnd w:id="22"/>
+                              <w:bookmarkEnd w:id="27"/>
                             </w:p>
                           </w:txbxContent>
                         </wps:txbx>
@@ -6525,11 +6607,11 @@
           </mc:Choice>
           <mc:Fallback>
             <w:pict>
-              <v:group w14:anchorId="10092028" id="Group 3" o:spid="_x0000_s1032" style="position:absolute;margin-left:113.9pt;margin-top:.35pt;width:238.3pt;height:133.35pt;z-index:251662336" coordsize="30264,16935" o:gfxdata="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">
-                <v:shape id="Picture 1" o:spid="_x0000_s1033" type="#_x0000_t75" style="position:absolute;left:6713;width:16827;height:14103;visibility:visible;mso-wrap-style:square" o:gfxdata="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">
-                  <v:imagedata r:id="rId18" o:title="" cropbottom="44786f"/>
+              <v:group w14:anchorId="10092028" id="Group 3" o:spid="_x0000_s1038" style="position:absolute;margin-left:113.9pt;margin-top:.35pt;width:238.3pt;height:133.35pt;z-index:251660288" coordsize="30264,16935" o:gfxdata="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">
+                <v:shape id="Picture 1" o:spid="_x0000_s1039" type="#_x0000_t75" style="position:absolute;left:6713;width:16827;height:14103;visibility:visible;mso-wrap-style:square" o:gfxdata="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">
+                  <v:imagedata r:id="rId23" o:title="" cropbottom="44786f"/>
                 </v:shape>
-                <v:shape id="Text Box 1" o:spid="_x0000_s1034" type="#_x0000_t202" style="position:absolute;top:14351;width:30264;height:2584;visibility:visible;mso-wrap-style:square;v-text-anchor:top" o:gfxdata="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" filled="f" stroked="f">
+                <v:shape id="Text Box 1" o:spid="_x0000_s1040" type="#_x0000_t202" style="position:absolute;top:14351;width:30264;height:2584;visibility:visible;mso-wrap-style:square;v-text-anchor:top" o:gfxdata="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" filled="f" stroked="f">
                   <v:textbox style="mso-fit-shape-to-text:t" inset="0,0,0,0">
                     <w:txbxContent>
                       <w:p>
@@ -6544,38 +6626,25 @@
                             <w:szCs w:val="28"/>
                           </w:rPr>
                         </w:pPr>
-                        <w:bookmarkStart w:id="23" w:name="_Toc230530961"/>
+                        <w:bookmarkStart w:id="28" w:name="_Toc233102036"/>
                         <w:r>
                           <w:t xml:space="preserve">Figure </w:t>
                         </w:r>
-                        <w:r>
-                          <w:fldChar w:fldCharType="begin"/>
-                        </w:r>
-                        <w:r>
-                          <w:instrText xml:space="preserve"> SEQ Figure \* ARABIC </w:instrText>
-                        </w:r>
-                        <w:r>
-                          <w:fldChar w:fldCharType="separate"/>
-                        </w:r>
-                        <w:r>
-                          <w:rPr>
-                            <w:noProof/>
-                          </w:rPr>
-                          <w:t>3</w:t>
-                        </w:r>
-                        <w:r>
-                          <w:rPr>
-                            <w:noProof/>
-                          </w:rPr>
-                          <w:fldChar w:fldCharType="end"/>
-                        </w:r>
+                        <w:fldSimple w:instr=" SEQ Figure \* ARABIC ">
+                          <w:r>
+                            <w:rPr>
+                              <w:noProof/>
+                            </w:rPr>
+                            <w:t>6</w:t>
+                          </w:r>
+                        </w:fldSimple>
                         <w:r>
                           <w:t xml:space="preserve">: </w:t>
                         </w:r>
                         <w:r>
                           <w:t>Result of “Users who spent more than £10” Query</w:t>
                         </w:r>
-                        <w:bookmarkEnd w:id="23"/>
+                        <w:bookmarkEnd w:id="28"/>
                       </w:p>
                     </w:txbxContent>
                   </v:textbox>
@@ -6619,7 +6688,7 @@
         <mc:AlternateContent>
           <mc:Choice Requires="wpg">
             <w:drawing>
-              <wp:anchor distT="0" distB="0" distL="114300" distR="114300" simplePos="0" relativeHeight="251665408" behindDoc="0" locked="0" layoutInCell="1" allowOverlap="1" wp14:anchorId="568B52E2" wp14:editId="0ED34A27">
+              <wp:anchor distT="0" distB="0" distL="114300" distR="114300" simplePos="0" relativeHeight="251663360" behindDoc="0" locked="0" layoutInCell="1" allowOverlap="1" wp14:anchorId="568B52E2" wp14:editId="73F482CA">
                 <wp:simplePos x="0" y="0"/>
                 <wp:positionH relativeFrom="column">
                   <wp:posOffset>1359535</wp:posOffset>
@@ -6652,7 +6721,7 @@
                           </pic:cNvPicPr>
                         </pic:nvPicPr>
                         <pic:blipFill>
-                          <a:blip r:embed="rId19">
+                          <a:blip r:embed="rId24">
                             <a:extLst>
                               <a:ext uri="{28A0092B-C50C-407E-A947-70E740481C1C}">
                                 <a14:useLocalDpi xmlns:a14="http://schemas.microsoft.com/office/drawing/2010/main" val="0"/>
@@ -6697,38 +6766,25 @@
                               <w:pPr>
                                 <w:pStyle w:val="Caption"/>
                               </w:pPr>
-                              <w:bookmarkStart w:id="24" w:name="_Toc230530962"/>
+                              <w:bookmarkStart w:id="29" w:name="_Toc233102037"/>
                               <w:r>
                                 <w:t xml:space="preserve">Figure </w:t>
                               </w:r>
-                              <w:r>
-                                <w:fldChar w:fldCharType="begin"/>
-                              </w:r>
-                              <w:r>
-                                <w:instrText xml:space="preserve"> SEQ Figure \* ARABIC </w:instrText>
-                              </w:r>
-                              <w:r>
-                                <w:fldChar w:fldCharType="separate"/>
-                              </w:r>
-                              <w:r>
-                                <w:rPr>
-                                  <w:noProof/>
-                                </w:rPr>
-                                <w:t>4</w:t>
-                              </w:r>
-                              <w:r>
-                                <w:rPr>
-                                  <w:noProof/>
-                                </w:rPr>
-                                <w:fldChar w:fldCharType="end"/>
-                              </w:r>
+                              <w:fldSimple w:instr=" SEQ Figure \* ARABIC ">
+                                <w:r>
+                                  <w:rPr>
+                                    <w:noProof/>
+                                  </w:rPr>
+                                  <w:t>7</w:t>
+                                </w:r>
+                              </w:fldSimple>
                               <w:r>
                                 <w:t>:</w:t>
                               </w:r>
                               <w:r>
                                 <w:t xml:space="preserve"> Result of “Most day ordered in” Query</w:t>
                               </w:r>
-                              <w:bookmarkEnd w:id="24"/>
+                              <w:bookmarkEnd w:id="29"/>
                             </w:p>
                           </w:txbxContent>
                         </wps:txbx>
@@ -6747,49 +6803,36 @@
           </mc:Choice>
           <mc:Fallback>
             <w:pict>
-              <v:group w14:anchorId="568B52E2" id="Group 4" o:spid="_x0000_s1035" style="position:absolute;margin-left:107.05pt;margin-top:12.55pt;width:252.05pt;height:82.3pt;z-index:251665408" coordsize="32010,10452" o:gfxdata="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">
-                <v:shape id="Picture 1" o:spid="_x0000_s1036" type="#_x0000_t75" style="position:absolute;width:32010;height:7334;visibility:visible;mso-wrap-style:square" o:gfxdata="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">
-                  <v:imagedata r:id="rId20" o:title=""/>
+              <v:group w14:anchorId="568B52E2" id="Group 4" o:spid="_x0000_s1041" style="position:absolute;margin-left:107.05pt;margin-top:12.55pt;width:252.05pt;height:82.3pt;z-index:251663360" coordsize="32010,10452" o:gfxdata="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">
+                <v:shape id="Picture 1" o:spid="_x0000_s1042" type="#_x0000_t75" style="position:absolute;width:32010;height:7334;visibility:visible;mso-wrap-style:square" o:gfxdata="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">
+                  <v:imagedata r:id="rId25" o:title=""/>
                 </v:shape>
-                <v:shape id="Text Box 1" o:spid="_x0000_s1037" type="#_x0000_t202" style="position:absolute;left:3646;top:7867;width:24650;height:2585;visibility:visible;mso-wrap-style:square;v-text-anchor:top" o:gfxdata="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" stroked="f">
+                <v:shape id="Text Box 1" o:spid="_x0000_s1043" type="#_x0000_t202" style="position:absolute;left:3646;top:7867;width:24650;height:2585;visibility:visible;mso-wrap-style:square;v-text-anchor:top" o:gfxdata="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" stroked="f">
                   <v:textbox style="mso-fit-shape-to-text:t" inset="0,0,0,0">
                     <w:txbxContent>
                       <w:p>
                         <w:pPr>
                           <w:pStyle w:val="Caption"/>
                         </w:pPr>
-                        <w:bookmarkStart w:id="25" w:name="_Toc230530962"/>
+                        <w:bookmarkStart w:id="30" w:name="_Toc233102037"/>
                         <w:r>
                           <w:t xml:space="preserve">Figure </w:t>
                         </w:r>
-                        <w:r>
-                          <w:fldChar w:fldCharType="begin"/>
-                        </w:r>
-                        <w:r>
-                          <w:instrText xml:space="preserve"> SEQ Figure \* ARABIC </w:instrText>
-                        </w:r>
-                        <w:r>
-                          <w:fldChar w:fldCharType="separate"/>
-                        </w:r>
-                        <w:r>
-                          <w:rPr>
-                            <w:noProof/>
-                          </w:rPr>
-                          <w:t>4</w:t>
-                        </w:r>
-                        <w:r>
-                          <w:rPr>
-                            <w:noProof/>
-                          </w:rPr>
-                          <w:fldChar w:fldCharType="end"/>
-                        </w:r>
+                        <w:fldSimple w:instr=" SEQ Figure \* ARABIC ">
+                          <w:r>
+                            <w:rPr>
+                              <w:noProof/>
+                            </w:rPr>
+                            <w:t>7</w:t>
+                          </w:r>
+                        </w:fldSimple>
                         <w:r>
                           <w:t>:</w:t>
                         </w:r>
                         <w:r>
                           <w:t xml:space="preserve"> Result of “Most day ordered in” Query</w:t>
                         </w:r>
-                        <w:bookmarkEnd w:id="25"/>
+                        <w:bookmarkEnd w:id="30"/>
                       </w:p>
                     </w:txbxContent>
                   </v:textbox>
@@ -6809,7 +6852,14 @@
     <w:p/>
     <w:p>
       <w:r>
-        <w:t>A total of 6 saved queries were made and tested in this project. Other queries were also used when populating the tables or linking them to each other which were not saved as they only used once.</w:t>
+        <w:lastRenderedPageBreak/>
+        <w:t>A total of 6 saved queries were made and tested in this project. Other queries were also used when populating the tables or linking them to each other which were not saved as they</w:t>
+      </w:r>
+      <w:r>
+        <w:t xml:space="preserve"> were</w:t>
+      </w:r>
+      <w:r>
+        <w:t xml:space="preserve"> only used once.</w:t>
       </w:r>
     </w:p>
     <w:p>
@@ -6820,7 +6870,7 @@
         <mc:AlternateContent>
           <mc:Choice Requires="wpg">
             <w:drawing>
-              <wp:anchor distT="0" distB="0" distL="114300" distR="114300" simplePos="0" relativeHeight="251675648" behindDoc="0" locked="0" layoutInCell="1" allowOverlap="1" wp14:anchorId="7E07497A" wp14:editId="67167918">
+              <wp:anchor distT="0" distB="0" distL="114300" distR="114300" simplePos="0" relativeHeight="251673600" behindDoc="0" locked="0" layoutInCell="1" allowOverlap="1" wp14:anchorId="7E07497A" wp14:editId="67363E9A">
                 <wp:simplePos x="0" y="0"/>
                 <wp:positionH relativeFrom="column">
                   <wp:posOffset>1920875</wp:posOffset>
@@ -6853,7 +6903,7 @@
                           </pic:cNvPicPr>
                         </pic:nvPicPr>
                         <pic:blipFill>
-                          <a:blip r:embed="rId21">
+                          <a:blip r:embed="rId26">
                             <a:extLst>
                               <a:ext uri="{28A0092B-C50C-407E-A947-70E740481C1C}">
                                 <a14:useLocalDpi xmlns:a14="http://schemas.microsoft.com/office/drawing/2010/main" val="0"/>
@@ -6902,35 +6952,22 @@
                                   <w:color w:val="333333"/>
                                 </w:rPr>
                               </w:pPr>
-                              <w:bookmarkStart w:id="26" w:name="_Toc230530963"/>
+                              <w:bookmarkStart w:id="31" w:name="_Toc233102038"/>
                               <w:r>
                                 <w:t xml:space="preserve">Figure </w:t>
                               </w:r>
-                              <w:r>
-                                <w:fldChar w:fldCharType="begin"/>
-                              </w:r>
-                              <w:r>
-                                <w:instrText xml:space="preserve"> SEQ Figure \* ARABIC </w:instrText>
-                              </w:r>
-                              <w:r>
-                                <w:fldChar w:fldCharType="separate"/>
-                              </w:r>
-                              <w:r>
-                                <w:rPr>
-                                  <w:noProof/>
-                                </w:rPr>
-                                <w:t>5</w:t>
-                              </w:r>
-                              <w:r>
-                                <w:rPr>
-                                  <w:noProof/>
-                                </w:rPr>
-                                <w:fldChar w:fldCharType="end"/>
-                              </w:r>
+                              <w:fldSimple w:instr=" SEQ Figure \* ARABIC ">
+                                <w:r>
+                                  <w:rPr>
+                                    <w:noProof/>
+                                  </w:rPr>
+                                  <w:t>8</w:t>
+                                </w:r>
+                              </w:fldSimple>
                               <w:r>
                                 <w:t>: Saved queries</w:t>
                               </w:r>
-                              <w:bookmarkEnd w:id="26"/>
+                              <w:bookmarkEnd w:id="31"/>
                             </w:p>
                           </w:txbxContent>
                         </wps:txbx>
@@ -6949,11 +6986,11 @@
           </mc:Choice>
           <mc:Fallback>
             <w:pict>
-              <v:group w14:anchorId="7E07497A" id="Group 7" o:spid="_x0000_s1038" style="position:absolute;margin-left:151.25pt;margin-top:8.25pt;width:164pt;height:139.7pt;z-index:251675648" coordsize="20828,17741" o:gfxdata="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">
-                <v:shape id="Picture 1" o:spid="_x0000_s1039" type="#_x0000_t75" style="position:absolute;width:20828;height:14579;visibility:visible;mso-wrap-style:square" o:gfxdata="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">
-                  <v:imagedata r:id="rId22" o:title=""/>
+              <v:group w14:anchorId="7E07497A" id="_x0000_s1044" style="position:absolute;margin-left:151.25pt;margin-top:8.25pt;width:164pt;height:139.7pt;z-index:251673600" coordsize="20828,17741" o:gfxdata="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">
+                <v:shape id="Picture 1" o:spid="_x0000_s1045" type="#_x0000_t75" style="position:absolute;width:20828;height:14579;visibility:visible;mso-wrap-style:square" o:gfxdata="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">
+                  <v:imagedata r:id="rId27" o:title=""/>
                 </v:shape>
-                <v:shape id="Text Box 1" o:spid="_x0000_s1040" type="#_x0000_t202" style="position:absolute;top:15157;width:20828;height:2584;visibility:visible;mso-wrap-style:square;v-text-anchor:top" o:gfxdata="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" stroked="f">
+                <v:shape id="Text Box 1" o:spid="_x0000_s1046" type="#_x0000_t202" style="position:absolute;top:15157;width:20828;height:2584;visibility:visible;mso-wrap-style:square;v-text-anchor:top" o:gfxdata="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" stroked="f">
                   <v:textbox style="mso-fit-shape-to-text:t" inset="0,0,0,0">
                     <w:txbxContent>
                       <w:p>
@@ -6964,35 +7001,22 @@
                             <w:color w:val="333333"/>
                           </w:rPr>
                         </w:pPr>
-                        <w:bookmarkStart w:id="27" w:name="_Toc230530963"/>
+                        <w:bookmarkStart w:id="32" w:name="_Toc233102038"/>
                         <w:r>
                           <w:t xml:space="preserve">Figure </w:t>
                         </w:r>
-                        <w:r>
-                          <w:fldChar w:fldCharType="begin"/>
-                        </w:r>
-                        <w:r>
-                          <w:instrText xml:space="preserve"> SEQ Figure \* ARABIC </w:instrText>
-                        </w:r>
-                        <w:r>
-                          <w:fldChar w:fldCharType="separate"/>
-                        </w:r>
-                        <w:r>
-                          <w:rPr>
-                            <w:noProof/>
-                          </w:rPr>
-                          <w:t>5</w:t>
-                        </w:r>
-                        <w:r>
-                          <w:rPr>
-                            <w:noProof/>
-                          </w:rPr>
-                          <w:fldChar w:fldCharType="end"/>
-                        </w:r>
+                        <w:fldSimple w:instr=" SEQ Figure \* ARABIC ">
+                          <w:r>
+                            <w:rPr>
+                              <w:noProof/>
+                            </w:rPr>
+                            <w:t>8</w:t>
+                          </w:r>
+                        </w:fldSimple>
                         <w:r>
                           <w:t>: Saved queries</w:t>
                         </w:r>
-                        <w:bookmarkEnd w:id="27"/>
+                        <w:bookmarkEnd w:id="32"/>
                       </w:p>
                     </w:txbxContent>
                   </v:textbox>
@@ -7021,43 +7045,111 @@
           <w:color w:val="000000" w:themeColor="text1"/>
         </w:rPr>
       </w:pPr>
-      <w:bookmarkStart w:id="28" w:name="_Toc230531905"/>
+      <w:bookmarkStart w:id="33" w:name="_Toc230531905"/>
       <w:r>
         <w:rPr>
           <w:color w:val="000000" w:themeColor="text1"/>
         </w:rPr>
         <w:t>5.3 Model Results and Interpretation</w:t>
       </w:r>
-      <w:bookmarkEnd w:id="28"/>
-    </w:p>
-    <w:p>
-      <w:pPr>
+      <w:bookmarkEnd w:id="33"/>
+    </w:p>
+    <w:p>
+      <w:pPr>
+        <w:keepNext/>
         <w:spacing w:before="80" w:after="80"/>
-        <w:rPr>
-          <w:color w:val="000000" w:themeColor="text1"/>
-        </w:rPr>
-      </w:pPr>
-      <w:r>
-        <w:rPr>
-          <w:color w:val="000000" w:themeColor="text1"/>
-        </w:rPr>
-        <w:lastRenderedPageBreak/>
-        <w:t>#</w:t>
-      </w:r>
-      <w:r>
-        <w:rPr>
-          <w:color w:val="000000" w:themeColor="text1"/>
-        </w:rPr>
-        <w:t>A GRAPH TO BE ADDED USING INTERPOLATION</w:t>
-      </w:r>
-    <